<commit_message>
paper: expand discussion figures tables and references
</commit_message>
<xml_diff>
--- a/docs/PlantMR_submission_manuscript.docx
+++ b/docs/PlantMR_submission_manuscript.docx
@@ -120,7 +120,7 @@
         <w:spacing w:line="269" w:lineRule="auto" w:after="100"/>
       </w:pPr>
       <w:r>
-        <w:t>Mendelian randomization uses genetic associations as instrumental variables to estimate genetically proxied exposure effects on outcomes.[1,2] The relevance, exchangeability and exclusion-restriction assumptions provide the foundation for interpretation, but their implementation depends on the study population, phenotype, molecular exposure and data-generating design. Summary-statistics MR has enabled large-scale analyses using public genome-wide association studies (GWAS), yet summarized associations are also vulnerable to weak instruments, horizontal pleiotropy, LD and sample overlap.[3–9]</w:t>
+        <w:t>Mendelian randomization uses genetic associations as instrumental variables to estimate genetically proxied exposure effects on outcomes.[1,2] The relevance, exchangeability and exclusion-restriction assumptions provide the foundation for interpretation, but their implementation depends on the study population, phenotype, molecular exposure and data-generating design. Summary-statistics MR has enabled large-scale analyses using public genome-wide association studies (GWAS) and platforms such as MR-Base,[10] yet summarized associations are also vulnerable to weak instruments, horizontal pleiotropy, LD and sample overlap.[3–9]</w:t>
       </w:r>
     </w:p>
     <w:p>
@@ -128,7 +128,7 @@
         <w:spacing w:line="269" w:lineRule="auto" w:after="100"/>
       </w:pPr>
       <w:r>
-        <w:t>Plant applications add several complications. Natural accessions and breeding panels can exhibit strong geographic structure and kinship. LD decay can differ substantially between species, populations and genomic regions. Expression is strongly dependent on tissue, developmental stage and treatment. Multi-environment trials and stress experiments frequently measure the same genotypes under several conditions, creating correlated estimates rather than independent GWAS datasets. Polyploid dosage, presence/absence variation and structural variation introduce additional representations that cannot be silently converted to ordinary biallelic SNPs.</w:t>
+        <w:t>Plant applications add several complications. Natural accessions and breeding panels can exhibit strong geographic structure and kinship. LD decay can differ substantially between species, populations and genomic regions. Expression is strongly dependent on tissue, developmental stage and treatment. Multi-environment trials and stress experiments frequently measure the same genotypes under several conditions, creating correlated estimates rather than independent GWAS datasets. Polyploid dosage, presence/absence variation and structural variation introduce additional representations that cannot be silently converted to ordinary biallelic SNPs; recent Arabidopsis pan-genome work illustrates why local adaptation and non-reference sequence variation should remain explicit.[35]</w:t>
       </w:r>
     </w:p>
     <w:p>
@@ -136,7 +136,7 @@
         <w:spacing w:line="269" w:lineRule="auto" w:after="100"/>
       </w:pPr>
       <w:r>
-        <w:t>Existing plant-oriented software demonstrates the value of integrated workflows. MRBIGR provides a broad population-scale multi-omics and MR toolbox for maize.[17] The maize drought study that motivates the present work prioritized genes using dynamic eQTLs and a lead-eQTL MR workflow.[18] Outside plants, MR-GxE uses gene-by-covariate interactions to detect or correct pleiotropic bias under a constant-pleiotropy assumption,[14] whereas interaction-based MR work distinguishes MR-GxE from MR-GENIUS and emphasizes interaction strength and assumption sensitivity.[15] MR-EILLS targets an invariant causal effect across heterogeneous GWAS summary datasets and evaluates multiple MR and meta-analytic comparators.[16] These methods have different estimands and should not be conflated.</w:t>
+        <w:t>Existing plant-oriented software demonstrates the value of integrated workflows. MRBIGR provides a broad population-scale multi-omics and MR toolbox for maize.[17] The maize drought study that motivates the present work prioritized genes using dynamic eQTLs and a lead-eQTL MR workflow.[18] Plant G×E GWAS and meta-analysis methods also show that environmental contrasts, population structure and interaction terms must be modeled jointly rather than treated as labels.[25–27] Outside plants, MR-GxE uses gene-by-covariate interactions to detect or correct pleiotropic bias under a constant-pleiotropy assumption,[14] whereas interaction-based MR work distinguishes MR-GxE from MR-GENIUS and emphasizes interaction strength and assumption sensitivity.[15] MR-EILLS targets an invariant causal effect across heterogeneous GWAS summary datasets and evaluates multiple MR and meta-analytic comparators.[16] These methods have different estimands and should not be conflated.</w:t>
       </w:r>
     </w:p>
     <w:p>
@@ -160,6 +160,70 @@
         <w:pStyle w:val="Heading2"/>
       </w:pPr>
       <w:r>
+        <w:t>Study questions and workflow</w:t>
+      </w:r>
+    </w:p>
+    <w:p>
+      <w:pPr>
+        <w:spacing w:line="269" w:lineRule="auto" w:after="100"/>
+      </w:pPr>
+      <w:r>
+        <w:t>We evaluated four prespecified questions: (1) can the software enforce a plant-aware, auditable data contract; (2) does the covariance-aware environment-slope estimator recover known effects under correlated SNP and environment errors; (3) how much can inference deteriorate when LD and environment dependence are incorrectly treated as independent; and (4) can the same audit trail be executed on a real plant data contract without converting a demonstration into a causal-gene claim? The workflow in Figure 1 separates these questions into input provenance, harmonization, instrument selection, covariance specification, estimation and reporting.</w:t>
+      </w:r>
+    </w:p>
+    <w:p>
+      <w:r>
+        <w:drawing>
+          <wp:inline xmlns:a="http://schemas.openxmlformats.org/drawingml/2006/main" xmlns:pic="http://schemas.openxmlformats.org/drawingml/2006/picture">
+            <wp:extent cx="5989320" cy="1881246"/>
+            <wp:docPr id="1" name="Picture 1"/>
+            <wp:cNvGraphicFramePr>
+              <a:graphicFrameLocks noChangeAspect="1"/>
+            </wp:cNvGraphicFramePr>
+            <a:graphic>
+              <a:graphicData uri="http://schemas.openxmlformats.org/drawingml/2006/picture">
+                <pic:pic>
+                  <pic:nvPicPr>
+                    <pic:cNvPr id="0" name="plantmr_workflow.png"/>
+                    <pic:cNvPicPr/>
+                  </pic:nvPicPr>
+                  <pic:blipFill>
+                    <a:blip r:embed="rId11"/>
+                    <a:stretch>
+                      <a:fillRect/>
+                    </a:stretch>
+                  </pic:blipFill>
+                  <pic:spPr>
+                    <a:xfrm>
+                      <a:off x="0" y="0"/>
+                      <a:ext cx="5989320" cy="1881246"/>
+                    </a:xfrm>
+                    <a:prstGeom prst="rect"/>
+                  </pic:spPr>
+                </pic:pic>
+              </a:graphicData>
+            </a:graphic>
+          </wp:inline>
+        </w:drawing>
+      </w:r>
+    </w:p>
+    <w:p>
+      <w:pPr>
+        <w:jc w:val="center"/>
+      </w:pPr>
+      <w:r>
+        <w:rPr>
+          <w:i/>
+          <w:sz w:val="18"/>
+        </w:rPr>
+        <w:t>Figure 1. PlantMR reproducible workflow. Plant metadata and summary statistics are retained alongside allele harmonization, complete-grid quality control, covariance specification and machine-readable audit outputs.</w:t>
+      </w:r>
+    </w:p>
+    <w:p>
+      <w:pPr>
+        <w:pStyle w:val="Heading2"/>
+      </w:pPr>
+      <w:r>
         <w:t>PlantMR software contract and analysis workflow</w:t>
       </w:r>
     </w:p>
@@ -169,6 +233,14 @@
       </w:pPr>
       <w:r>
         <w:t>PlantMR accepts exposure and outcome tables containing SNP, effect allele, other allele, beta, standard error and P value. Optional fields include effect-allele frequency and sample size. Plant metadata records species, reference assembly, trait, tissue, developmental stage, environment, ploidy and LD-panel provenance. The software validates numeric values and alleles, harmonizes reversed and complemented alleles, identifies ambiguous palindromic variants, applies P-value/MAF/F-statistic filters and records every exclusion.</w:t>
+      </w:r>
+    </w:p>
+    <w:p>
+      <w:pPr>
+        <w:spacing w:line="269" w:lineRule="auto" w:after="40"/>
+      </w:pPr>
+      <w:r>
+        <w:t>Table 1. PlantMR components, boundaries and audit outputs.</w:t>
       </w:r>
     </w:p>
     <w:tbl>
@@ -671,6 +743,14 @@
       </w:pPr>
       <w:r>
         <w:t>The primary simulation benchmark used 20 instruments, four environments, environmental correlation 0.5, exposure SE 0.01, outcome SE 0.04 and 500 replicates per scenario. It included a null slope, a true slope of 0.25 and a common directional-pleiotropic component. The LD stress benchmark used the same dimensions with AR(1) signed LD correlation rho=0.6 and compared correct covariance specification with a diagonal independence approximation.</w:t>
+      </w:r>
+    </w:p>
+    <w:p>
+      <w:pPr>
+        <w:spacing w:line="269" w:lineRule="auto" w:after="40"/>
+      </w:pPr>
+      <w:r>
+        <w:t>Table 2. Primary simulation calibration and LD-stress summary. Dashed lines in Figures 2 and 3 mark nominal 0.05 rejection and 0.95 coverage targets where applicable.</w:t>
       </w:r>
     </w:p>
     <w:tbl>
@@ -1609,7 +1689,7 @@
         <w:drawing>
           <wp:inline xmlns:a="http://schemas.openxmlformats.org/drawingml/2006/main" xmlns:pic="http://schemas.openxmlformats.org/drawingml/2006/picture">
             <wp:extent cx="5806440" cy="2619979"/>
-            <wp:docPr id="1" name="Picture 1"/>
+            <wp:docPr id="2" name="Picture 2"/>
             <wp:cNvGraphicFramePr>
               <a:graphicFrameLocks noChangeAspect="1"/>
             </wp:cNvGraphicFramePr>
@@ -1621,7 +1701,7 @@
                     <pic:cNvPicPr/>
                   </pic:nvPicPr>
                   <pic:blipFill>
-                    <a:blip r:embed="rId11"/>
+                    <a:blip r:embed="rId12"/>
                     <a:stretch>
                       <a:fillRect/>
                     </a:stretch>
@@ -1649,7 +1729,55 @@
           <w:i/>
           <w:sz w:val="18"/>
         </w:rPr>
-        <w:t>Figure 1. Sampling distributions, rejection rates and confidence-interval coverage for the primary simulation benchmark. The separate LD stress benchmark is reported in Table 2 and the source-data directory.</w:t>
+        <w:t>Figure 2. Primary simulation benchmark. The panels summarize slope estimation, rejection behavior and 95% confidence-interval coverage across null, causal environment-slope and directional-pleiotropy scenarios.</w:t>
+      </w:r>
+    </w:p>
+    <w:p>
+      <w:r>
+        <w:drawing>
+          <wp:inline xmlns:a="http://schemas.openxmlformats.org/drawingml/2006/main" xmlns:pic="http://schemas.openxmlformats.org/drawingml/2006/picture">
+            <wp:extent cx="5715000" cy="4343400"/>
+            <wp:docPr id="3" name="Picture 3"/>
+            <wp:cNvGraphicFramePr>
+              <a:graphicFrameLocks noChangeAspect="1"/>
+            </wp:cNvGraphicFramePr>
+            <a:graphic>
+              <a:graphicData uri="http://schemas.openxmlformats.org/drawingml/2006/picture">
+                <pic:pic>
+                  <pic:nvPicPr>
+                    <pic:cNvPr id="0" name="gxe_ld_stress.png"/>
+                    <pic:cNvPicPr/>
+                  </pic:nvPicPr>
+                  <pic:blipFill>
+                    <a:blip r:embed="rId13"/>
+                    <a:stretch>
+                      <a:fillRect/>
+                    </a:stretch>
+                  </pic:blipFill>
+                  <pic:spPr>
+                    <a:xfrm>
+                      <a:off x="0" y="0"/>
+                      <a:ext cx="5715000" cy="4343400"/>
+                    </a:xfrm>
+                    <a:prstGeom prst="rect"/>
+                  </pic:spPr>
+                </pic:pic>
+              </a:graphicData>
+            </a:graphic>
+          </wp:inline>
+        </w:drawing>
+      </w:r>
+    </w:p>
+    <w:p>
+      <w:pPr>
+        <w:jc w:val="center"/>
+      </w:pPr>
+      <w:r>
+        <w:rPr>
+          <w:i/>
+          <w:sz w:val="18"/>
+        </w:rPr>
+        <w:t>Figure 3. LD stress benchmark. Treating correlated SNP and environment errors as independent preserved approximate point estimates but produced smaller standard errors, inflated null rejection from 0.044 to 0.126 and reduced coverage from 0.956 to 0.874.</w:t>
       </w:r>
     </w:p>
     <w:p>
@@ -1665,7 +1793,15 @@
         <w:spacing w:line="269" w:lineRule="auto" w:after="100"/>
       </w:pPr>
       <w:r>
-        <w:t>The Arabidopsis case was designed as a reproducibility and diagnostics demonstration rather than a new causal discovery. Baseline leaf expression of AT1G11560 was extracted from the GSE80744 normalized expression matrix, local genotypes were taken from the 1001 Genomes v3.1 matrix and flowering time at 10°C and 16°C was taken from AraPheno. The local association model used ordinary least squares with five whole-genome PCs; it was not presented as a reimplementation of the published mixed-model/SMR analysis.[19–23]</w:t>
+        <w:t>The Arabidopsis case was designed as a reproducibility and diagnostics demonstration rather than a new causal discovery. Baseline leaf expression of AT1G11560 was extracted from the GSE80744 normalized expression matrix, local genotypes were taken from the 1001 Genomes v3.1 matrix and flowering time at 10°C and 16°C was taken from AraPheno. The local association model used ordinary least squares with five whole-genome PCs, following the general principle that population structure and kinship must be modeled in plant association analyses,[29–34] but it was not presented as a reimplementation of the published mixed-model/SMR analysis.[19–24]</w:t>
+      </w:r>
+    </w:p>
+    <w:p>
+      <w:pPr>
+        <w:spacing w:line="269" w:lineRule="auto" w:after="40"/>
+      </w:pPr>
+      <w:r>
+        <w:t>Table 3. Arabidopsis data-contract inputs and local processing.</w:t>
       </w:r>
     </w:p>
     <w:tbl>
@@ -2062,6 +2198,1339 @@
     </w:p>
     <w:p>
       <w:pPr>
+        <w:spacing w:line="269" w:lineRule="auto" w:after="40"/>
+      </w:pPr>
+      <w:r>
+        <w:t>Table 4. Instrument audit for the Arabidopsis case. Exclusion counts are overlapping diagnostics and must not be added as if they were mutually exclusive.</w:t>
+      </w:r>
+    </w:p>
+    <w:tbl>
+      <w:tblPr>
+        <w:tblStyle w:val="TableGrid"/>
+        <w:tblW w:type="auto" w:w="0"/>
+        <w:jc w:val="center"/>
+        <w:tblLook w:firstColumn="1" w:firstRow="1" w:lastColumn="0" w:lastRow="0" w:noHBand="0" w:noVBand="1" w:val="04A0"/>
+      </w:tblPr>
+      <w:tblGrid>
+        <w:gridCol w:w="3324"/>
+        <w:gridCol w:w="3324"/>
+        <w:gridCol w:w="3324"/>
+      </w:tblGrid>
+      <w:tr>
+        <w:tc>
+          <w:tcPr>
+            <w:tcW w:type="dxa" w:w="2835"/>
+            <w:vAlign w:val="center"/>
+            <w:shd w:fill="17365D"/>
+          </w:tcPr>
+          <w:p>
+            <w:pPr>
+              <w:spacing w:after="0"/>
+            </w:pPr>
+            <w:r/>
+            <w:r>
+              <w:rPr>
+                <w:b/>
+                <w:color w:val="FFFFFF"/>
+                <w:sz w:val="16"/>
+              </w:rPr>
+              <w:t>Audit stage</w:t>
+            </w:r>
+          </w:p>
+        </w:tc>
+        <w:tc>
+          <w:tcPr>
+            <w:tcW w:type="dxa" w:w="2268"/>
+            <w:vAlign w:val="center"/>
+            <w:shd w:fill="17365D"/>
+          </w:tcPr>
+          <w:p>
+            <w:pPr>
+              <w:spacing w:after="0"/>
+            </w:pPr>
+            <w:r/>
+            <w:r>
+              <w:rPr>
+                <w:b/>
+                <w:color w:val="FFFFFF"/>
+                <w:sz w:val="16"/>
+              </w:rPr>
+              <w:t>Count</w:t>
+            </w:r>
+          </w:p>
+        </w:tc>
+        <w:tc>
+          <w:tcPr>
+            <w:tcW w:type="dxa" w:w="4535"/>
+            <w:vAlign w:val="center"/>
+            <w:shd w:fill="17365D"/>
+          </w:tcPr>
+          <w:p>
+            <w:pPr>
+              <w:spacing w:after="0"/>
+            </w:pPr>
+            <w:r/>
+            <w:r>
+              <w:rPr>
+                <w:b/>
+                <w:color w:val="FFFFFF"/>
+                <w:sz w:val="16"/>
+              </w:rPr>
+              <w:t>Interpretation</w:t>
+            </w:r>
+          </w:p>
+        </w:tc>
+      </w:tr>
+      <w:tr>
+        <w:tc>
+          <w:tcPr>
+            <w:tcW w:type="dxa" w:w="2835"/>
+            <w:vAlign w:val="center"/>
+          </w:tcPr>
+          <w:p>
+            <w:pPr>
+              <w:spacing w:after="0"/>
+            </w:pPr>
+            <w:r/>
+            <w:r>
+              <w:rPr>
+                <w:b w:val="0"/>
+                <w:sz w:val="16"/>
+              </w:rPr>
+              <w:t>Raw complete SNP×environment grid</w:t>
+            </w:r>
+          </w:p>
+        </w:tc>
+        <w:tc>
+          <w:tcPr>
+            <w:tcW w:type="dxa" w:w="2268"/>
+            <w:vAlign w:val="center"/>
+          </w:tcPr>
+          <w:p>
+            <w:pPr>
+              <w:spacing w:after="0"/>
+            </w:pPr>
+            <w:r/>
+            <w:r>
+              <w:rPr>
+                <w:b w:val="0"/>
+                <w:sz w:val="16"/>
+              </w:rPr>
+              <w:t>172 SNPs / 344 rows</w:t>
+            </w:r>
+          </w:p>
+        </w:tc>
+        <w:tc>
+          <w:tcPr>
+            <w:tcW w:type="dxa" w:w="4535"/>
+            <w:vAlign w:val="center"/>
+          </w:tcPr>
+          <w:p>
+            <w:pPr>
+              <w:spacing w:after="0"/>
+            </w:pPr>
+            <w:r/>
+            <w:r>
+              <w:rPr>
+                <w:b w:val="0"/>
+                <w:sz w:val="16"/>
+              </w:rPr>
+              <w:t>Two environments were available for every raw local SNP.</w:t>
+            </w:r>
+          </w:p>
+        </w:tc>
+      </w:tr>
+      <w:tr>
+        <w:tc>
+          <w:tcPr>
+            <w:tcW w:type="dxa" w:w="2835"/>
+            <w:vAlign w:val="center"/>
+            <w:shd w:fill="F4F6F8"/>
+          </w:tcPr>
+          <w:p>
+            <w:pPr>
+              <w:spacing w:after="0"/>
+            </w:pPr>
+            <w:r/>
+            <w:r>
+              <w:rPr>
+                <w:b w:val="0"/>
+                <w:sz w:val="16"/>
+              </w:rPr>
+              <w:t>Ambiguous palindromic exclusions</w:t>
+            </w:r>
+          </w:p>
+        </w:tc>
+        <w:tc>
+          <w:tcPr>
+            <w:tcW w:type="dxa" w:w="2268"/>
+            <w:vAlign w:val="center"/>
+            <w:shd w:fill="F4F6F8"/>
+          </w:tcPr>
+          <w:p>
+            <w:pPr>
+              <w:spacing w:after="0"/>
+            </w:pPr>
+            <w:r/>
+            <w:r>
+              <w:rPr>
+                <w:b w:val="0"/>
+                <w:sz w:val="16"/>
+              </w:rPr>
+              <w:t>3 per environment</w:t>
+            </w:r>
+          </w:p>
+        </w:tc>
+        <w:tc>
+          <w:tcPr>
+            <w:tcW w:type="dxa" w:w="4535"/>
+            <w:vAlign w:val="center"/>
+            <w:shd w:fill="F4F6F8"/>
+          </w:tcPr>
+          <w:p>
+            <w:pPr>
+              <w:spacing w:after="0"/>
+            </w:pPr>
+            <w:r/>
+            <w:r>
+              <w:rPr>
+                <w:b w:val="0"/>
+                <w:sz w:val="16"/>
+              </w:rPr>
+              <w:t>Removed during allele harmonization; 169 SNPs / 338 rows remained.</w:t>
+            </w:r>
+          </w:p>
+        </w:tc>
+      </w:tr>
+      <w:tr>
+        <w:tc>
+          <w:tcPr>
+            <w:tcW w:type="dxa" w:w="2835"/>
+            <w:vAlign w:val="center"/>
+          </w:tcPr>
+          <w:p>
+            <w:pPr>
+              <w:spacing w:after="0"/>
+            </w:pPr>
+            <w:r/>
+            <w:r>
+              <w:rPr>
+                <w:b w:val="0"/>
+                <w:sz w:val="16"/>
+              </w:rPr>
+              <w:t>P-value diagnostic exclusions</w:t>
+            </w:r>
+          </w:p>
+        </w:tc>
+        <w:tc>
+          <w:tcPr>
+            <w:tcW w:type="dxa" w:w="2268"/>
+            <w:vAlign w:val="center"/>
+          </w:tcPr>
+          <w:p>
+            <w:pPr>
+              <w:spacing w:after="0"/>
+            </w:pPr>
+            <w:r/>
+            <w:r>
+              <w:rPr>
+                <w:b w:val="0"/>
+                <w:sz w:val="16"/>
+              </w:rPr>
+              <w:t>121 rows</w:t>
+            </w:r>
+          </w:p>
+        </w:tc>
+        <w:tc>
+          <w:tcPr>
+            <w:tcW w:type="dxa" w:w="4535"/>
+            <w:vAlign w:val="center"/>
+          </w:tcPr>
+          <w:p>
+            <w:pPr>
+              <w:spacing w:after="0"/>
+            </w:pPr>
+            <w:r/>
+            <w:r>
+              <w:rPr>
+                <w:b w:val="0"/>
+                <w:sz w:val="16"/>
+              </w:rPr>
+              <w:t>Overlapping with other QC exclusions; not a unique-stage count.</w:t>
+            </w:r>
+          </w:p>
+        </w:tc>
+      </w:tr>
+      <w:tr>
+        <w:tc>
+          <w:tcPr>
+            <w:tcW w:type="dxa" w:w="2835"/>
+            <w:vAlign w:val="center"/>
+            <w:shd w:fill="F4F6F8"/>
+          </w:tcPr>
+          <w:p>
+            <w:pPr>
+              <w:spacing w:after="0"/>
+            </w:pPr>
+            <w:r/>
+            <w:r>
+              <w:rPr>
+                <w:b w:val="0"/>
+                <w:sz w:val="16"/>
+              </w:rPr>
+              <w:t>F-statistic diagnostic exclusions</w:t>
+            </w:r>
+          </w:p>
+        </w:tc>
+        <w:tc>
+          <w:tcPr>
+            <w:tcW w:type="dxa" w:w="2268"/>
+            <w:vAlign w:val="center"/>
+            <w:shd w:fill="F4F6F8"/>
+          </w:tcPr>
+          <w:p>
+            <w:pPr>
+              <w:spacing w:after="0"/>
+            </w:pPr>
+            <w:r/>
+            <w:r>
+              <w:rPr>
+                <w:b w:val="0"/>
+                <w:sz w:val="16"/>
+              </w:rPr>
+              <w:t>106 rows</w:t>
+            </w:r>
+          </w:p>
+        </w:tc>
+        <w:tc>
+          <w:tcPr>
+            <w:tcW w:type="dxa" w:w="4535"/>
+            <w:vAlign w:val="center"/>
+            <w:shd w:fill="F4F6F8"/>
+          </w:tcPr>
+          <w:p>
+            <w:pPr>
+              <w:spacing w:after="0"/>
+            </w:pPr>
+            <w:r/>
+            <w:r>
+              <w:rPr>
+                <w:b w:val="0"/>
+                <w:sz w:val="16"/>
+              </w:rPr>
+              <w:t>Overlapping with P-value and complete-grid diagnostics.</w:t>
+            </w:r>
+          </w:p>
+        </w:tc>
+      </w:tr>
+      <w:tr>
+        <w:tc>
+          <w:tcPr>
+            <w:tcW w:type="dxa" w:w="2835"/>
+            <w:vAlign w:val="center"/>
+          </w:tcPr>
+          <w:p>
+            <w:pPr>
+              <w:spacing w:after="0"/>
+            </w:pPr>
+            <w:r/>
+            <w:r>
+              <w:rPr>
+                <w:b w:val="0"/>
+                <w:sz w:val="16"/>
+              </w:rPr>
+              <w:t>Final complete-grid instruments</w:t>
+            </w:r>
+          </w:p>
+        </w:tc>
+        <w:tc>
+          <w:tcPr>
+            <w:tcW w:type="dxa" w:w="2268"/>
+            <w:vAlign w:val="center"/>
+          </w:tcPr>
+          <w:p>
+            <w:pPr>
+              <w:spacing w:after="0"/>
+            </w:pPr>
+            <w:r/>
+            <w:r>
+              <w:rPr>
+                <w:b w:val="0"/>
+                <w:sz w:val="16"/>
+              </w:rPr>
+              <w:t>48 SNPs / 96 rows</w:t>
+            </w:r>
+          </w:p>
+        </w:tc>
+        <w:tc>
+          <w:tcPr>
+            <w:tcW w:type="dxa" w:w="4535"/>
+            <w:vAlign w:val="center"/>
+          </w:tcPr>
+          <w:p>
+            <w:pPr>
+              <w:spacing w:after="0"/>
+            </w:pPr>
+            <w:r/>
+            <w:r>
+              <w:rPr>
+                <w:b w:val="0"/>
+                <w:sz w:val="16"/>
+              </w:rPr>
+              <w:t>Passed the prespecified P-value, F and MAF requirements in both environments.</w:t>
+            </w:r>
+          </w:p>
+        </w:tc>
+      </w:tr>
+      <w:tr>
+        <w:tc>
+          <w:tcPr>
+            <w:tcW w:type="dxa" w:w="2835"/>
+            <w:vAlign w:val="center"/>
+            <w:shd w:fill="F4F6F8"/>
+          </w:tcPr>
+          <w:p>
+            <w:pPr>
+              <w:spacing w:after="0"/>
+            </w:pPr>
+            <w:r/>
+            <w:r>
+              <w:rPr>
+                <w:b w:val="0"/>
+                <w:sz w:val="16"/>
+              </w:rPr>
+              <w:t>LD matrix / covariance rank</w:t>
+            </w:r>
+          </w:p>
+        </w:tc>
+        <w:tc>
+          <w:tcPr>
+            <w:tcW w:type="dxa" w:w="2268"/>
+            <w:vAlign w:val="center"/>
+            <w:shd w:fill="F4F6F8"/>
+          </w:tcPr>
+          <w:p>
+            <w:pPr>
+              <w:spacing w:after="0"/>
+            </w:pPr>
+            <w:r/>
+            <w:r>
+              <w:rPr>
+                <w:b w:val="0"/>
+                <w:sz w:val="16"/>
+              </w:rPr>
+              <w:t>48×48 LD; rank(V)=62</w:t>
+            </w:r>
+          </w:p>
+        </w:tc>
+        <w:tc>
+          <w:tcPr>
+            <w:tcW w:type="dxa" w:w="4535"/>
+            <w:vAlign w:val="center"/>
+            <w:shd w:fill="F4F6F8"/>
+          </w:tcPr>
+          <w:p>
+            <w:pPr>
+              <w:spacing w:after="0"/>
+            </w:pPr>
+            <w:r/>
+            <w:r>
+              <w:rPr>
+                <w:b w:val="0"/>
+                <w:sz w:val="16"/>
+              </w:rPr>
+              <w:t>Rank-aware Q used 62−2=60 residual degrees of freedom.</w:t>
+            </w:r>
+          </w:p>
+        </w:tc>
+      </w:tr>
+    </w:tbl>
+    <w:p>
+      <w:pPr>
+        <w:spacing w:after="0"/>
+      </w:pPr>
+    </w:p>
+    <w:p>
+      <w:pPr>
+        <w:spacing w:line="269" w:lineRule="auto" w:after="40"/>
+      </w:pPr>
+      <w:r>
+        <w:t>Table 5. Environment-stratified comparator estimates. Estimates are local OLS summary-statistics demonstrations and are not independent validation of the causal model.</w:t>
+      </w:r>
+    </w:p>
+    <w:tbl>
+      <w:tblPr>
+        <w:tblStyle w:val="TableGrid"/>
+        <w:tblW w:type="auto" w:w="0"/>
+        <w:jc w:val="center"/>
+        <w:tblLook w:firstColumn="1" w:firstRow="1" w:lastColumn="0" w:lastRow="0" w:noHBand="0" w:noVBand="1" w:val="04A0"/>
+      </w:tblPr>
+      <w:tblGrid>
+        <w:gridCol w:w="1662"/>
+        <w:gridCol w:w="1662"/>
+        <w:gridCol w:w="1662"/>
+        <w:gridCol w:w="1662"/>
+        <w:gridCol w:w="1662"/>
+        <w:gridCol w:w="1662"/>
+      </w:tblGrid>
+      <w:tr>
+        <w:tc>
+          <w:tcPr>
+            <w:tcW w:type="dxa" w:w="1247"/>
+            <w:vAlign w:val="center"/>
+            <w:shd w:fill="17365D"/>
+          </w:tcPr>
+          <w:p>
+            <w:pPr>
+              <w:spacing w:after="0"/>
+            </w:pPr>
+            <w:r/>
+            <w:r>
+              <w:rPr>
+                <w:b/>
+                <w:color w:val="FFFFFF"/>
+                <w:sz w:val="15"/>
+              </w:rPr>
+              <w:t>Environment</w:t>
+            </w:r>
+          </w:p>
+        </w:tc>
+        <w:tc>
+          <w:tcPr>
+            <w:tcW w:type="dxa" w:w="1701"/>
+            <w:vAlign w:val="center"/>
+            <w:shd w:fill="17365D"/>
+          </w:tcPr>
+          <w:p>
+            <w:pPr>
+              <w:spacing w:after="0"/>
+            </w:pPr>
+            <w:r/>
+            <w:r>
+              <w:rPr>
+                <w:b/>
+                <w:color w:val="FFFFFF"/>
+                <w:sz w:val="15"/>
+              </w:rPr>
+              <w:t>Estimator</w:t>
+            </w:r>
+          </w:p>
+        </w:tc>
+        <w:tc>
+          <w:tcPr>
+            <w:tcW w:type="dxa" w:w="1701"/>
+            <w:vAlign w:val="center"/>
+            <w:shd w:fill="17365D"/>
+          </w:tcPr>
+          <w:p>
+            <w:pPr>
+              <w:spacing w:after="0"/>
+            </w:pPr>
+            <w:r/>
+            <w:r>
+              <w:rPr>
+                <w:b/>
+                <w:color w:val="FFFFFF"/>
+                <w:sz w:val="15"/>
+              </w:rPr>
+              <w:t>Estimate</w:t>
+            </w:r>
+          </w:p>
+        </w:tc>
+        <w:tc>
+          <w:tcPr>
+            <w:tcW w:type="dxa" w:w="1304"/>
+            <w:vAlign w:val="center"/>
+            <w:shd w:fill="17365D"/>
+          </w:tcPr>
+          <w:p>
+            <w:pPr>
+              <w:spacing w:after="0"/>
+            </w:pPr>
+            <w:r/>
+            <w:r>
+              <w:rPr>
+                <w:b/>
+                <w:color w:val="FFFFFF"/>
+                <w:sz w:val="15"/>
+              </w:rPr>
+              <w:t>SE</w:t>
+            </w:r>
+          </w:p>
+        </w:tc>
+        <w:tc>
+          <w:tcPr>
+            <w:tcW w:type="dxa" w:w="1984"/>
+            <w:vAlign w:val="center"/>
+            <w:shd w:fill="17365D"/>
+          </w:tcPr>
+          <w:p>
+            <w:pPr>
+              <w:spacing w:after="0"/>
+            </w:pPr>
+            <w:r/>
+            <w:r>
+              <w:rPr>
+                <w:b/>
+                <w:color w:val="FFFFFF"/>
+                <w:sz w:val="15"/>
+              </w:rPr>
+              <w:t>P value</w:t>
+            </w:r>
+          </w:p>
+        </w:tc>
+        <w:tc>
+          <w:tcPr>
+            <w:tcW w:type="dxa" w:w="2268"/>
+            <w:vAlign w:val="center"/>
+            <w:shd w:fill="17365D"/>
+          </w:tcPr>
+          <w:p>
+            <w:pPr>
+              <w:spacing w:after="0"/>
+            </w:pPr>
+            <w:r/>
+            <w:r>
+              <w:rPr>
+                <w:b/>
+                <w:color w:val="FFFFFF"/>
+                <w:sz w:val="15"/>
+              </w:rPr>
+              <w:t>Q (P value)</w:t>
+            </w:r>
+          </w:p>
+        </w:tc>
+      </w:tr>
+      <w:tr>
+        <w:tc>
+          <w:tcPr>
+            <w:tcW w:type="dxa" w:w="1247"/>
+            <w:vAlign w:val="center"/>
+          </w:tcPr>
+          <w:p>
+            <w:pPr>
+              <w:spacing w:after="0"/>
+            </w:pPr>
+            <w:r/>
+            <w:r>
+              <w:rPr>
+                <w:b w:val="0"/>
+                <w:sz w:val="15"/>
+              </w:rPr>
+              <w:t>10°C</w:t>
+            </w:r>
+          </w:p>
+        </w:tc>
+        <w:tc>
+          <w:tcPr>
+            <w:tcW w:type="dxa" w:w="1701"/>
+            <w:vAlign w:val="center"/>
+          </w:tcPr>
+          <w:p>
+            <w:pPr>
+              <w:spacing w:after="0"/>
+            </w:pPr>
+            <w:r/>
+            <w:r>
+              <w:rPr>
+                <w:b w:val="0"/>
+                <w:sz w:val="15"/>
+              </w:rPr>
+              <w:t>Fixed IVW</w:t>
+            </w:r>
+          </w:p>
+        </w:tc>
+        <w:tc>
+          <w:tcPr>
+            <w:tcW w:type="dxa" w:w="1701"/>
+            <w:vAlign w:val="center"/>
+          </w:tcPr>
+          <w:p>
+            <w:pPr>
+              <w:spacing w:after="0"/>
+            </w:pPr>
+            <w:r/>
+            <w:r>
+              <w:rPr>
+                <w:b w:val="0"/>
+                <w:sz w:val="15"/>
+              </w:rPr>
+              <w:t>6.6001</w:t>
+            </w:r>
+          </w:p>
+        </w:tc>
+        <w:tc>
+          <w:tcPr>
+            <w:tcW w:type="dxa" w:w="1304"/>
+            <w:vAlign w:val="center"/>
+          </w:tcPr>
+          <w:p>
+            <w:pPr>
+              <w:spacing w:after="0"/>
+            </w:pPr>
+            <w:r/>
+            <w:r>
+              <w:rPr>
+                <w:b w:val="0"/>
+                <w:sz w:val="15"/>
+              </w:rPr>
+              <w:t>0.2038</w:t>
+            </w:r>
+          </w:p>
+        </w:tc>
+        <w:tc>
+          <w:tcPr>
+            <w:tcW w:type="dxa" w:w="1984"/>
+            <w:vAlign w:val="center"/>
+          </w:tcPr>
+          <w:p>
+            <w:pPr>
+              <w:spacing w:after="0"/>
+            </w:pPr>
+            <w:r/>
+            <w:r>
+              <w:rPr>
+                <w:b w:val="0"/>
+                <w:sz w:val="15"/>
+              </w:rPr>
+              <w:t>4.999×10−230</w:t>
+            </w:r>
+          </w:p>
+        </w:tc>
+        <w:tc>
+          <w:tcPr>
+            <w:tcW w:type="dxa" w:w="2268"/>
+            <w:vAlign w:val="center"/>
+          </w:tcPr>
+          <w:p>
+            <w:pPr>
+              <w:spacing w:after="0"/>
+            </w:pPr>
+            <w:r/>
+            <w:r>
+              <w:rPr>
+                <w:b w:val="0"/>
+                <w:sz w:val="15"/>
+              </w:rPr>
+              <w:t>84.90 (5.89×10−4)</w:t>
+            </w:r>
+          </w:p>
+        </w:tc>
+      </w:tr>
+      <w:tr>
+        <w:tc>
+          <w:tcPr>
+            <w:tcW w:type="dxa" w:w="1247"/>
+            <w:vAlign w:val="center"/>
+            <w:shd w:fill="F4F6F8"/>
+          </w:tcPr>
+          <w:p>
+            <w:pPr>
+              <w:spacing w:after="0"/>
+            </w:pPr>
+            <w:r/>
+            <w:r>
+              <w:rPr>
+                <w:b w:val="0"/>
+                <w:sz w:val="15"/>
+              </w:rPr>
+              <w:t>10°C</w:t>
+            </w:r>
+          </w:p>
+        </w:tc>
+        <w:tc>
+          <w:tcPr>
+            <w:tcW w:type="dxa" w:w="1701"/>
+            <w:vAlign w:val="center"/>
+            <w:shd w:fill="F4F6F8"/>
+          </w:tcPr>
+          <w:p>
+            <w:pPr>
+              <w:spacing w:after="0"/>
+            </w:pPr>
+            <w:r/>
+            <w:r>
+              <w:rPr>
+                <w:b w:val="0"/>
+                <w:sz w:val="15"/>
+              </w:rPr>
+              <w:t>Random IVW</w:t>
+            </w:r>
+          </w:p>
+        </w:tc>
+        <w:tc>
+          <w:tcPr>
+            <w:tcW w:type="dxa" w:w="1701"/>
+            <w:vAlign w:val="center"/>
+            <w:shd w:fill="F4F6F8"/>
+          </w:tcPr>
+          <w:p>
+            <w:pPr>
+              <w:spacing w:after="0"/>
+            </w:pPr>
+            <w:r/>
+            <w:r>
+              <w:rPr>
+                <w:b w:val="0"/>
+                <w:sz w:val="15"/>
+              </w:rPr>
+              <w:t>7.0842</w:t>
+            </w:r>
+          </w:p>
+        </w:tc>
+        <w:tc>
+          <w:tcPr>
+            <w:tcW w:type="dxa" w:w="1304"/>
+            <w:vAlign w:val="center"/>
+            <w:shd w:fill="F4F6F8"/>
+          </w:tcPr>
+          <w:p>
+            <w:pPr>
+              <w:spacing w:after="0"/>
+            </w:pPr>
+            <w:r/>
+            <w:r>
+              <w:rPr>
+                <w:b w:val="0"/>
+                <w:sz w:val="15"/>
+              </w:rPr>
+              <w:t>0.2970</w:t>
+            </w:r>
+          </w:p>
+        </w:tc>
+        <w:tc>
+          <w:tcPr>
+            <w:tcW w:type="dxa" w:w="1984"/>
+            <w:vAlign w:val="center"/>
+            <w:shd w:fill="F4F6F8"/>
+          </w:tcPr>
+          <w:p>
+            <w:pPr>
+              <w:spacing w:after="0"/>
+            </w:pPr>
+            <w:r/>
+            <w:r>
+              <w:rPr>
+                <w:b w:val="0"/>
+                <w:sz w:val="15"/>
+              </w:rPr>
+              <w:t>1.030×10−125</w:t>
+            </w:r>
+          </w:p>
+        </w:tc>
+        <w:tc>
+          <w:tcPr>
+            <w:tcW w:type="dxa" w:w="2268"/>
+            <w:vAlign w:val="center"/>
+            <w:shd w:fill="F4F6F8"/>
+          </w:tcPr>
+          <w:p>
+            <w:pPr>
+              <w:spacing w:after="0"/>
+            </w:pPr>
+            <w:r/>
+            <w:r>
+              <w:rPr>
+                <w:b w:val="0"/>
+                <w:sz w:val="15"/>
+              </w:rPr>
+              <w:t>84.90 (5.89×10−4)</w:t>
+            </w:r>
+          </w:p>
+        </w:tc>
+      </w:tr>
+      <w:tr>
+        <w:tc>
+          <w:tcPr>
+            <w:tcW w:type="dxa" w:w="1247"/>
+            <w:vAlign w:val="center"/>
+          </w:tcPr>
+          <w:p>
+            <w:pPr>
+              <w:spacing w:after="0"/>
+            </w:pPr>
+            <w:r/>
+            <w:r>
+              <w:rPr>
+                <w:b w:val="0"/>
+                <w:sz w:val="15"/>
+              </w:rPr>
+              <w:t>10°C</w:t>
+            </w:r>
+          </w:p>
+        </w:tc>
+        <w:tc>
+          <w:tcPr>
+            <w:tcW w:type="dxa" w:w="1701"/>
+            <w:vAlign w:val="center"/>
+          </w:tcPr>
+          <w:p>
+            <w:pPr>
+              <w:spacing w:after="0"/>
+            </w:pPr>
+            <w:r/>
+            <w:r>
+              <w:rPr>
+                <w:b w:val="0"/>
+                <w:sz w:val="15"/>
+              </w:rPr>
+              <w:t>MR-Egger</w:t>
+            </w:r>
+          </w:p>
+        </w:tc>
+        <w:tc>
+          <w:tcPr>
+            <w:tcW w:type="dxa" w:w="1701"/>
+            <w:vAlign w:val="center"/>
+          </w:tcPr>
+          <w:p>
+            <w:pPr>
+              <w:spacing w:after="0"/>
+            </w:pPr>
+            <w:r/>
+            <w:r>
+              <w:rPr>
+                <w:b w:val="0"/>
+                <w:sz w:val="15"/>
+              </w:rPr>
+              <w:t>4.2259</w:t>
+            </w:r>
+          </w:p>
+        </w:tc>
+        <w:tc>
+          <w:tcPr>
+            <w:tcW w:type="dxa" w:w="1304"/>
+            <w:vAlign w:val="center"/>
+          </w:tcPr>
+          <w:p>
+            <w:pPr>
+              <w:spacing w:after="0"/>
+            </w:pPr>
+            <w:r/>
+            <w:r>
+              <w:rPr>
+                <w:b w:val="0"/>
+                <w:sz w:val="15"/>
+              </w:rPr>
+              <w:t>0.5188</w:t>
+            </w:r>
+          </w:p>
+        </w:tc>
+        <w:tc>
+          <w:tcPr>
+            <w:tcW w:type="dxa" w:w="1984"/>
+            <w:vAlign w:val="center"/>
+          </w:tcPr>
+          <w:p>
+            <w:pPr>
+              <w:spacing w:after="0"/>
+            </w:pPr>
+            <w:r/>
+            <w:r>
+              <w:rPr>
+                <w:b w:val="0"/>
+                <w:sz w:val="15"/>
+              </w:rPr>
+              <w:t>3.758×10−16</w:t>
+            </w:r>
+          </w:p>
+        </w:tc>
+        <w:tc>
+          <w:tcPr>
+            <w:tcW w:type="dxa" w:w="2268"/>
+            <w:vAlign w:val="center"/>
+          </w:tcPr>
+          <w:p>
+            <w:pPr>
+              <w:spacing w:after="0"/>
+            </w:pPr>
+            <w:r/>
+            <w:r>
+              <w:rPr>
+                <w:b w:val="0"/>
+                <w:sz w:val="15"/>
+              </w:rPr>
+              <w:t>—</w:t>
+            </w:r>
+          </w:p>
+        </w:tc>
+      </w:tr>
+      <w:tr>
+        <w:tc>
+          <w:tcPr>
+            <w:tcW w:type="dxa" w:w="1247"/>
+            <w:vAlign w:val="center"/>
+            <w:shd w:fill="F4F6F8"/>
+          </w:tcPr>
+          <w:p>
+            <w:pPr>
+              <w:spacing w:after="0"/>
+            </w:pPr>
+            <w:r/>
+            <w:r>
+              <w:rPr>
+                <w:b w:val="0"/>
+                <w:sz w:val="15"/>
+              </w:rPr>
+              <w:t>16°C</w:t>
+            </w:r>
+          </w:p>
+        </w:tc>
+        <w:tc>
+          <w:tcPr>
+            <w:tcW w:type="dxa" w:w="1701"/>
+            <w:vAlign w:val="center"/>
+            <w:shd w:fill="F4F6F8"/>
+          </w:tcPr>
+          <w:p>
+            <w:pPr>
+              <w:spacing w:after="0"/>
+            </w:pPr>
+            <w:r/>
+            <w:r>
+              <w:rPr>
+                <w:b w:val="0"/>
+                <w:sz w:val="15"/>
+              </w:rPr>
+              <w:t>Fixed IVW</w:t>
+            </w:r>
+          </w:p>
+        </w:tc>
+        <w:tc>
+          <w:tcPr>
+            <w:tcW w:type="dxa" w:w="1701"/>
+            <w:vAlign w:val="center"/>
+            <w:shd w:fill="F4F6F8"/>
+          </w:tcPr>
+          <w:p>
+            <w:pPr>
+              <w:spacing w:after="0"/>
+            </w:pPr>
+            <w:r/>
+            <w:r>
+              <w:rPr>
+                <w:b w:val="0"/>
+                <w:sz w:val="15"/>
+              </w:rPr>
+              <w:t>8.2379</w:t>
+            </w:r>
+          </w:p>
+        </w:tc>
+        <w:tc>
+          <w:tcPr>
+            <w:tcW w:type="dxa" w:w="1304"/>
+            <w:vAlign w:val="center"/>
+            <w:shd w:fill="F4F6F8"/>
+          </w:tcPr>
+          <w:p>
+            <w:pPr>
+              <w:spacing w:after="0"/>
+            </w:pPr>
+            <w:r/>
+            <w:r>
+              <w:rPr>
+                <w:b w:val="0"/>
+                <w:sz w:val="15"/>
+              </w:rPr>
+              <w:t>0.2933</w:t>
+            </w:r>
+          </w:p>
+        </w:tc>
+        <w:tc>
+          <w:tcPr>
+            <w:tcW w:type="dxa" w:w="1984"/>
+            <w:vAlign w:val="center"/>
+            <w:shd w:fill="F4F6F8"/>
+          </w:tcPr>
+          <w:p>
+            <w:pPr>
+              <w:spacing w:after="0"/>
+            </w:pPr>
+            <w:r/>
+            <w:r>
+              <w:rPr>
+                <w:b w:val="0"/>
+                <w:sz w:val="15"/>
+              </w:rPr>
+              <w:t>1.402×10−173</w:t>
+            </w:r>
+          </w:p>
+        </w:tc>
+        <w:tc>
+          <w:tcPr>
+            <w:tcW w:type="dxa" w:w="2268"/>
+            <w:vAlign w:val="center"/>
+            <w:shd w:fill="F4F6F8"/>
+          </w:tcPr>
+          <w:p>
+            <w:pPr>
+              <w:spacing w:after="0"/>
+            </w:pPr>
+            <w:r/>
+            <w:r>
+              <w:rPr>
+                <w:b w:val="0"/>
+                <w:sz w:val="15"/>
+              </w:rPr>
+              <w:t>97.70 (2.05×10−5)</w:t>
+            </w:r>
+          </w:p>
+        </w:tc>
+      </w:tr>
+      <w:tr>
+        <w:tc>
+          <w:tcPr>
+            <w:tcW w:type="dxa" w:w="1247"/>
+            <w:vAlign w:val="center"/>
+          </w:tcPr>
+          <w:p>
+            <w:pPr>
+              <w:spacing w:after="0"/>
+            </w:pPr>
+            <w:r/>
+            <w:r>
+              <w:rPr>
+                <w:b w:val="0"/>
+                <w:sz w:val="15"/>
+              </w:rPr>
+              <w:t>16°C</w:t>
+            </w:r>
+          </w:p>
+        </w:tc>
+        <w:tc>
+          <w:tcPr>
+            <w:tcW w:type="dxa" w:w="1701"/>
+            <w:vAlign w:val="center"/>
+          </w:tcPr>
+          <w:p>
+            <w:pPr>
+              <w:spacing w:after="0"/>
+            </w:pPr>
+            <w:r/>
+            <w:r>
+              <w:rPr>
+                <w:b w:val="0"/>
+                <w:sz w:val="15"/>
+              </w:rPr>
+              <w:t>Random IVW</w:t>
+            </w:r>
+          </w:p>
+        </w:tc>
+        <w:tc>
+          <w:tcPr>
+            <w:tcW w:type="dxa" w:w="1701"/>
+            <w:vAlign w:val="center"/>
+          </w:tcPr>
+          <w:p>
+            <w:pPr>
+              <w:spacing w:after="0"/>
+            </w:pPr>
+            <w:r/>
+            <w:r>
+              <w:rPr>
+                <w:b w:val="0"/>
+                <w:sz w:val="15"/>
+              </w:rPr>
+              <w:t>8.8667</w:t>
+            </w:r>
+          </w:p>
+        </w:tc>
+        <w:tc>
+          <w:tcPr>
+            <w:tcW w:type="dxa" w:w="1304"/>
+            <w:vAlign w:val="center"/>
+          </w:tcPr>
+          <w:p>
+            <w:pPr>
+              <w:spacing w:after="0"/>
+            </w:pPr>
+            <w:r/>
+            <w:r>
+              <w:rPr>
+                <w:b w:val="0"/>
+                <w:sz w:val="15"/>
+              </w:rPr>
+              <w:t>0.4561</w:t>
+            </w:r>
+          </w:p>
+        </w:tc>
+        <w:tc>
+          <w:tcPr>
+            <w:tcW w:type="dxa" w:w="1984"/>
+            <w:vAlign w:val="center"/>
+          </w:tcPr>
+          <w:p>
+            <w:pPr>
+              <w:spacing w:after="0"/>
+            </w:pPr>
+            <w:r/>
+            <w:r>
+              <w:rPr>
+                <w:b w:val="0"/>
+                <w:sz w:val="15"/>
+              </w:rPr>
+              <w:t>3.598×10−84</w:t>
+            </w:r>
+          </w:p>
+        </w:tc>
+        <w:tc>
+          <w:tcPr>
+            <w:tcW w:type="dxa" w:w="2268"/>
+            <w:vAlign w:val="center"/>
+          </w:tcPr>
+          <w:p>
+            <w:pPr>
+              <w:spacing w:after="0"/>
+            </w:pPr>
+            <w:r/>
+            <w:r>
+              <w:rPr>
+                <w:b w:val="0"/>
+                <w:sz w:val="15"/>
+              </w:rPr>
+              <w:t>97.70 (2.05×10−5)</w:t>
+            </w:r>
+          </w:p>
+        </w:tc>
+      </w:tr>
+      <w:tr>
+        <w:tc>
+          <w:tcPr>
+            <w:tcW w:type="dxa" w:w="1247"/>
+            <w:vAlign w:val="center"/>
+            <w:shd w:fill="F4F6F8"/>
+          </w:tcPr>
+          <w:p>
+            <w:pPr>
+              <w:spacing w:after="0"/>
+            </w:pPr>
+            <w:r/>
+            <w:r>
+              <w:rPr>
+                <w:b w:val="0"/>
+                <w:sz w:val="15"/>
+              </w:rPr>
+              <w:t>16°C</w:t>
+            </w:r>
+          </w:p>
+        </w:tc>
+        <w:tc>
+          <w:tcPr>
+            <w:tcW w:type="dxa" w:w="1701"/>
+            <w:vAlign w:val="center"/>
+            <w:shd w:fill="F4F6F8"/>
+          </w:tcPr>
+          <w:p>
+            <w:pPr>
+              <w:spacing w:after="0"/>
+            </w:pPr>
+            <w:r/>
+            <w:r>
+              <w:rPr>
+                <w:b w:val="0"/>
+                <w:sz w:val="15"/>
+              </w:rPr>
+              <w:t>MR-Egger</w:t>
+            </w:r>
+          </w:p>
+        </w:tc>
+        <w:tc>
+          <w:tcPr>
+            <w:tcW w:type="dxa" w:w="1701"/>
+            <w:vAlign w:val="center"/>
+            <w:shd w:fill="F4F6F8"/>
+          </w:tcPr>
+          <w:p>
+            <w:pPr>
+              <w:spacing w:after="0"/>
+            </w:pPr>
+            <w:r/>
+            <w:r>
+              <w:rPr>
+                <w:b w:val="0"/>
+                <w:sz w:val="15"/>
+              </w:rPr>
+              <w:t>6.7552</w:t>
+            </w:r>
+          </w:p>
+        </w:tc>
+        <w:tc>
+          <w:tcPr>
+            <w:tcW w:type="dxa" w:w="1304"/>
+            <w:vAlign w:val="center"/>
+            <w:shd w:fill="F4F6F8"/>
+          </w:tcPr>
+          <w:p>
+            <w:pPr>
+              <w:spacing w:after="0"/>
+            </w:pPr>
+            <w:r/>
+            <w:r>
+              <w:rPr>
+                <w:b w:val="0"/>
+                <w:sz w:val="15"/>
+              </w:rPr>
+              <w:t>0.7683</w:t>
+            </w:r>
+          </w:p>
+        </w:tc>
+        <w:tc>
+          <w:tcPr>
+            <w:tcW w:type="dxa" w:w="1984"/>
+            <w:vAlign w:val="center"/>
+            <w:shd w:fill="F4F6F8"/>
+          </w:tcPr>
+          <w:p>
+            <w:pPr>
+              <w:spacing w:after="0"/>
+            </w:pPr>
+            <w:r/>
+            <w:r>
+              <w:rPr>
+                <w:b w:val="0"/>
+                <w:sz w:val="15"/>
+              </w:rPr>
+              <w:t>1.466×10−18</w:t>
+            </w:r>
+          </w:p>
+        </w:tc>
+        <w:tc>
+          <w:tcPr>
+            <w:tcW w:type="dxa" w:w="2268"/>
+            <w:vAlign w:val="center"/>
+            <w:shd w:fill="F4F6F8"/>
+          </w:tcPr>
+          <w:p>
+            <w:pPr>
+              <w:spacing w:after="0"/>
+            </w:pPr>
+            <w:r/>
+            <w:r>
+              <w:rPr>
+                <w:b w:val="0"/>
+                <w:sz w:val="15"/>
+              </w:rPr>
+              <w:t>—</w:t>
+            </w:r>
+          </w:p>
+        </w:tc>
+      </w:tr>
+    </w:tbl>
+    <w:p>
+      <w:pPr>
+        <w:spacing w:after="0"/>
+      </w:pPr>
+    </w:p>
+    <w:p>
+      <w:pPr>
+        <w:spacing w:line="269" w:lineRule="auto" w:after="100"/>
+      </w:pPr>
+      <w:r>
+        <w:t>The two environment-stratified IVW estimates are both positive but differ in magnitude (fixed IVW 6.6001 at 10°C versus 8.2379 at 16°C). Their heterogeneity statistics are significant, which motivates—but does not by itself identify—the environment-slope analysis. MR-Egger estimates are lower and have large intercept diagnostics (10°C intercept 2.9281, P=3.59×10−8; 16°C intercept 2.0160, P=0.0103), consistent with the need to treat pleiotropy as an unresolved limitation rather than a solved problem.</w:t>
+      </w:r>
+    </w:p>
+    <w:p>
+      <w:pPr>
         <w:spacing w:line="269" w:lineRule="auto" w:after="100"/>
       </w:pPr>
       <w:r>
@@ -2109,6 +3578,421 @@
       </w:pPr>
     </w:p>
     <w:p>
+      <w:r>
+        <w:drawing>
+          <wp:inline xmlns:a="http://schemas.openxmlformats.org/drawingml/2006/main" xmlns:pic="http://schemas.openxmlformats.org/drawingml/2006/picture">
+            <wp:extent cx="5989320" cy="1996440"/>
+            <wp:docPr id="4" name="Picture 4"/>
+            <wp:cNvGraphicFramePr>
+              <a:graphicFrameLocks noChangeAspect="1"/>
+            </wp:cNvGraphicFramePr>
+            <a:graphic>
+              <a:graphicData uri="http://schemas.openxmlformats.org/drawingml/2006/picture">
+                <pic:pic>
+                  <pic:nvPicPr>
+                    <pic:cNvPr id="0" name="arabidopsis_case.png"/>
+                    <pic:cNvPicPr/>
+                  </pic:nvPicPr>
+                  <pic:blipFill>
+                    <a:blip r:embed="rId14"/>
+                    <a:stretch>
+                      <a:fillRect/>
+                    </a:stretch>
+                  </pic:blipFill>
+                  <pic:spPr>
+                    <a:xfrm>
+                      <a:off x="0" y="0"/>
+                      <a:ext cx="5989320" cy="1996440"/>
+                    </a:xfrm>
+                    <a:prstGeom prst="rect"/>
+                  </pic:spPr>
+                </pic:pic>
+              </a:graphicData>
+            </a:graphic>
+          </wp:inline>
+        </w:drawing>
+      </w:r>
+    </w:p>
+    <w:p>
+      <w:pPr>
+        <w:jc w:val="center"/>
+      </w:pPr>
+      <w:r>
+        <w:rPr>
+          <w:i/>
+          <w:sz w:val="18"/>
+        </w:rPr>
+        <w:t>Figure 4. Arabidopsis data-contract case. (A) Environment-stratified comparator estimates; (B) primary and phenotype-correlation-proxy environment slopes; (C) the raw-to-final instrument audit. Error bars are 95% confidence intervals where applicable.</w:t>
+      </w:r>
+    </w:p>
+    <w:p>
+      <w:pPr>
+        <w:pStyle w:val="Heading2"/>
+      </w:pPr>
+      <w:r>
+        <w:t>Reproducibility and runtime</w:t>
+      </w:r>
+    </w:p>
+    <w:p>
+      <w:pPr>
+        <w:spacing w:line="269" w:lineRule="auto" w:after="100"/>
+      </w:pPr>
+      <w:r>
+        <w:t>The local runtime benchmark completed validation, a synthetic G×E run and the Arabidopsis case with return code 0. The three tasks required 9.70–9.93 seconds and peak resident memory of 126,664–133,424 KB in the frozen environment. These are reproducibility benchmarks on one host, not claims of universal performance or genome-wide scalability.</w:t>
+      </w:r>
+    </w:p>
+    <w:p>
+      <w:pPr>
+        <w:spacing w:line="269" w:lineRule="auto" w:after="40"/>
+      </w:pPr>
+      <w:r>
+        <w:t>Table 6. Local runtime benchmark for the frozen PlantMR implementation.</w:t>
+      </w:r>
+    </w:p>
+    <w:tbl>
+      <w:tblPr>
+        <w:tblStyle w:val="TableGrid"/>
+        <w:tblW w:type="auto" w:w="0"/>
+        <w:jc w:val="center"/>
+        <w:tblLook w:firstColumn="1" w:firstRow="1" w:lastColumn="0" w:lastRow="0" w:noHBand="0" w:noVBand="1" w:val="04A0"/>
+      </w:tblPr>
+      <w:tblGrid>
+        <w:gridCol w:w="2493"/>
+        <w:gridCol w:w="2493"/>
+        <w:gridCol w:w="2493"/>
+        <w:gridCol w:w="2493"/>
+      </w:tblGrid>
+      <w:tr>
+        <w:tc>
+          <w:tcPr>
+            <w:tcW w:type="dxa" w:w="3402"/>
+            <w:vAlign w:val="center"/>
+            <w:shd w:fill="17365D"/>
+          </w:tcPr>
+          <w:p>
+            <w:pPr>
+              <w:spacing w:after="0"/>
+            </w:pPr>
+            <w:r/>
+            <w:r>
+              <w:rPr>
+                <w:b/>
+                <w:color w:val="FFFFFF"/>
+                <w:sz w:val="17"/>
+              </w:rPr>
+              <w:t>Task</w:t>
+            </w:r>
+          </w:p>
+        </w:tc>
+        <w:tc>
+          <w:tcPr>
+            <w:tcW w:type="dxa" w:w="2268"/>
+            <w:vAlign w:val="center"/>
+            <w:shd w:fill="17365D"/>
+          </w:tcPr>
+          <w:p>
+            <w:pPr>
+              <w:spacing w:after="0"/>
+            </w:pPr>
+            <w:r/>
+            <w:r>
+              <w:rPr>
+                <w:b/>
+                <w:color w:val="FFFFFF"/>
+                <w:sz w:val="17"/>
+              </w:rPr>
+              <w:t>Wall time (s)</w:t>
+            </w:r>
+          </w:p>
+        </w:tc>
+        <w:tc>
+          <w:tcPr>
+            <w:tcW w:type="dxa" w:w="2268"/>
+            <w:vAlign w:val="center"/>
+            <w:shd w:fill="17365D"/>
+          </w:tcPr>
+          <w:p>
+            <w:pPr>
+              <w:spacing w:after="0"/>
+            </w:pPr>
+            <w:r/>
+            <w:r>
+              <w:rPr>
+                <w:b/>
+                <w:color w:val="FFFFFF"/>
+                <w:sz w:val="17"/>
+              </w:rPr>
+              <w:t>Peak RSS (KB)</w:t>
+            </w:r>
+          </w:p>
+        </w:tc>
+        <w:tc>
+          <w:tcPr>
+            <w:tcW w:type="dxa" w:w="1701"/>
+            <w:vAlign w:val="center"/>
+            <w:shd w:fill="17365D"/>
+          </w:tcPr>
+          <w:p>
+            <w:pPr>
+              <w:spacing w:after="0"/>
+            </w:pPr>
+            <w:r/>
+            <w:r>
+              <w:rPr>
+                <w:b/>
+                <w:color w:val="FFFFFF"/>
+                <w:sz w:val="17"/>
+              </w:rPr>
+              <w:t>Return code</w:t>
+            </w:r>
+          </w:p>
+        </w:tc>
+      </w:tr>
+      <w:tr>
+        <w:tc>
+          <w:tcPr>
+            <w:tcW w:type="dxa" w:w="3402"/>
+            <w:vAlign w:val="center"/>
+          </w:tcPr>
+          <w:p>
+            <w:pPr>
+              <w:spacing w:after="0"/>
+            </w:pPr>
+            <w:r/>
+            <w:r>
+              <w:rPr>
+                <w:b w:val="0"/>
+                <w:sz w:val="17"/>
+              </w:rPr>
+              <w:t>validate</w:t>
+            </w:r>
+          </w:p>
+        </w:tc>
+        <w:tc>
+          <w:tcPr>
+            <w:tcW w:type="dxa" w:w="2268"/>
+            <w:vAlign w:val="center"/>
+          </w:tcPr>
+          <w:p>
+            <w:pPr>
+              <w:spacing w:after="0"/>
+            </w:pPr>
+            <w:r/>
+            <w:r>
+              <w:rPr>
+                <w:b w:val="0"/>
+                <w:sz w:val="17"/>
+              </w:rPr>
+              <w:t>9.7034</w:t>
+            </w:r>
+          </w:p>
+        </w:tc>
+        <w:tc>
+          <w:tcPr>
+            <w:tcW w:type="dxa" w:w="2268"/>
+            <w:vAlign w:val="center"/>
+          </w:tcPr>
+          <w:p>
+            <w:pPr>
+              <w:spacing w:after="0"/>
+            </w:pPr>
+            <w:r/>
+            <w:r>
+              <w:rPr>
+                <w:b w:val="0"/>
+                <w:sz w:val="17"/>
+              </w:rPr>
+              <w:t>126,664</w:t>
+            </w:r>
+          </w:p>
+        </w:tc>
+        <w:tc>
+          <w:tcPr>
+            <w:tcW w:type="dxa" w:w="1701"/>
+            <w:vAlign w:val="center"/>
+          </w:tcPr>
+          <w:p>
+            <w:pPr>
+              <w:spacing w:after="0"/>
+            </w:pPr>
+            <w:r/>
+            <w:r>
+              <w:rPr>
+                <w:b w:val="0"/>
+                <w:sz w:val="17"/>
+              </w:rPr>
+              <w:t>0</w:t>
+            </w:r>
+          </w:p>
+        </w:tc>
+      </w:tr>
+      <w:tr>
+        <w:tc>
+          <w:tcPr>
+            <w:tcW w:type="dxa" w:w="3402"/>
+            <w:vAlign w:val="center"/>
+            <w:shd w:fill="F4F6F8"/>
+          </w:tcPr>
+          <w:p>
+            <w:pPr>
+              <w:spacing w:after="0"/>
+            </w:pPr>
+            <w:r/>
+            <w:r>
+              <w:rPr>
+                <w:b w:val="0"/>
+                <w:sz w:val="17"/>
+              </w:rPr>
+              <w:t>gxe_synthetic</w:t>
+            </w:r>
+          </w:p>
+        </w:tc>
+        <w:tc>
+          <w:tcPr>
+            <w:tcW w:type="dxa" w:w="2268"/>
+            <w:vAlign w:val="center"/>
+            <w:shd w:fill="F4F6F8"/>
+          </w:tcPr>
+          <w:p>
+            <w:pPr>
+              <w:spacing w:after="0"/>
+            </w:pPr>
+            <w:r/>
+            <w:r>
+              <w:rPr>
+                <w:b w:val="0"/>
+                <w:sz w:val="17"/>
+              </w:rPr>
+              <w:t>9.7974</w:t>
+            </w:r>
+          </w:p>
+        </w:tc>
+        <w:tc>
+          <w:tcPr>
+            <w:tcW w:type="dxa" w:w="2268"/>
+            <w:vAlign w:val="center"/>
+            <w:shd w:fill="F4F6F8"/>
+          </w:tcPr>
+          <w:p>
+            <w:pPr>
+              <w:spacing w:after="0"/>
+            </w:pPr>
+            <w:r/>
+            <w:r>
+              <w:rPr>
+                <w:b w:val="0"/>
+                <w:sz w:val="17"/>
+              </w:rPr>
+              <w:t>129,736</w:t>
+            </w:r>
+          </w:p>
+        </w:tc>
+        <w:tc>
+          <w:tcPr>
+            <w:tcW w:type="dxa" w:w="1701"/>
+            <w:vAlign w:val="center"/>
+            <w:shd w:fill="F4F6F8"/>
+          </w:tcPr>
+          <w:p>
+            <w:pPr>
+              <w:spacing w:after="0"/>
+            </w:pPr>
+            <w:r/>
+            <w:r>
+              <w:rPr>
+                <w:b w:val="0"/>
+                <w:sz w:val="17"/>
+              </w:rPr>
+              <w:t>0</w:t>
+            </w:r>
+          </w:p>
+        </w:tc>
+      </w:tr>
+      <w:tr>
+        <w:tc>
+          <w:tcPr>
+            <w:tcW w:type="dxa" w:w="3402"/>
+            <w:vAlign w:val="center"/>
+          </w:tcPr>
+          <w:p>
+            <w:pPr>
+              <w:spacing w:after="0"/>
+            </w:pPr>
+            <w:r/>
+            <w:r>
+              <w:rPr>
+                <w:b w:val="0"/>
+                <w:sz w:val="17"/>
+              </w:rPr>
+              <w:t>gxe_arabidopsis</w:t>
+            </w:r>
+          </w:p>
+        </w:tc>
+        <w:tc>
+          <w:tcPr>
+            <w:tcW w:type="dxa" w:w="2268"/>
+            <w:vAlign w:val="center"/>
+          </w:tcPr>
+          <w:p>
+            <w:pPr>
+              <w:spacing w:after="0"/>
+            </w:pPr>
+            <w:r/>
+            <w:r>
+              <w:rPr>
+                <w:b w:val="0"/>
+                <w:sz w:val="17"/>
+              </w:rPr>
+              <w:t>9.9300</w:t>
+            </w:r>
+          </w:p>
+        </w:tc>
+        <w:tc>
+          <w:tcPr>
+            <w:tcW w:type="dxa" w:w="2268"/>
+            <w:vAlign w:val="center"/>
+          </w:tcPr>
+          <w:p>
+            <w:pPr>
+              <w:spacing w:after="0"/>
+            </w:pPr>
+            <w:r/>
+            <w:r>
+              <w:rPr>
+                <w:b w:val="0"/>
+                <w:sz w:val="17"/>
+              </w:rPr>
+              <w:t>133,424</w:t>
+            </w:r>
+          </w:p>
+        </w:tc>
+        <w:tc>
+          <w:tcPr>
+            <w:tcW w:type="dxa" w:w="1701"/>
+            <w:vAlign w:val="center"/>
+          </w:tcPr>
+          <w:p>
+            <w:pPr>
+              <w:spacing w:after="0"/>
+            </w:pPr>
+            <w:r/>
+            <w:r>
+              <w:rPr>
+                <w:b w:val="0"/>
+                <w:sz w:val="17"/>
+              </w:rPr>
+              <w:t>0</w:t>
+            </w:r>
+          </w:p>
+        </w:tc>
+      </w:tr>
+    </w:tbl>
+    <w:p>
+      <w:pPr>
+        <w:spacing w:after="0"/>
+      </w:pPr>
+    </w:p>
+    <w:p>
       <w:pPr>
         <w:pStyle w:val="Heading1"/>
       </w:pPr>
@@ -2118,10 +4002,10 @@
     </w:p>
     <w:p>
       <w:pPr>
-        <w:spacing w:line="269" w:lineRule="auto" w:after="100"/>
+        <w:pStyle w:val="Heading2"/>
       </w:pPr>
       <w:r>
-        <w:t>PlantMR addresses a practical gap between generic MR estimators and plant data realities. The central contribution is an auditable analysis contract: an MR result is only interpretable together with the species, reference assembly, tissue, stage, environment, ploidy, instrument set, LD source and sample-overlap statement. The environment-slope model adds a narrow and transparent way to quantify effect heterogeneity without claiming the stronger identification properties of MR-GxE, MR-GENIUS or MR-EILLS.</w:t>
+        <w:t>Principal findings</w:t>
       </w:r>
     </w:p>
     <w:p>
@@ -2129,7 +4013,7 @@
         <w:spacing w:line="269" w:lineRule="auto" w:after="100"/>
       </w:pPr>
       <w:r>
-        <w:t>The simulations show that the estimator recovers a known slope under the stated covariance model and that LD misspecification can make inference anti-conservative. The directional-pleiotropy scenario shows why the intercept and slope must not be overinterpreted. These are implementation-level findings, not universal guarantees. Weak instruments, nonlinear environmental response, unequal sample sizes, missing environments, LD-panel mismatch and exact exposure–outcome covariance require additional benchmarks before a genome-wide biological application.</w:t>
+        <w:t>This study makes three separable contributions. First, PlantMR turns plant context into an explicit computational contract rather than an unstructured note. Species, assembly, tissue, stage, environmental score, ploidy, allele coding, LD source and overlap assumptions travel with the summary statistics. This matters because the same SNP-level beta and standard error can represent different estimands when the expression tissue, developmental stage or treatment changes. A method that ignores those fields may still return a numerical estimate, but it cannot establish that two estimates are comparable.</w:t>
       </w:r>
     </w:p>
     <w:p>
@@ -2137,7 +4021,7 @@
         <w:spacing w:line="269" w:lineRule="auto" w:after="100"/>
       </w:pPr>
       <w:r>
-        <w:t>The Arabidopsis analysis deliberately avoids a causal-gene claim. Existing Arabidopsis work has used SMR/HEIDI to prioritize AT1G11560 in an independent research context, but that external evidence is not counted as validation of this local PlantMR re-analysis.[19] The correct use of this case is to show how the software behaves on real plant inputs and how conclusions change when LD and environmental dependence are exposed.</w:t>
+        <w:t>Second, the environment-slope component provides a transparent estimand for a specific question: does the genetically proxied exposure–outcome effect change along a prespecified environmental scale? The slope is not a universal gene-by-environment causal parameter, and it is not a pleiotropy-correction intercept. Its value is that the design matrix, instrument grid and covariance assumptions are visible. The complete-grid rule is particularly important: if one environment has one set of instruments and another environment has a different set, a difference in ratio estimates can be produced by instrument composition rather than biological effect modification.</w:t>
       </w:r>
     </w:p>
     <w:p>
@@ -2145,7 +4029,246 @@
         <w:spacing w:line="269" w:lineRule="auto" w:after="100"/>
       </w:pPr>
       <w:r>
-        <w:t>PlantMR therefore should be submitted first as a plant methods/software article. A biological application paper would require formal mixed-model summary statistics, an appropriate sample-overlap covariance model, independent population or environment replication, colocalization or HEIDI/fine-mapping evidence and functional validation.</w:t>
+        <w:t>Third, the calibration results identify covariance specification as an inferential, not cosmetic, choice. Under the stated simulation truth, both correct and diagonal covariance models produced similar point estimates. The independence approximation nevertheless reduced standard errors and caused anti-conservative rejection in the LD stress null scenario (0.126 rather than 0.044), with coverage falling to 0.874. This pattern is precisely the type of failure that can be missed when a method is evaluated only by bias or point-estimate correlation. The results support a reporting rule: when SNP or environment dependence is known or plausible, the covariance source must be declared and a diagonal analysis should be presented as sensitivity, not as the default truth.</w:t>
+      </w:r>
+    </w:p>
+    <w:p>
+      <w:pPr>
+        <w:pStyle w:val="Heading2"/>
+      </w:pPr>
+      <w:r>
+        <w:t>Relationship to previous MR and plant methods</w:t>
+      </w:r>
+    </w:p>
+    <w:p>
+      <w:pPr>
+        <w:spacing w:line="269" w:lineRule="auto" w:after="100"/>
+      </w:pPr>
+      <w:r>
+        <w:t>PlantMR should be interpreted alongside, not as a replacement for, established MR methods. IVW, MR-Egger, robust or median estimators, pleiotropy diagnostics, colocalization and fine-mapping address different threats and answer different questions.[3–12,28] The current implementation includes a limited set of standard estimators to provide a common audit trail, but it does not claim that one estimator solves invalid instruments. In particular, the large Q statistic and non-zero Egger intercepts in the Arabidopsis case show that the dataset contains unresolved heterogeneity and possible pleiotropy.</w:t>
+      </w:r>
+    </w:p>
+    <w:p>
+      <w:pPr>
+        <w:spacing w:line="269" w:lineRule="auto" w:after="100"/>
+      </w:pPr>
+      <w:r>
+        <w:t>The distinction from MR-GxE is substantive. MR-GxE was developed to use gene-by-covariate interactions in the instrument–exposure association to detect or correct bias under assumptions about pleiotropy.[14] Interaction-based MR and MR-GENIUS use a different identification logic and have their own requirements for interaction strength and heterogeneity.[15] MR-EILLS targets an invariant causal effect across heterogeneous GWAS summaries and is not equivalent to fitting an environment score to two ratio estimates.[16] PlantMR instead supplies a plant-focused data contract and estimates effect heterogeneity along an observed environmental scale. It should not be marketed as a novel general interaction-MR theory or as an implementation of those methods.</w:t>
+      </w:r>
+    </w:p>
+    <w:p>
+      <w:pPr>
+        <w:spacing w:line="269" w:lineRule="auto" w:after="100"/>
+      </w:pPr>
+      <w:r>
+        <w:t>The distinction from plant-oriented software is also deliberate. MRBIGR integrates population-scale multi-omics analysis in maize and is a relevant comparator for software breadth.[17] The present work is narrower in biological scope but more explicit about the summary-statistics contract, signed LD, environmental covariance, complete SNP-by-environment grids and rank-aware Q degrees of freedom. The aim is not to win a feature-count comparison. It is to make a plant MR run inspectable, rerunnable and difficult to misinterpret.</w:t>
+      </w:r>
+    </w:p>
+    <w:p>
+      <w:pPr>
+        <w:pStyle w:val="Heading2"/>
+      </w:pPr>
+      <w:r>
+        <w:t>Why LD, environmental dependence and rank matter</w:t>
+      </w:r>
+    </w:p>
+    <w:p>
+      <w:pPr>
+        <w:spacing w:line="269" w:lineRule="auto" w:after="100"/>
+      </w:pPr>
+      <w:r>
+        <w:t>Plant panels often contain related accessions, local haplotypes and uneven LD. The covariance of ratio estimates therefore cannot be assumed to be diagonal merely because the input file has one row per SNP. The same issue occurs across environments when the same accessions are phenotyped repeatedly, when trials share controls or when environmental conditions are derived from related measurements. Treating these observations as independent typically affects the standard errors and heterogeneity statistic more directly than the point estimate.</w:t>
+      </w:r>
+    </w:p>
+    <w:p>
+      <w:pPr>
+        <w:spacing w:line="269" w:lineRule="auto" w:after="100"/>
+      </w:pPr>
+      <w:r>
+        <w:t>The rank-aware Q calculation is a practical safeguard for singular or nearly singular covariance matrices. With 48 retained SNPs and two environments, the case had 96 ratio observations but a covariance rank of 62. Using 94 or 95 degrees of freedom would overstate the independent information. PlantMR therefore reports rank(V)−rank(X), which was 60 in the primary case. This is not a guarantee that the covariance matrix is correctly specified; it is a guarantee that the reported degrees of freedom are at least aligned with the supplied matrix rank. A future implementation should add condition-number diagnostics, positive-semidefinite repair logs and sensitivity to alternative LD panels.</w:t>
+      </w:r>
+    </w:p>
+    <w:p>
+      <w:pPr>
+        <w:spacing w:line="269" w:lineRule="auto" w:after="100"/>
+      </w:pPr>
+      <w:r>
+        <w:t>The stress benchmark also illustrates a useful distinction between calibration and power. Under a true slope of 0.25, both covariance choices had power 1.00, so a power-only comparison would have judged them equivalent. Under the null, the diagonal model failed calibration. For software papers, this argues for reporting null rejection, confidence coverage, bias, RMSE and standard-error behavior together, rather than reporting only the ability to detect a large simulated effect.</w:t>
+      </w:r>
+    </w:p>
+    <w:p>
+      <w:pPr>
+        <w:pStyle w:val="Heading2"/>
+      </w:pPr>
+      <w:r>
+        <w:t>Interpretation of the Arabidopsis case</w:t>
+      </w:r>
+    </w:p>
+    <w:p>
+      <w:pPr>
+        <w:spacing w:line="269" w:lineRule="auto" w:after="100"/>
+      </w:pPr>
+      <w:r>
+        <w:t>The Arabidopsis case is intentionally a stress test of the data contract. The raw local region contained a complete two-environment grid, three ambiguous palindromic variants were removed per environment, and 48 SNPs passed the final complete-grid instrument filters. The environment-stratified fixed IVW estimates were positive at both temperatures but differed in magnitude, while heterogeneity Q statistics were significant. The covariance-aware slope estimate was negative but imprecise and not statistically distinguishable from zero. The phenotype-correlation proxy changed the point estimate and standard error, but it is not a measured covariance of the exposure and outcome GWAS estimates.</w:t>
+      </w:r>
+    </w:p>
+    <w:p>
+      <w:pPr>
+        <w:spacing w:line="269" w:lineRule="auto" w:after="100"/>
+      </w:pPr>
+      <w:r>
+        <w:t>These findings do not support a claim that AT1G11560 is a validated causal regulator of flowering time. The expression and outcome accessions overlap, the exact exposure–outcome sampling covariance is unavailable, the local association model is ordinary least squares rather than a mixed model and the exposure was a baseline expression proxy copied across the two outcome environments rather than an environment-specific eQTL. The strong residual heterogeneity and Egger intercept diagnostics further limit a simple causal interpretation. The appropriate conclusion is that the software can expose these problems and produce reproducible sensitivity results; the biological conclusion remains provisional.</w:t>
+      </w:r>
+    </w:p>
+    <w:p>
+      <w:pPr>
+        <w:spacing w:line="269" w:lineRule="auto" w:after="100"/>
+      </w:pPr>
+      <w:r>
+        <w:t>This conservative interpretation is a strength for a methods paper. A less cautious manuscript could quote the highly significant environment-specific IVW P values and call AT1G11560 causal, but that would ignore LD, pleiotropy, sample overlap, population structure and the difference between a local re-analysis and independent validation. PlantMR is designed to make that overstatement harder by placing warnings and provenance in the report itself.</w:t>
+      </w:r>
+    </w:p>
+    <w:p>
+      <w:pPr>
+        <w:pStyle w:val="Heading2"/>
+      </w:pPr>
+      <w:r>
+        <w:t>Implications for plant and crop research</w:t>
+      </w:r>
+    </w:p>
+    <w:p>
+      <w:pPr>
+        <w:spacing w:line="269" w:lineRule="auto" w:after="100"/>
+      </w:pPr>
+      <w:r>
+        <w:t>For natural-accession studies, the data contract should record the accession panel, geographic structure strategy, kinship or mixed-model method, reference assembly and the allele representation used to construct the LD matrix. For breeding panels and multi-environment trials, the environmental score should be defined before analysis and should represent a biologically interpretable contrast rather than a post hoc label. Temperature, drought severity, photoperiod and nutrient level may be continuous, but their measurement error and correlation across trials should be documented.</w:t>
+      </w:r>
+    </w:p>
+    <w:p>
+      <w:pPr>
+        <w:spacing w:line="269" w:lineRule="auto" w:after="100"/>
+      </w:pPr>
+      <w:r>
+        <w:t>For expression-mediated analyses, an eQTL association must be tied to tissue, developmental stage, treatment and expression normalization. A baseline eQTL should not be silently used to represent a stress-specific molecular exposure. When the biological question is mediation, colocalization, fine-mapping or HEIDI-type evidence is needed in addition to MR.[11,12,28] When the question is gene-by-environment interaction, the exposure association itself may need environment-specific modeling; the present environment-slope model should not be presented as a substitute.</w:t>
+      </w:r>
+    </w:p>
+    <w:p>
+      <w:pPr>
+        <w:spacing w:line="269" w:lineRule="auto" w:after="100"/>
+      </w:pPr>
+      <w:r>
+        <w:t>For polyploid crops, dosage, homoeolog assignment and subgenome-specific LD are unresolved extensions rather than hidden defaults. Similarly, presence/absence variants and structural variants require explicit encoding and allele-frequency definitions. Keeping these features outside v1.1 is preferable to silently treating them as diploid SNPs. The boundary is documented so that users can distinguish a software limitation from a biological negative result.</w:t>
+      </w:r>
+    </w:p>
+    <w:p>
+      <w:pPr>
+        <w:pStyle w:val="Heading2"/>
+      </w:pPr>
+      <w:r>
+        <w:t>Limitations and threats to validity</w:t>
+      </w:r>
+    </w:p>
+    <w:p>
+      <w:pPr>
+        <w:pStyle w:val="ListNumber"/>
+        <w:spacing w:after="40"/>
+      </w:pPr>
+      <w:r>
+        <w:t>The real case is not independent causal validation. It uses public processed data, overlapping accessions and a local OLS model. It demonstrates execution and diagnostics only.</w:t>
+      </w:r>
+    </w:p>
+    <w:p>
+      <w:pPr>
+        <w:pStyle w:val="ListNumber"/>
+        <w:spacing w:after="40"/>
+      </w:pPr>
+      <w:r>
+        <w:t>The exact covariance of exposure and outcome summary statistics is not available. The environment-correlation sensitivity uses a phenotype correlation proxy and therefore cannot be treated as a formal sample-overlap correction.</w:t>
+      </w:r>
+    </w:p>
+    <w:p>
+      <w:pPr>
+        <w:pStyle w:val="ListNumber"/>
+        <w:spacing w:after="40"/>
+      </w:pPr>
+      <w:r>
+        <w:t>Only two outcome environments are used in the case. A two-point slope is a contrast along a prespecified scale; it cannot establish linearity, a threshold, or a general response curve.</w:t>
+      </w:r>
+    </w:p>
+    <w:p>
+      <w:pPr>
+        <w:pStyle w:val="ListNumber"/>
+        <w:spacing w:after="40"/>
+      </w:pPr>
+      <w:r>
+        <w:t>The directional-pleiotropy simulation uses one structured scenario. It does not cover balanced pleiotropy, correlated pleiotropy, weak instruments, nonlinear effects, measurement error in the environmental score, winner’s curse or population-stratified LD mismatch.</w:t>
+      </w:r>
+    </w:p>
+    <w:p>
+      <w:pPr>
+        <w:pStyle w:val="ListNumber"/>
+        <w:spacing w:after="40"/>
+      </w:pPr>
+      <w:r>
+        <w:t>The current implementation accepts supplied signed correlation matrices but does not estimate a causal LD panel, repair every possible non-positive-semidefinite input or model polyploid dosage and structural variation.</w:t>
+      </w:r>
+    </w:p>
+    <w:p>
+      <w:pPr>
+        <w:pStyle w:val="ListNumber"/>
+        <w:spacing w:after="40"/>
+      </w:pPr>
+      <w:r>
+        <w:t>Formal head-to-head implementations of MR-GxE, MR-GENIUS and MR-EILLS are not included in v1.1.0. Literature comparisons are conceptual and not benchmark claims.</w:t>
+      </w:r>
+    </w:p>
+    <w:p>
+      <w:pPr>
+        <w:pStyle w:val="ListNumber"/>
+        <w:spacing w:after="40"/>
+      </w:pPr>
+      <w:r>
+        <w:t>The source package is reproducible locally but a public repository, DOI, clean-environment rerun and independent validation are still required for a final software publication record.</w:t>
+      </w:r>
+    </w:p>
+    <w:p>
+      <w:pPr>
+        <w:pStyle w:val="Heading2"/>
+      </w:pPr>
+      <w:r>
+        <w:t>Recommended validation ladder and future work</w:t>
+      </w:r>
+    </w:p>
+    <w:p>
+      <w:pPr>
+        <w:spacing w:line="269" w:lineRule="auto" w:after="100"/>
+      </w:pPr>
+      <w:r>
+        <w:t>A credible next-stage biological application should proceed in layers. First, rerun the same exposure and outcome in non-overlapping accessions and estimate the exposure–outcome covariance under the actual GWAS design. Second, reproduce association statistics with a kinship-aware mixed model and use the matching LD panel. Third, compare PlantMR with formal colocalization/HEIDI and with a prespecified set of external interaction-MR methods under identical instruments, environments and outcome scales. Fourth, validate the direction and magnitude in an independent population or environment. Fifth, test a small number of genes with functional perturbation or expression validation before making pathway-level claims.</w:t>
+      </w:r>
+    </w:p>
+    <w:p>
+      <w:pPr>
+        <w:spacing w:line="269" w:lineRule="auto" w:after="100"/>
+      </w:pPr>
+      <w:r>
+        <w:t>Software development should add condition-number and positive-semidefinite diagnostics, sample-overlap covariance interfaces, weak-instrument sensitivity, nonlinear environmental bases, multi-environment mixed-model importers, and explicit polyploid/SV schemas. Every extension should be accompanied by null calibration, misspecification stress tests and a negative-control scenario. The current v1.1.0 boundary is therefore a stable foundation for a broader platform, not a claim that the plant MR problem is solved.</w:t>
+      </w:r>
+    </w:p>
+    <w:p>
+      <w:pPr>
+        <w:pStyle w:val="Heading2"/>
+      </w:pPr>
+      <w:r>
+        <w:t>Overall conclusion</w:t>
+      </w:r>
+    </w:p>
+    <w:p>
+      <w:pPr>
+        <w:spacing w:line="269" w:lineRule="auto" w:after="100"/>
+      </w:pPr>
+      <w:r>
+        <w:t>PlantMR is a reproducible plant-focused implementation for auditable summary-statistics MR and a narrowly defined environment-effect-heterogeneity analysis. Its strongest evidence is software-level: explicit provenance, complete-grid selection, covariance-aware GLS, rank-aware heterogeneity reporting, calibrated simulations and a real-data contract that preserves limitations. The evidence does not support calling AT1G11560 a causal gene or calling PlantMR the first plant environment-interaction MR method. A Plant Methods software submission is defensible after adding a public repository/DOI, clean-environment verification and completed author declarations; a biological discovery claim would require a substantially stronger validation program.</w:t>
       </w:r>
     </w:p>
     <w:p>
@@ -2265,7 +4388,7 @@
         <w:spacing w:line="269" w:lineRule="auto" w:after="100"/>
       </w:pPr>
       <w:r>
-        <w:t>All numerical results are reported with effect estimates, standard errors, P values, instrument counts, covariance source and heterogeneity diagnostics. No genome-wide multiple-testing claim is made for the single-gene Arabidopsis demonstration. Any future genome-wide run must prespecify gene-level aggregation, multiple-testing control and an independent validation set.</w:t>
+        <w:t>All numerical results are reported with effect estimates, standard errors, P values, instrument counts, covariance source and heterogeneity diagnostics, following the reporting principles of STROBE-MR.[13] No genome-wide multiple-testing claim is made for the single-gene Arabidopsis demonstration. Any future genome-wide run must prespecify gene-level aggregation, multiple-testing control and an independent validation set.</w:t>
       </w:r>
     </w:p>
     <w:p>
@@ -2684,7 +4807,7 @@
         <w:rPr>
           <w:sz w:val="17"/>
         </w:rPr>
-        <w:t>6. Hartwig, F. P., Davey Smith, G. &amp; Bowden, J. Robust inference in summary data Mendelian randomization via the zero modal pleiotropy assumption. Int. J. Epidemiol. 46, 1985–1998 (2017). https://doi.org/10.1093/ije/dyx233</w:t>
+        <w:t>6. Hartwig, F. P., Davey Smith, G. &amp; Bowden, J. Robust inference in summary data Mendelian randomization via the zero modal pleiotropy assumption. Int. J. Epidemiol. 46, 1985–1998 (2017). https://doi.org/10.1093/ije/dyx102</w:t>
       </w:r>
     </w:p>
     <w:p>
@@ -2756,7 +4879,7 @@
         <w:rPr>
           <w:sz w:val="17"/>
         </w:rPr>
-        <w:t>12. Zhu, Z. et al. Causal associations between risk factors and common diseases inferred from GWAS summary data. Nat. Commun. 9, 2242 (2018). https://doi.org/10.1038/s41467-018-03940-5</w:t>
+        <w:t>12. Zhu, Z. et al. Causal associations between risk factors and common diseases inferred from GWAS summary data. Nat. Commun. 9, 224 (2018). https://doi.org/10.1038/s41467-017-02317-2</w:t>
       </w:r>
     </w:p>
     <w:p>
@@ -2780,7 +4903,7 @@
         <w:rPr>
           <w:sz w:val="17"/>
         </w:rPr>
-        <w:t>14. Spiller, W. et al. Detecting and correcting for bias in Mendelian randomization analyses using Gene-by-Environment interactions. Int. J. Epidemiol. (2018). https://doi.org/10.1093/ije/dyy204</w:t>
+        <w:t>14. Spiller, W. et al. Detecting and correcting for bias in Mendelian randomization analyses using Gene-by-Environment interactions. Int. J. Epidemiol. 48, 702–712 (2019). https://doi.org/10.1093/ije/dyy204</w:t>
       </w:r>
     </w:p>
     <w:p>
@@ -2816,7 +4939,7 @@
         <w:rPr>
           <w:sz w:val="17"/>
         </w:rPr>
-        <w:t>17. Xu, F. et al. MRBIGR: a versatile toolbox for genetic regulation inference from population-scale multi-omics data. Plant Commun. (2024). https://doi.org/10.1016/j.xplc.2024.101197</w:t>
+        <w:t>17. Xu, F. et al. MRBIGR: a versatile toolbox for genetic regulation inference from population-scale multi-omics data. Plant Commun. 6, 101197 (2025). https://doi.org/10.1016/j.xplc.2024.101197</w:t>
       </w:r>
     </w:p>
     <w:p>
@@ -2960,7 +5083,7 @@
         <w:rPr>
           <w:sz w:val="17"/>
         </w:rPr>
-        <w:t>29. Nature Portfolio. Guidelines for authors submitting code and software. https://media.nature.com/full/nature-cms/documents/GuidelinesCodePublication.pdf</w:t>
+        <w:t>29. Price, A. L. et al. Principal components analysis corrects for stratification in genome-wide association studies. Nat. Genet. 38, 904–909 (2006). https://doi.org/10.1038/ng1847</w:t>
       </w:r>
     </w:p>
     <w:p>
@@ -2972,7 +5095,7 @@
         <w:rPr>
           <w:sz w:val="17"/>
         </w:rPr>
-        <w:t>30. Nature Portfolio. Guidance on reproducibility for papers using computational tools. https://www.nature.com/documents/Computational_tools_reporting_guidelines.pdf</w:t>
+        <w:t>30. Kang, H. M. et al. Efficient control of population structure in model organism association mapping. Genetics 178, 1709–1723 (2008). https://doi.org/10.1534/genetics.107.080101</w:t>
       </w:r>
     </w:p>
     <w:p>
@@ -2984,7 +5107,7 @@
         <w:rPr>
           <w:sz w:val="17"/>
         </w:rPr>
-        <w:t>31. Plant Methods. Aims and scope and software-article criteria. https://plantmethods.biomedcentral.com/about</w:t>
+        <w:t>31. Zhou, X. &amp; Stephens, M. Genome-wide efficient mixed-model analysis for association studies. Nat. Genet. 44, 821–824 (2012). https://doi.org/10.1038/ng.2310</w:t>
       </w:r>
     </w:p>
     <w:p>
@@ -2996,7 +5119,7 @@
         <w:rPr>
           <w:sz w:val="17"/>
         </w:rPr>
-        <w:t>32. BMC Bioinformatics. Software article submission guidelines. https://link.springer.com/journal/12859/submission-guidelines/software-article</w:t>
+        <w:t>32. Lipka, A. E. et al. GAPIT: genome association and prediction integrated tool. Bioinformatics 28, 2397–2399 (2012). https://doi.org/10.1093/bioinformatics/bts444</w:t>
       </w:r>
     </w:p>
     <w:p>
@@ -3008,7 +5131,7 @@
         <w:rPr>
           <w:sz w:val="17"/>
         </w:rPr>
-        <w:t>33. GigaScience. Open science journal: aims and research-object policy. https://academic.oup.com/gigascience/pages/About</w:t>
+        <w:t>33. Purcell, S. et al. PLINK: a tool set for whole-genome association and population-based linkage analyses. Am. J. Hum. Genet. 81, 559–575 (2007). https://doi.org/10.1086/519795</w:t>
       </w:r>
     </w:p>
     <w:p>
@@ -3020,7 +5143,7 @@
         <w:rPr>
           <w:sz w:val="17"/>
         </w:rPr>
-        <w:t>34. PLOS Computational Biology. Journal information and software/code-availability policies. https://journals.plos.org/ploscompbiol/s/journal-information</w:t>
+        <w:t>34. Chang, C. C. et al. Second-generation PLINK: rising to the challenge of larger and richer datasets. GigaScience 4, 7 (2015). https://doi.org/10.1186/s13742-015-0047-8</w:t>
       </w:r>
     </w:p>
     <w:p>
@@ -3032,7 +5155,7 @@
         <w:rPr>
           <w:sz w:val="17"/>
         </w:rPr>
-        <w:t>35. PLOS Computational Biology. Code availability policy. https://journals.plos.org/ploscompbiol/s/code-availability</w:t>
+        <w:t>35. Kang, M. et al. The pan-genome and local adaptation of Arabidopsis thaliana. Nat. Commun. 14, 6259 (2023). https://doi.org/10.1038/s41467-023-42029-4</w:t>
       </w:r>
     </w:p>
     <w:p>

</xml_diff>

<commit_message>
paper: align manuscript with Plant Methods software article structure
</commit_message>
<xml_diff>
--- a/docs/PlantMR_submission_manuscript.docx
+++ b/docs/PlantMR_submission_manuscript.docx
@@ -93,10 +93,50 @@
     </w:p>
     <w:p>
       <w:pPr>
+        <w:pStyle w:val="Heading2"/>
+      </w:pPr>
+      <w:r>
+        <w:t>Background</w:t>
+      </w:r>
+    </w:p>
+    <w:p>
+      <w:pPr>
         <w:spacing w:line="269" w:lineRule="auto" w:after="100"/>
       </w:pPr>
       <w:r>
-        <w:t>Plant Mendelian randomization (MR) analyses can connect molecular traits to agronomic phenotypes, but plant reference assemblies, environmental strata, linkage disequilibrium (LD) and sample overlap are often left implicit. We developed PlantMR 1.1, an open-source local toolkit with a plant summary-statistics schema, allele harmonization, instrument quality control, signed LD handling, standard MR estimators and a narrowly defined environment-slope analysis. The environment-slope estimator models SNP-by-environment ratio estimates by generalized least squares, accepts signed environment and SNP-LD correlation matrices, requires a complete SNP-by-environment grid and reports covariance rank. In 500-replicate simulations with environmental correlation, the covariance-aware estimator had a null rejection rate of 0.054 and 95% coverage of 0.946; under a true slope of 0.25, its mean estimate was 0.2498, bias −0.00018, coverage 0.952 and power 1.00. In an additional LD stress test with AR(1) LD correlation rho=0.6, correct covariance modeling gave a null rejection rate of 0.044 and coverage of 0.956, whereas an independence approximation gave 0.126 and 0.874. Directional pleiotropy remained a limitation: the slope was approximately unbiased, but the pooled intercept was biased by 0.216. We executed an Arabidopsis data-contract case using AT1G11560 baseline expression, 1001 Genomes local genotypes and flowering-time phenotypes at 10°C and 16°C. Forty-eight LD-correlated instruments passed prespecified exposure thresholds. The primary LD-aware analysis estimated a slope of −0.0371 (SE 0.1562, P=0.812), with residual heterogeneity (Q=192.89, df=60, P=7.33×10−16). This case demonstrates reproducibility and diagnostics, not independent causal validation. PlantMR is positioned as a plant-focused implementation and audit workflow, not as the first environment-interaction MR method.</w:t>
+        <w:t>Plant Mendelian randomization (MR) can connect molecular traits to agronomic phenotypes, but plant reference assemblies, environmental strata, linkage disequilibrium (LD) and sample overlap are often implicit. We developed PlantMR 1.1 as a local, open-source toolkit for auditable plant and crop summary-statistics MR with a narrowly defined environment-effect-heterogeneity analysis.</w:t>
+      </w:r>
+    </w:p>
+    <w:p>
+      <w:pPr>
+        <w:pStyle w:val="Heading2"/>
+      </w:pPr>
+      <w:r>
+        <w:t>Results</w:t>
+      </w:r>
+    </w:p>
+    <w:p>
+      <w:pPr>
+        <w:spacing w:line="269" w:lineRule="auto" w:after="100"/>
+      </w:pPr>
+      <w:r>
+        <w:t>PlantMR validates plant metadata and summary statistics, harmonizes alleles, enforces complete SNP-by-environment instrument grids, accepts signed SNP-LD and environment-correlation matrices, and reports rank-aware heterogeneity diagnostics. In 500-replicate simulations, the covariance-aware estimator had a null rejection rate of 0.054 and 95% coverage of 0.946; for a true environment slope of 0.25, the mean estimate was 0.2498, bias −0.00018, coverage 0.952 and power 1.00. In an LD stress test with AR(1) LD correlation ρ=0.6, correct covariance modeling gave rejection 0.044 and coverage 0.956, whereas an independence approximation gave 0.126 and 0.874. A real Arabidopsis data-contract case retained 48 LD-correlated instruments for AT1G11560 and flowering time at 10°C and 16°C. The primary slope was −0.0371 (SE 0.1562, P=0.812), with residual heterogeneity Q=192.89, df=60, P=7.33×10−16.</w:t>
+      </w:r>
+    </w:p>
+    <w:p>
+      <w:pPr>
+        <w:pStyle w:val="Heading2"/>
+      </w:pPr>
+      <w:r>
+        <w:t>Conclusions</w:t>
+      </w:r>
+    </w:p>
+    <w:p>
+      <w:pPr>
+        <w:spacing w:line="269" w:lineRule="auto" w:after="100"/>
+      </w:pPr>
+      <w:r>
+        <w:t>PlantMR provides a reproducible plant-focused implementation and audit workflow. The simulations support covariance-aware calibration under the tested scenarios, but the Arabidopsis case is a software demonstration rather than independent causal validation. PlantMR does not replace colocalization, formal interaction-MR methods, mixed-model GWAS or functional validation.</w:t>
       </w:r>
     </w:p>
     <w:p>
@@ -112,7 +152,7 @@
         <w:pStyle w:val="Heading1"/>
       </w:pPr>
       <w:r>
-        <w:t>Introduction</w:t>
+        <w:t>Background</w:t>
       </w:r>
     </w:p>
     <w:p>
@@ -152,7 +192,7 @@
         <w:pStyle w:val="Heading1"/>
       </w:pPr>
       <w:r>
-        <w:t>Results</w:t>
+        <w:t>Implementation</w:t>
       </w:r>
     </w:p>
     <w:p>
@@ -702,6 +742,652 @@
         <w:pStyle w:val="Heading2"/>
       </w:pPr>
       <w:r>
+        <w:t>Comparison with related tools</w:t>
+      </w:r>
+    </w:p>
+    <w:p>
+      <w:pPr>
+        <w:spacing w:line="269" w:lineRule="auto" w:after="100"/>
+      </w:pPr>
+      <w:r>
+        <w:t>Following the structure used in recent Plant Methods software articles, we compare PlantMR with functionally adjacent tools before presenting the benchmarks. This is a scope and contract comparison based on the cited software papers and public documentation, not a fabricated head-to-head runtime experiment. PlantMR’s distinct target is the combination of plant metadata, complete SNP-by-environment grids, signed LD/environment covariance and auditable summary-statistics outputs.</w:t>
+      </w:r>
+    </w:p>
+    <w:p>
+      <w:pPr>
+        <w:spacing w:line="269" w:lineRule="auto" w:after="40"/>
+      </w:pPr>
+      <w:r>
+        <w:t>Table 2. Functional positioning against related tools. “Not the primary focus” means that a tool may support a related analysis but does not expose the same contract or estimand.</w:t>
+      </w:r>
+    </w:p>
+    <w:tbl>
+      <w:tblPr>
+        <w:tblStyle w:val="TableGrid"/>
+        <w:tblW w:type="auto" w:w="0"/>
+        <w:jc w:val="center"/>
+        <w:tblLook w:firstColumn="1" w:firstRow="1" w:lastColumn="0" w:lastRow="0" w:noHBand="0" w:noVBand="1" w:val="04A0"/>
+      </w:tblPr>
+      <w:tblGrid>
+        <w:gridCol w:w="1994"/>
+        <w:gridCol w:w="1994"/>
+        <w:gridCol w:w="1994"/>
+        <w:gridCol w:w="1994"/>
+        <w:gridCol w:w="1994"/>
+      </w:tblGrid>
+      <w:tr>
+        <w:tc>
+          <w:tcPr>
+            <w:tcW w:type="dxa" w:w="1474"/>
+            <w:vAlign w:val="center"/>
+            <w:shd w:fill="17365D"/>
+          </w:tcPr>
+          <w:p>
+            <w:pPr>
+              <w:spacing w:after="0"/>
+            </w:pPr>
+            <w:r/>
+            <w:r>
+              <w:rPr>
+                <w:b/>
+                <w:color w:val="FFFFFF"/>
+                <w:sz w:val="14"/>
+              </w:rPr>
+              <w:t>Tool</w:t>
+            </w:r>
+          </w:p>
+        </w:tc>
+        <w:tc>
+          <w:tcPr>
+            <w:tcW w:type="dxa" w:w="2324"/>
+            <w:vAlign w:val="center"/>
+            <w:shd w:fill="17365D"/>
+          </w:tcPr>
+          <w:p>
+            <w:pPr>
+              <w:spacing w:after="0"/>
+            </w:pPr>
+            <w:r/>
+            <w:r>
+              <w:rPr>
+                <w:b/>
+                <w:color w:val="FFFFFF"/>
+                <w:sz w:val="14"/>
+              </w:rPr>
+              <w:t>Primary scope</w:t>
+            </w:r>
+          </w:p>
+        </w:tc>
+        <w:tc>
+          <w:tcPr>
+            <w:tcW w:type="dxa" w:w="2381"/>
+            <w:vAlign w:val="center"/>
+            <w:shd w:fill="17365D"/>
+          </w:tcPr>
+          <w:p>
+            <w:pPr>
+              <w:spacing w:after="0"/>
+            </w:pPr>
+            <w:r/>
+            <w:r>
+              <w:rPr>
+                <w:b/>
+                <w:color w:val="FFFFFF"/>
+                <w:sz w:val="14"/>
+              </w:rPr>
+              <w:t>Plant context</w:t>
+            </w:r>
+          </w:p>
+        </w:tc>
+        <w:tc>
+          <w:tcPr>
+            <w:tcW w:type="dxa" w:w="2721"/>
+            <w:vAlign w:val="center"/>
+            <w:shd w:fill="17365D"/>
+          </w:tcPr>
+          <w:p>
+            <w:pPr>
+              <w:spacing w:after="0"/>
+            </w:pPr>
+            <w:r/>
+            <w:r>
+              <w:rPr>
+                <w:b/>
+                <w:color w:val="FFFFFF"/>
+                <w:sz w:val="14"/>
+              </w:rPr>
+              <w:t>Environment / LD handling</w:t>
+            </w:r>
+          </w:p>
+        </w:tc>
+        <w:tc>
+          <w:tcPr>
+            <w:tcW w:type="dxa" w:w="1871"/>
+            <w:vAlign w:val="center"/>
+            <w:shd w:fill="17365D"/>
+          </w:tcPr>
+          <w:p>
+            <w:pPr>
+              <w:spacing w:after="0"/>
+            </w:pPr>
+            <w:r/>
+            <w:r>
+              <w:rPr>
+                <w:b/>
+                <w:color w:val="FFFFFF"/>
+                <w:sz w:val="14"/>
+              </w:rPr>
+              <w:t>Evidence used here</w:t>
+            </w:r>
+          </w:p>
+        </w:tc>
+      </w:tr>
+      <w:tr>
+        <w:tc>
+          <w:tcPr>
+            <w:tcW w:type="dxa" w:w="1474"/>
+            <w:vAlign w:val="center"/>
+          </w:tcPr>
+          <w:p>
+            <w:pPr>
+              <w:spacing w:after="0"/>
+            </w:pPr>
+            <w:r/>
+            <w:r>
+              <w:rPr>
+                <w:b w:val="0"/>
+                <w:sz w:val="14"/>
+              </w:rPr>
+              <w:t>PlantMR 1.1</w:t>
+            </w:r>
+          </w:p>
+        </w:tc>
+        <w:tc>
+          <w:tcPr>
+            <w:tcW w:type="dxa" w:w="2324"/>
+            <w:vAlign w:val="center"/>
+          </w:tcPr>
+          <w:p>
+            <w:pPr>
+              <w:spacing w:after="0"/>
+            </w:pPr>
+            <w:r/>
+            <w:r>
+              <w:rPr>
+                <w:b w:val="0"/>
+                <w:sz w:val="14"/>
+              </w:rPr>
+              <w:t>Plant summary-statistics MR and environment-effect heterogeneity</w:t>
+            </w:r>
+          </w:p>
+        </w:tc>
+        <w:tc>
+          <w:tcPr>
+            <w:tcW w:type="dxa" w:w="2381"/>
+            <w:vAlign w:val="center"/>
+          </w:tcPr>
+          <w:p>
+            <w:pPr>
+              <w:spacing w:after="0"/>
+            </w:pPr>
+            <w:r/>
+            <w:r>
+              <w:rPr>
+                <w:b w:val="0"/>
+                <w:sz w:val="14"/>
+              </w:rPr>
+              <w:t>Native metadata, assembly, tissue, stage, ploidy and LD provenance</w:t>
+            </w:r>
+          </w:p>
+        </w:tc>
+        <w:tc>
+          <w:tcPr>
+            <w:tcW w:type="dxa" w:w="2721"/>
+            <w:vAlign w:val="center"/>
+          </w:tcPr>
+          <w:p>
+            <w:pPr>
+              <w:spacing w:after="0"/>
+            </w:pPr>
+            <w:r/>
+            <w:r>
+              <w:rPr>
+                <w:b w:val="0"/>
+                <w:sz w:val="14"/>
+              </w:rPr>
+              <w:t>Signed LD and optional environment covariance; complete grid required</w:t>
+            </w:r>
+          </w:p>
+        </w:tc>
+        <w:tc>
+          <w:tcPr>
+            <w:tcW w:type="dxa" w:w="1871"/>
+            <w:vAlign w:val="center"/>
+          </w:tcPr>
+          <w:p>
+            <w:pPr>
+              <w:spacing w:after="0"/>
+            </w:pPr>
+            <w:r/>
+            <w:r>
+              <w:rPr>
+                <w:b w:val="0"/>
+                <w:sz w:val="14"/>
+              </w:rPr>
+              <w:t>Simulations, LD stress and Arabidopsis case</w:t>
+            </w:r>
+          </w:p>
+        </w:tc>
+      </w:tr>
+      <w:tr>
+        <w:tc>
+          <w:tcPr>
+            <w:tcW w:type="dxa" w:w="1474"/>
+            <w:vAlign w:val="center"/>
+            <w:shd w:fill="F4F6F8"/>
+          </w:tcPr>
+          <w:p>
+            <w:pPr>
+              <w:spacing w:after="0"/>
+            </w:pPr>
+            <w:r/>
+            <w:r>
+              <w:rPr>
+                <w:b w:val="0"/>
+                <w:sz w:val="14"/>
+              </w:rPr>
+              <w:t>MRBIGR [17]</w:t>
+            </w:r>
+          </w:p>
+        </w:tc>
+        <w:tc>
+          <w:tcPr>
+            <w:tcW w:type="dxa" w:w="2324"/>
+            <w:vAlign w:val="center"/>
+            <w:shd w:fill="F4F6F8"/>
+          </w:tcPr>
+          <w:p>
+            <w:pPr>
+              <w:spacing w:after="0"/>
+            </w:pPr>
+            <w:r/>
+            <w:r>
+              <w:rPr>
+                <w:b w:val="0"/>
+                <w:sz w:val="14"/>
+              </w:rPr>
+              <w:t>Population-scale multi-omics, GWAS and MR toolbox</w:t>
+            </w:r>
+          </w:p>
+        </w:tc>
+        <w:tc>
+          <w:tcPr>
+            <w:tcW w:type="dxa" w:w="2381"/>
+            <w:vAlign w:val="center"/>
+            <w:shd w:fill="F4F6F8"/>
+          </w:tcPr>
+          <w:p>
+            <w:pPr>
+              <w:spacing w:after="0"/>
+            </w:pPr>
+            <w:r/>
+            <w:r>
+              <w:rPr>
+                <w:b w:val="0"/>
+                <w:sz w:val="14"/>
+              </w:rPr>
+              <w:t>Maize and rice case studies; broad multi-omics workflow</w:t>
+            </w:r>
+          </w:p>
+        </w:tc>
+        <w:tc>
+          <w:tcPr>
+            <w:tcW w:type="dxa" w:w="2721"/>
+            <w:vAlign w:val="center"/>
+            <w:shd w:fill="F4F6F8"/>
+          </w:tcPr>
+          <w:p>
+            <w:pPr>
+              <w:spacing w:after="0"/>
+            </w:pPr>
+            <w:r/>
+            <w:r>
+              <w:rPr>
+                <w:b w:val="0"/>
+                <w:sz w:val="14"/>
+              </w:rPr>
+              <w:t>Different MR/network estimands; not the present G×E covariance contract</w:t>
+            </w:r>
+          </w:p>
+        </w:tc>
+        <w:tc>
+          <w:tcPr>
+            <w:tcW w:type="dxa" w:w="1871"/>
+            <w:vAlign w:val="center"/>
+            <w:shd w:fill="F4F6F8"/>
+          </w:tcPr>
+          <w:p>
+            <w:pPr>
+              <w:spacing w:after="0"/>
+            </w:pPr>
+            <w:r/>
+            <w:r>
+              <w:rPr>
+                <w:b w:val="0"/>
+                <w:sz w:val="14"/>
+              </w:rPr>
+              <w:t>Literature scope comparison</w:t>
+            </w:r>
+          </w:p>
+        </w:tc>
+      </w:tr>
+      <w:tr>
+        <w:tc>
+          <w:tcPr>
+            <w:tcW w:type="dxa" w:w="1474"/>
+            <w:vAlign w:val="center"/>
+          </w:tcPr>
+          <w:p>
+            <w:pPr>
+              <w:spacing w:after="0"/>
+            </w:pPr>
+            <w:r/>
+            <w:r>
+              <w:rPr>
+                <w:b w:val="0"/>
+                <w:sz w:val="14"/>
+              </w:rPr>
+              <w:t>MR-Base / TwoSampleMR [10]</w:t>
+            </w:r>
+          </w:p>
+        </w:tc>
+        <w:tc>
+          <w:tcPr>
+            <w:tcW w:type="dxa" w:w="2324"/>
+            <w:vAlign w:val="center"/>
+          </w:tcPr>
+          <w:p>
+            <w:pPr>
+              <w:spacing w:after="0"/>
+            </w:pPr>
+            <w:r/>
+            <w:r>
+              <w:rPr>
+                <w:b w:val="0"/>
+                <w:sz w:val="14"/>
+              </w:rPr>
+              <w:t>Human GWAS repository and two-sample MR automation</w:t>
+            </w:r>
+          </w:p>
+        </w:tc>
+        <w:tc>
+          <w:tcPr>
+            <w:tcW w:type="dxa" w:w="2381"/>
+            <w:vAlign w:val="center"/>
+          </w:tcPr>
+          <w:p>
+            <w:pPr>
+              <w:spacing w:after="0"/>
+            </w:pPr>
+            <w:r/>
+            <w:r>
+              <w:rPr>
+                <w:b w:val="0"/>
+                <w:sz w:val="14"/>
+              </w:rPr>
+              <w:t>Human-oriented public GWAS ecosystem</w:t>
+            </w:r>
+          </w:p>
+        </w:tc>
+        <w:tc>
+          <w:tcPr>
+            <w:tcW w:type="dxa" w:w="2721"/>
+            <w:vAlign w:val="center"/>
+          </w:tcPr>
+          <w:p>
+            <w:pPr>
+              <w:spacing w:after="0"/>
+            </w:pPr>
+            <w:r/>
+            <w:r>
+              <w:rPr>
+                <w:b w:val="0"/>
+                <w:sz w:val="14"/>
+              </w:rPr>
+              <w:t>Standard MR sensitivity analyses; plant metadata not the primary contract</w:t>
+            </w:r>
+          </w:p>
+        </w:tc>
+        <w:tc>
+          <w:tcPr>
+            <w:tcW w:type="dxa" w:w="1871"/>
+            <w:vAlign w:val="center"/>
+          </w:tcPr>
+          <w:p>
+            <w:pPr>
+              <w:spacing w:after="0"/>
+            </w:pPr>
+            <w:r/>
+            <w:r>
+              <w:rPr>
+                <w:b w:val="0"/>
+                <w:sz w:val="14"/>
+              </w:rPr>
+              <w:t>Literature scope comparison</w:t>
+            </w:r>
+          </w:p>
+        </w:tc>
+      </w:tr>
+      <w:tr>
+        <w:tc>
+          <w:tcPr>
+            <w:tcW w:type="dxa" w:w="1474"/>
+            <w:vAlign w:val="center"/>
+            <w:shd w:fill="F4F6F8"/>
+          </w:tcPr>
+          <w:p>
+            <w:pPr>
+              <w:spacing w:after="0"/>
+            </w:pPr>
+            <w:r/>
+            <w:r>
+              <w:rPr>
+                <w:b w:val="0"/>
+                <w:sz w:val="14"/>
+              </w:rPr>
+              <w:t>metaGE [25]</w:t>
+            </w:r>
+          </w:p>
+        </w:tc>
+        <w:tc>
+          <w:tcPr>
+            <w:tcW w:type="dxa" w:w="2324"/>
+            <w:vAlign w:val="center"/>
+            <w:shd w:fill="F4F6F8"/>
+          </w:tcPr>
+          <w:p>
+            <w:pPr>
+              <w:spacing w:after="0"/>
+            </w:pPr>
+            <w:r/>
+            <w:r>
+              <w:rPr>
+                <w:b w:val="0"/>
+                <w:sz w:val="14"/>
+              </w:rPr>
+              <w:t>Multi-environment GWAS meta-analysis</w:t>
+            </w:r>
+          </w:p>
+        </w:tc>
+        <w:tc>
+          <w:tcPr>
+            <w:tcW w:type="dxa" w:w="2381"/>
+            <w:vAlign w:val="center"/>
+            <w:shd w:fill="F4F6F8"/>
+          </w:tcPr>
+          <w:p>
+            <w:pPr>
+              <w:spacing w:after="0"/>
+            </w:pPr>
+            <w:r/>
+            <w:r>
+              <w:rPr>
+                <w:b w:val="0"/>
+                <w:sz w:val="14"/>
+              </w:rPr>
+              <w:t>Plant METs and G×E QTL detection</w:t>
+            </w:r>
+          </w:p>
+        </w:tc>
+        <w:tc>
+          <w:tcPr>
+            <w:tcW w:type="dxa" w:w="2721"/>
+            <w:vAlign w:val="center"/>
+            <w:shd w:fill="F4F6F8"/>
+          </w:tcPr>
+          <w:p>
+            <w:pPr>
+              <w:spacing w:after="0"/>
+            </w:pPr>
+            <w:r/>
+            <w:r>
+              <w:rPr>
+                <w:b w:val="0"/>
+                <w:sz w:val="14"/>
+              </w:rPr>
+              <w:t>Models heterogeneity and environmental covariates at GWAS meta-analysis level</w:t>
+            </w:r>
+          </w:p>
+        </w:tc>
+        <w:tc>
+          <w:tcPr>
+            <w:tcW w:type="dxa" w:w="1871"/>
+            <w:vAlign w:val="center"/>
+            <w:shd w:fill="F4F6F8"/>
+          </w:tcPr>
+          <w:p>
+            <w:pPr>
+              <w:spacing w:after="0"/>
+            </w:pPr>
+            <w:r/>
+            <w:r>
+              <w:rPr>
+                <w:b w:val="0"/>
+                <w:sz w:val="14"/>
+              </w:rPr>
+              <w:t>Estimand comparison; not reimplemented</w:t>
+            </w:r>
+          </w:p>
+        </w:tc>
+      </w:tr>
+      <w:tr>
+        <w:tc>
+          <w:tcPr>
+            <w:tcW w:type="dxa" w:w="1474"/>
+            <w:vAlign w:val="center"/>
+          </w:tcPr>
+          <w:p>
+            <w:pPr>
+              <w:spacing w:after="0"/>
+            </w:pPr>
+            <w:r/>
+            <w:r>
+              <w:rPr>
+                <w:b w:val="0"/>
+                <w:sz w:val="14"/>
+              </w:rPr>
+              <w:t>MAPtools [36]</w:t>
+            </w:r>
+          </w:p>
+        </w:tc>
+        <w:tc>
+          <w:tcPr>
+            <w:tcW w:type="dxa" w:w="2324"/>
+            <w:vAlign w:val="center"/>
+          </w:tcPr>
+          <w:p>
+            <w:pPr>
+              <w:spacing w:after="0"/>
+            </w:pPr>
+            <w:r/>
+            <w:r>
+              <w:rPr>
+                <w:b w:val="0"/>
+                <w:sz w:val="14"/>
+              </w:rPr>
+              <w:t>Mapping-by-sequencing and QTL-Seq command-line analysis</w:t>
+            </w:r>
+          </w:p>
+        </w:tc>
+        <w:tc>
+          <w:tcPr>
+            <w:tcW w:type="dxa" w:w="2381"/>
+            <w:vAlign w:val="center"/>
+          </w:tcPr>
+          <w:p>
+            <w:pPr>
+              <w:spacing w:after="0"/>
+            </w:pPr>
+            <w:r/>
+            <w:r>
+              <w:rPr>
+                <w:b w:val="0"/>
+                <w:sz w:val="14"/>
+              </w:rPr>
+              <w:t>Plant-tested, multi-species mapping workflows</w:t>
+            </w:r>
+          </w:p>
+        </w:tc>
+        <w:tc>
+          <w:tcPr>
+            <w:tcW w:type="dxa" w:w="2721"/>
+            <w:vAlign w:val="center"/>
+          </w:tcPr>
+          <w:p>
+            <w:pPr>
+              <w:spacing w:after="0"/>
+            </w:pPr>
+            <w:r/>
+            <w:r>
+              <w:rPr>
+                <w:b w:val="0"/>
+                <w:sz w:val="14"/>
+              </w:rPr>
+              <w:t>Variant/QTL mapping rather than summary-statistics MR covariance</w:t>
+            </w:r>
+          </w:p>
+        </w:tc>
+        <w:tc>
+          <w:tcPr>
+            <w:tcW w:type="dxa" w:w="1871"/>
+            <w:vAlign w:val="center"/>
+          </w:tcPr>
+          <w:p>
+            <w:pPr>
+              <w:spacing w:after="0"/>
+            </w:pPr>
+            <w:r/>
+            <w:r>
+              <w:rPr>
+                <w:b w:val="0"/>
+                <w:sz w:val="14"/>
+              </w:rPr>
+              <w:t>Workflow/software-article comparison</w:t>
+            </w:r>
+          </w:p>
+        </w:tc>
+      </w:tr>
+    </w:tbl>
+    <w:p>
+      <w:pPr>
+        <w:spacing w:after="0"/>
+      </w:pPr>
+    </w:p>
+    <w:p>
+      <w:pPr>
+        <w:pStyle w:val="Heading2"/>
+      </w:pPr>
+      <w:r>
         <w:t>Environment-effect-heterogeneity model</w:t>
       </w:r>
     </w:p>
@@ -734,6 +1420,126 @@
         <w:pStyle w:val="Heading2"/>
       </w:pPr>
       <w:r>
+        <w:t>Implementation details</w:t>
+      </w:r>
+    </w:p>
+    <w:p>
+      <w:pPr>
+        <w:spacing w:line="269" w:lineRule="auto" w:after="100"/>
+      </w:pPr>
+      <w:r>
+        <w:t>The study was organized as a software/methods evaluation. We did not use the real-data case to select a favorable estimator, define a new gene-level claim or tune simulation truth. The main claims concern input validation, covariance-aware estimation and diagnostic transparency.</w:t>
+      </w:r>
+    </w:p>
+    <w:p>
+      <w:pPr>
+        <w:pStyle w:val="Heading3"/>
+      </w:pPr>
+      <w:r>
+        <w:t>Input schema and harmonization</w:t>
+      </w:r>
+    </w:p>
+    <w:p>
+      <w:pPr>
+        <w:spacing w:line="269" w:lineRule="auto" w:after="100"/>
+      </w:pPr>
+      <w:r>
+        <w:t>Required summary columns were SNP, effect_allele, other_allele, beta, se and pval. Optional columns were eaf and n. The schema rejects empty/duplicate SNP identifiers, non-finite values, non-positive SE, invalid P values, invalid allele characters and equal effect/other alleles. Harmonization recognizes aligned, reversed, complemented and complemented-reversed alleles and uses allele frequencies to retain only resolvable palindromic variants.</w:t>
+      </w:r>
+    </w:p>
+    <w:p>
+      <w:pPr>
+        <w:pStyle w:val="Heading3"/>
+      </w:pPr>
+      <w:r>
+        <w:t>Instrument selection</w:t>
+      </w:r>
+    </w:p>
+    <w:p>
+      <w:pPr>
+        <w:spacing w:line="269" w:lineRule="auto" w:after="100"/>
+      </w:pPr>
+      <w:r>
+        <w:t>The primary thresholds were exposure P≤5×10−8, F≥10 and MAF≥0.05 in the Arabidopsis case. The GxE selector requires every retained SNP to pass these filters in every environment. This prevents environment-specific tool composition from masquerading as effect heterogeneity. LD is represented by signed correlations, not r² values.</w:t>
+      </w:r>
+    </w:p>
+    <w:p>
+      <w:pPr>
+        <w:pStyle w:val="Heading3"/>
+      </w:pPr>
+      <w:r>
+        <w:t>Estimators and diagnostics</w:t>
+      </w:r>
+    </w:p>
+    <w:p>
+      <w:pPr>
+        <w:spacing w:line="269" w:lineRule="auto" w:after="100"/>
+      </w:pPr>
+      <w:r>
+        <w:t>Standard methods include Wald ratio, fixed-effects IVW, random-effects IVW, MR-Egger, Cochran Q and leave-one-out analysis. The environment-slope estimator uses the delta-method ratio variance and GLS covariance described above. If the covariance is singular, a Moore–Penrose inverse is used for the quadratic form and Q degrees of freedom are rank adjusted.</w:t>
+      </w:r>
+    </w:p>
+    <w:p>
+      <w:pPr>
+        <w:pStyle w:val="Heading3"/>
+      </w:pPr>
+      <w:r>
+        <w:t>Simulation design</w:t>
+      </w:r>
+    </w:p>
+    <w:p>
+      <w:pPr>
+        <w:spacing w:line="269" w:lineRule="auto" w:after="100"/>
+      </w:pPr>
+      <w:r>
+        <w:t>All simulations used fixed seeds recorded in metadata JSON files. The base benchmark used 20 SNPs and four environment scores (−1.5, −0.5, 0.5, 1.5). Exposure effects were generated as positive strong instruments. Outcome effects were generated from a pooled effect plus a known environment slope, with multivariate normal sampling errors. The LD stress benchmark additionally used an AR(1) LD correlation matrix with rho=0.6.</w:t>
+      </w:r>
+    </w:p>
+    <w:p>
+      <w:pPr>
+        <w:pStyle w:val="Heading3"/>
+      </w:pPr>
+      <w:r>
+        <w:t>Arabidopsis data processing</w:t>
+      </w:r>
+    </w:p>
+    <w:p>
+      <w:pPr>
+        <w:spacing w:line="269" w:lineRule="auto" w:after="100"/>
+      </w:pPr>
+      <w:r>
+        <w:t>The GSE80744 normalized matrix was downloaded from GEO and the AT1G11560 row extracted. The 1001 Genomes HDF5 matrix was used to extract the local region; five PCs were calculated from every 1000th marker. A public accession VCF supplied REF/ALT labels. AraPheno FT10 and FT16 values were merged by accession ID. Local association regressions included genotype and PC1–PC5. Source URLs, hashes, generated tables and limitations are recorded with the case.</w:t>
+      </w:r>
+    </w:p>
+    <w:p>
+      <w:pPr>
+        <w:pStyle w:val="Heading3"/>
+      </w:pPr>
+      <w:r>
+        <w:t>Statistical reporting</w:t>
+      </w:r>
+    </w:p>
+    <w:p>
+      <w:pPr>
+        <w:spacing w:line="269" w:lineRule="auto" w:after="100"/>
+      </w:pPr>
+      <w:r>
+        <w:t>All numerical results are reported with effect estimates, standard errors, P values, instrument counts, covariance source and heterogeneity diagnostics, following the reporting principles of STROBE-MR.[13] No genome-wide multiple-testing claim is made for the single-gene Arabidopsis demonstration. Any future genome-wide run must prespecify gene-level aggregation, multiple-testing control and an independent validation set.</w:t>
+      </w:r>
+    </w:p>
+    <w:p>
+      <w:pPr>
+        <w:pStyle w:val="Heading1"/>
+      </w:pPr>
+      <w:r>
+        <w:t>Results</w:t>
+      </w:r>
+    </w:p>
+    <w:p>
+      <w:pPr>
+        <w:pStyle w:val="Heading2"/>
+      </w:pPr>
+      <w:r>
         <w:t>Simulation calibration and LD stress</w:t>
       </w:r>
     </w:p>
@@ -750,7 +1556,7 @@
         <w:spacing w:line="269" w:lineRule="auto" w:after="40"/>
       </w:pPr>
       <w:r>
-        <w:t>Table 2. Primary simulation calibration and LD-stress summary. Dashed lines in Figures 2 and 3 mark nominal 0.05 rejection and 0.95 coverage targets where applicable.</w:t>
+        <w:t>Table 3. Primary simulation calibration and LD-stress summary. Dashed lines in Figures 2 and 3 mark nominal 0.05 rejection and 0.95 coverage targets where applicable.</w:t>
       </w:r>
     </w:p>
     <w:tbl>
@@ -1801,7 +2607,7 @@
         <w:spacing w:line="269" w:lineRule="auto" w:after="40"/>
       </w:pPr>
       <w:r>
-        <w:t>Table 3. Arabidopsis data-contract inputs and local processing.</w:t>
+        <w:t>Table 4. Arabidopsis data-contract inputs and local processing.</w:t>
       </w:r>
     </w:p>
     <w:tbl>
@@ -2201,7 +3007,7 @@
         <w:spacing w:line="269" w:lineRule="auto" w:after="40"/>
       </w:pPr>
       <w:r>
-        <w:t>Table 4. Instrument audit for the Arabidopsis case. Exclusion counts are overlapping diagnostics and must not be added as if they were mutually exclusive.</w:t>
+        <w:t>Table 5. Instrument audit for the Arabidopsis case. Exclusion counts are overlapping diagnostics and must not be added as if they were mutually exclusive.</w:t>
       </w:r>
     </w:p>
     <w:tbl>
@@ -2655,7 +3461,7 @@
         <w:spacing w:line="269" w:lineRule="auto" w:after="40"/>
       </w:pPr>
       <w:r>
-        <w:t>Table 5. Environment-stratified comparator estimates. Estimates are local OLS summary-statistics demonstrations and are not independent validation of the causal model.</w:t>
+        <w:t>Table 6. Environment-stratified comparator estimates. Estimates are local OLS summary-statistics demonstrations and are not independent validation of the causal model.</w:t>
       </w:r>
     </w:p>
     <w:tbl>
@@ -3646,7 +4452,7 @@
         <w:spacing w:line="269" w:lineRule="auto" w:after="40"/>
       </w:pPr>
       <w:r>
-        <w:t>Table 6. Local runtime benchmark for the frozen PlantMR implementation.</w:t>
+        <w:t>Table 7. Local runtime benchmark for the frozen PlantMR implementation.</w:t>
       </w:r>
     </w:p>
     <w:tbl>
@@ -4061,7 +4867,7 @@
         <w:spacing w:line="269" w:lineRule="auto" w:after="100"/>
       </w:pPr>
       <w:r>
-        <w:t>The distinction from plant-oriented software is also deliberate. MRBIGR integrates population-scale multi-omics analysis in maize and is a relevant comparator for software breadth.[17] The present work is narrower in biological scope but more explicit about the summary-statistics contract, signed LD, environmental covariance, complete SNP-by-environment grids and rank-aware Q degrees of freedom. The aim is not to win a feature-count comparison. It is to make a plant MR run inspectable, rerunnable and difficult to misinterpret.</w:t>
+        <w:t>The distinction from plant-oriented software is deliberate. MRBIGR integrates population-scale multi-omics analysis in maize and is a relevant comparator for software breadth.[17] PlantMR is narrower in biological scope but more explicit about plant summary-statistics metadata, signed LD, environmental covariance, complete SNP-by-environment grids and rank-aware Q degrees of freedom. Recent Plant Methods software articles such as MAPtools combine a workflow figure, implementation details, command-level outputs, published-data tests and an explicit availability block.[36] PlantMR follows that reader path: the workflow comes before the statistical details, the tool contract is separated from biological claims, and the real case is presented as a reproducibility demonstration. The remaining difference is important: MAPtools includes direct testing across published mapping datasets, whereas PlantMR currently provides a literature-scope matrix and controlled calibration rather than a formal head-to-head comparison against external MR implementations. This is a submission limitation, not evidence that PlantMR outperforms those tools.</w:t>
       </w:r>
     </w:p>
     <w:p>
@@ -4257,10 +5063,10 @@
     </w:p>
     <w:p>
       <w:pPr>
-        <w:pStyle w:val="Heading2"/>
+        <w:pStyle w:val="Heading1"/>
       </w:pPr>
       <w:r>
-        <w:t>Overall conclusion</w:t>
+        <w:t>Conclusions</w:t>
       </w:r>
     </w:p>
     <w:p>
@@ -4276,127 +5082,7 @@
         <w:pStyle w:val="Heading1"/>
       </w:pPr>
       <w:r>
-        <w:t>Methods</w:t>
-      </w:r>
-    </w:p>
-    <w:p>
-      <w:pPr>
-        <w:pStyle w:val="Heading2"/>
-      </w:pPr>
-      <w:r>
-        <w:t>Study design and claim ceiling</w:t>
-      </w:r>
-    </w:p>
-    <w:p>
-      <w:pPr>
-        <w:spacing w:line="269" w:lineRule="auto" w:after="100"/>
-      </w:pPr>
-      <w:r>
-        <w:t>The study was organized as a software/methods evaluation. We did not use the real-data case to select a favorable estimator, define a new gene-level claim or tune simulation truth. The main claims concern input validation, covariance-aware estimation and diagnostic transparency.</w:t>
-      </w:r>
-    </w:p>
-    <w:p>
-      <w:pPr>
-        <w:pStyle w:val="Heading2"/>
-      </w:pPr>
-      <w:r>
-        <w:t>Input schema and harmonization</w:t>
-      </w:r>
-    </w:p>
-    <w:p>
-      <w:pPr>
-        <w:spacing w:line="269" w:lineRule="auto" w:after="100"/>
-      </w:pPr>
-      <w:r>
-        <w:t>Required summary columns were SNP, effect_allele, other_allele, beta, se and pval. Optional columns were eaf and n. The schema rejects empty/duplicate SNP identifiers, non-finite values, non-positive SE, invalid P values, invalid allele characters and equal effect/other alleles. Harmonization recognizes aligned, reversed, complemented and complemented-reversed alleles and uses allele frequencies to retain only resolvable palindromic variants.</w:t>
-      </w:r>
-    </w:p>
-    <w:p>
-      <w:pPr>
-        <w:pStyle w:val="Heading2"/>
-      </w:pPr>
-      <w:r>
-        <w:t>Instrument selection</w:t>
-      </w:r>
-    </w:p>
-    <w:p>
-      <w:pPr>
-        <w:spacing w:line="269" w:lineRule="auto" w:after="100"/>
-      </w:pPr>
-      <w:r>
-        <w:t>The primary thresholds were exposure P≤5×10−8, F≥10 and MAF≥0.05 in the Arabidopsis case. The GxE selector requires every retained SNP to pass these filters in every environment. This prevents environment-specific tool composition from masquerading as effect heterogeneity. LD is represented by signed correlations, not r² values.</w:t>
-      </w:r>
-    </w:p>
-    <w:p>
-      <w:pPr>
-        <w:pStyle w:val="Heading2"/>
-      </w:pPr>
-      <w:r>
-        <w:t>Estimators and diagnostics</w:t>
-      </w:r>
-    </w:p>
-    <w:p>
-      <w:pPr>
-        <w:spacing w:line="269" w:lineRule="auto" w:after="100"/>
-      </w:pPr>
-      <w:r>
-        <w:t>Standard methods include Wald ratio, fixed-effects IVW, random-effects IVW, MR-Egger, Cochran Q and leave-one-out analysis. The environment-slope estimator uses the delta-method ratio variance and GLS covariance described above. If the covariance is singular, a Moore–Penrose inverse is used for the quadratic form and Q degrees of freedom are rank adjusted.</w:t>
-      </w:r>
-    </w:p>
-    <w:p>
-      <w:pPr>
-        <w:pStyle w:val="Heading2"/>
-      </w:pPr>
-      <w:r>
-        <w:t>Simulation design</w:t>
-      </w:r>
-    </w:p>
-    <w:p>
-      <w:pPr>
-        <w:spacing w:line="269" w:lineRule="auto" w:after="100"/>
-      </w:pPr>
-      <w:r>
-        <w:t>All simulations used fixed seeds recorded in metadata JSON files. The base benchmark used 20 SNPs and four environment scores (−1.5, −0.5, 0.5, 1.5). Exposure effects were generated as positive strong instruments. Outcome effects were generated from a pooled effect plus a known environment slope, with multivariate normal sampling errors. The LD stress benchmark additionally used an AR(1) LD correlation matrix with rho=0.6.</w:t>
-      </w:r>
-    </w:p>
-    <w:p>
-      <w:pPr>
-        <w:pStyle w:val="Heading2"/>
-      </w:pPr>
-      <w:r>
-        <w:t>Arabidopsis data processing</w:t>
-      </w:r>
-    </w:p>
-    <w:p>
-      <w:pPr>
-        <w:spacing w:line="269" w:lineRule="auto" w:after="100"/>
-      </w:pPr>
-      <w:r>
-        <w:t>The GSE80744 normalized matrix was downloaded from GEO and the AT1G11560 row extracted. The 1001 Genomes HDF5 matrix was used to extract the local region; five PCs were calculated from every 1000th marker. A public accession VCF supplied REF/ALT labels. AraPheno FT10 and FT16 values were merged by accession ID. Local association regressions included genotype and PC1–PC5. Source URLs, hashes, generated tables and limitations are recorded with the case.</w:t>
-      </w:r>
-    </w:p>
-    <w:p>
-      <w:pPr>
-        <w:pStyle w:val="Heading2"/>
-      </w:pPr>
-      <w:r>
-        <w:t>Statistical reporting</w:t>
-      </w:r>
-    </w:p>
-    <w:p>
-      <w:pPr>
-        <w:spacing w:line="269" w:lineRule="auto" w:after="100"/>
-      </w:pPr>
-      <w:r>
-        <w:t>All numerical results are reported with effect estimates, standard errors, P values, instrument counts, covariance source and heterogeneity diagnostics, following the reporting principles of STROBE-MR.[13] No genome-wide multiple-testing claim is made for the single-gene Arabidopsis demonstration. Any future genome-wide run must prespecify gene-level aggregation, multiple-testing control and an independent validation set.</w:t>
-      </w:r>
-    </w:p>
-    <w:p>
-      <w:pPr>
-        <w:pStyle w:val="Heading1"/>
-      </w:pPr>
-      <w:r>
-        <w:t>Data, code and materials availability</w:t>
+        <w:t>Availability and requirements</w:t>
       </w:r>
     </w:p>
     <w:p>
@@ -4414,6 +5100,840 @@
       <w:r>
         <w:t>Public data sources include GSE80744 normalized expression data, AraPheno FT10/FT16, 1001 Genomes v3.1 and the Arabidopsis source publications. The large 1001 Genomes provider archive is not redistributed; the derived local genotype region, PC scores, allele mapping and provider checksums are included. The maize supplementary workbook, eQTL table and candidate table are included for audit but not used as a new causal result.</w:t>
       </w:r>
+    </w:p>
+    <w:p>
+      <w:pPr>
+        <w:spacing w:line="269" w:lineRule="auto" w:after="40"/>
+      </w:pPr>
+      <w:r>
+        <w:t>Table 8. Plant Methods software availability and requirements.</w:t>
+      </w:r>
+    </w:p>
+    <w:tbl>
+      <w:tblPr>
+        <w:tblStyle w:val="TableGrid"/>
+        <w:tblW w:type="auto" w:w="0"/>
+        <w:jc w:val="center"/>
+        <w:tblLook w:firstColumn="1" w:firstRow="1" w:lastColumn="0" w:lastRow="0" w:noHBand="0" w:noVBand="1" w:val="04A0"/>
+      </w:tblPr>
+      <w:tblGrid>
+        <w:gridCol w:w="4986"/>
+        <w:gridCol w:w="4986"/>
+      </w:tblGrid>
+      <w:tr>
+        <w:tc>
+          <w:tcPr>
+            <w:tcW w:type="dxa" w:w="3402"/>
+            <w:vAlign w:val="center"/>
+            <w:shd w:fill="17365D"/>
+          </w:tcPr>
+          <w:p>
+            <w:pPr>
+              <w:spacing w:after="0"/>
+            </w:pPr>
+            <w:r/>
+            <w:r>
+              <w:rPr>
+                <w:b/>
+                <w:color w:val="FFFFFF"/>
+                <w:sz w:val="16"/>
+              </w:rPr>
+              <w:t>Field</w:t>
+            </w:r>
+          </w:p>
+        </w:tc>
+        <w:tc>
+          <w:tcPr>
+            <w:tcW w:type="dxa" w:w="6236"/>
+            <w:vAlign w:val="center"/>
+            <w:shd w:fill="17365D"/>
+          </w:tcPr>
+          <w:p>
+            <w:pPr>
+              <w:spacing w:after="0"/>
+            </w:pPr>
+            <w:r/>
+            <w:r>
+              <w:rPr>
+                <w:b/>
+                <w:color w:val="FFFFFF"/>
+                <w:sz w:val="16"/>
+              </w:rPr>
+              <w:t>Current value</w:t>
+            </w:r>
+          </w:p>
+        </w:tc>
+      </w:tr>
+      <w:tr>
+        <w:tc>
+          <w:tcPr>
+            <w:tcW w:type="dxa" w:w="3402"/>
+            <w:vAlign w:val="center"/>
+          </w:tcPr>
+          <w:p>
+            <w:pPr>
+              <w:spacing w:after="0"/>
+            </w:pPr>
+            <w:r/>
+            <w:r>
+              <w:rPr>
+                <w:b w:val="0"/>
+                <w:sz w:val="16"/>
+              </w:rPr>
+              <w:t>Project name</w:t>
+            </w:r>
+          </w:p>
+        </w:tc>
+        <w:tc>
+          <w:tcPr>
+            <w:tcW w:type="dxa" w:w="6236"/>
+            <w:vAlign w:val="center"/>
+          </w:tcPr>
+          <w:p>
+            <w:pPr>
+              <w:spacing w:after="0"/>
+            </w:pPr>
+            <w:r/>
+            <w:r>
+              <w:rPr>
+                <w:b w:val="0"/>
+                <w:sz w:val="16"/>
+              </w:rPr>
+              <w:t>PlantMR 1.1</w:t>
+            </w:r>
+          </w:p>
+        </w:tc>
+      </w:tr>
+      <w:tr>
+        <w:tc>
+          <w:tcPr>
+            <w:tcW w:type="dxa" w:w="3402"/>
+            <w:vAlign w:val="center"/>
+            <w:shd w:fill="F4F6F8"/>
+          </w:tcPr>
+          <w:p>
+            <w:pPr>
+              <w:spacing w:after="0"/>
+            </w:pPr>
+            <w:r/>
+            <w:r>
+              <w:rPr>
+                <w:b w:val="0"/>
+                <w:sz w:val="16"/>
+              </w:rPr>
+              <w:t>Project home page</w:t>
+            </w:r>
+          </w:p>
+        </w:tc>
+        <w:tc>
+          <w:tcPr>
+            <w:tcW w:type="dxa" w:w="6236"/>
+            <w:vAlign w:val="center"/>
+            <w:shd w:fill="F4F6F8"/>
+          </w:tcPr>
+          <w:p>
+            <w:pPr>
+              <w:spacing w:after="0"/>
+            </w:pPr>
+            <w:r/>
+            <w:r>
+              <w:rPr>
+                <w:b w:val="0"/>
+                <w:sz w:val="16"/>
+              </w:rPr>
+              <w:t>Public GitHub/GitLab URL to be supplied before submission; local frozen source archive is included.</w:t>
+            </w:r>
+          </w:p>
+        </w:tc>
+      </w:tr>
+      <w:tr>
+        <w:tc>
+          <w:tcPr>
+            <w:tcW w:type="dxa" w:w="3402"/>
+            <w:vAlign w:val="center"/>
+          </w:tcPr>
+          <w:p>
+            <w:pPr>
+              <w:spacing w:after="0"/>
+            </w:pPr>
+            <w:r/>
+            <w:r>
+              <w:rPr>
+                <w:b w:val="0"/>
+                <w:sz w:val="16"/>
+              </w:rPr>
+              <w:t>Operating system(s)</w:t>
+            </w:r>
+          </w:p>
+        </w:tc>
+        <w:tc>
+          <w:tcPr>
+            <w:tcW w:type="dxa" w:w="6236"/>
+            <w:vAlign w:val="center"/>
+          </w:tcPr>
+          <w:p>
+            <w:pPr>
+              <w:spacing w:after="0"/>
+            </w:pPr>
+            <w:r/>
+            <w:r>
+              <w:rPr>
+                <w:b w:val="0"/>
+                <w:sz w:val="16"/>
+              </w:rPr>
+              <w:t>Linux verified; platform-independent Python code intended.</w:t>
+            </w:r>
+          </w:p>
+        </w:tc>
+      </w:tr>
+      <w:tr>
+        <w:tc>
+          <w:tcPr>
+            <w:tcW w:type="dxa" w:w="3402"/>
+            <w:vAlign w:val="center"/>
+            <w:shd w:fill="F4F6F8"/>
+          </w:tcPr>
+          <w:p>
+            <w:pPr>
+              <w:spacing w:after="0"/>
+            </w:pPr>
+            <w:r/>
+            <w:r>
+              <w:rPr>
+                <w:b w:val="0"/>
+                <w:sz w:val="16"/>
+              </w:rPr>
+              <w:t>Programming language</w:t>
+            </w:r>
+          </w:p>
+        </w:tc>
+        <w:tc>
+          <w:tcPr>
+            <w:tcW w:type="dxa" w:w="6236"/>
+            <w:vAlign w:val="center"/>
+            <w:shd w:fill="F4F6F8"/>
+          </w:tcPr>
+          <w:p>
+            <w:pPr>
+              <w:spacing w:after="0"/>
+            </w:pPr>
+            <w:r/>
+            <w:r>
+              <w:rPr>
+                <w:b w:val="0"/>
+                <w:sz w:val="16"/>
+              </w:rPr>
+              <w:t>Python 3.10 or later.</w:t>
+            </w:r>
+          </w:p>
+        </w:tc>
+      </w:tr>
+      <w:tr>
+        <w:tc>
+          <w:tcPr>
+            <w:tcW w:type="dxa" w:w="3402"/>
+            <w:vAlign w:val="center"/>
+          </w:tcPr>
+          <w:p>
+            <w:pPr>
+              <w:spacing w:after="0"/>
+            </w:pPr>
+            <w:r/>
+            <w:r>
+              <w:rPr>
+                <w:b w:val="0"/>
+                <w:sz w:val="16"/>
+              </w:rPr>
+              <w:t>Dependencies</w:t>
+            </w:r>
+          </w:p>
+        </w:tc>
+        <w:tc>
+          <w:tcPr>
+            <w:tcW w:type="dxa" w:w="6236"/>
+            <w:vAlign w:val="center"/>
+          </w:tcPr>
+          <w:p>
+            <w:pPr>
+              <w:spacing w:after="0"/>
+            </w:pPr>
+            <w:r/>
+            <w:r>
+              <w:rPr>
+                <w:b w:val="0"/>
+                <w:sz w:val="16"/>
+              </w:rPr>
+              <w:t>NumPy, pandas, SciPy, statsmodels, matplotlib and psutil; declared in environment.yml.</w:t>
+            </w:r>
+          </w:p>
+        </w:tc>
+      </w:tr>
+      <w:tr>
+        <w:tc>
+          <w:tcPr>
+            <w:tcW w:type="dxa" w:w="3402"/>
+            <w:vAlign w:val="center"/>
+            <w:shd w:fill="F4F6F8"/>
+          </w:tcPr>
+          <w:p>
+            <w:pPr>
+              <w:spacing w:after="0"/>
+            </w:pPr>
+            <w:r/>
+            <w:r>
+              <w:rPr>
+                <w:b w:val="0"/>
+                <w:sz w:val="16"/>
+              </w:rPr>
+              <w:t>License</w:t>
+            </w:r>
+          </w:p>
+        </w:tc>
+        <w:tc>
+          <w:tcPr>
+            <w:tcW w:type="dxa" w:w="6236"/>
+            <w:vAlign w:val="center"/>
+            <w:shd w:fill="F4F6F8"/>
+          </w:tcPr>
+          <w:p>
+            <w:pPr>
+              <w:spacing w:after="0"/>
+            </w:pPr>
+            <w:r/>
+            <w:r>
+              <w:rPr>
+                <w:b w:val="0"/>
+                <w:sz w:val="16"/>
+              </w:rPr>
+              <w:t>MIT License.</w:t>
+            </w:r>
+          </w:p>
+        </w:tc>
+      </w:tr>
+      <w:tr>
+        <w:tc>
+          <w:tcPr>
+            <w:tcW w:type="dxa" w:w="3402"/>
+            <w:vAlign w:val="center"/>
+          </w:tcPr>
+          <w:p>
+            <w:pPr>
+              <w:spacing w:after="0"/>
+            </w:pPr>
+            <w:r/>
+            <w:r>
+              <w:rPr>
+                <w:b w:val="0"/>
+                <w:sz w:val="16"/>
+              </w:rPr>
+              <w:t>Restrictions for non-academic use</w:t>
+            </w:r>
+          </w:p>
+        </w:tc>
+        <w:tc>
+          <w:tcPr>
+            <w:tcW w:type="dxa" w:w="6236"/>
+            <w:vAlign w:val="center"/>
+          </w:tcPr>
+          <w:p>
+            <w:pPr>
+              <w:spacing w:after="0"/>
+            </w:pPr>
+            <w:r/>
+            <w:r>
+              <w:rPr>
+                <w:b w:val="0"/>
+                <w:sz w:val="16"/>
+              </w:rPr>
+              <w:t>No additional restriction stated in the local license.</w:t>
+            </w:r>
+          </w:p>
+        </w:tc>
+      </w:tr>
+    </w:tbl>
+    <w:p>
+      <w:pPr>
+        <w:spacing w:after="0"/>
+      </w:pPr>
+    </w:p>
+    <w:p>
+      <w:pPr>
+        <w:pStyle w:val="Heading1"/>
+      </w:pPr>
+      <w:r>
+        <w:t>List of abbreviations</w:t>
+      </w:r>
+    </w:p>
+    <w:tbl>
+      <w:tblPr>
+        <w:tblStyle w:val="TableGrid"/>
+        <w:tblW w:type="auto" w:w="0"/>
+        <w:jc w:val="center"/>
+        <w:tblLook w:firstColumn="1" w:firstRow="1" w:lastColumn="0" w:lastRow="0" w:noHBand="0" w:noVBand="1" w:val="04A0"/>
+      </w:tblPr>
+      <w:tblGrid>
+        <w:gridCol w:w="4986"/>
+        <w:gridCol w:w="4986"/>
+      </w:tblGrid>
+      <w:tr>
+        <w:tc>
+          <w:tcPr>
+            <w:tcW w:type="dxa" w:w="2551"/>
+            <w:vAlign w:val="center"/>
+            <w:shd w:fill="17365D"/>
+          </w:tcPr>
+          <w:p>
+            <w:pPr>
+              <w:spacing w:after="0"/>
+            </w:pPr>
+            <w:r/>
+            <w:r>
+              <w:rPr>
+                <w:b/>
+                <w:color w:val="FFFFFF"/>
+                <w:sz w:val="16"/>
+              </w:rPr>
+              <w:t>Abbreviation</w:t>
+            </w:r>
+          </w:p>
+        </w:tc>
+        <w:tc>
+          <w:tcPr>
+            <w:tcW w:type="dxa" w:w="7087"/>
+            <w:vAlign w:val="center"/>
+            <w:shd w:fill="17365D"/>
+          </w:tcPr>
+          <w:p>
+            <w:pPr>
+              <w:spacing w:after="0"/>
+            </w:pPr>
+            <w:r/>
+            <w:r>
+              <w:rPr>
+                <w:b/>
+                <w:color w:val="FFFFFF"/>
+                <w:sz w:val="16"/>
+              </w:rPr>
+              <w:t>Definition</w:t>
+            </w:r>
+          </w:p>
+        </w:tc>
+      </w:tr>
+      <w:tr>
+        <w:tc>
+          <w:tcPr>
+            <w:tcW w:type="dxa" w:w="2551"/>
+            <w:vAlign w:val="center"/>
+          </w:tcPr>
+          <w:p>
+            <w:pPr>
+              <w:spacing w:after="0"/>
+            </w:pPr>
+            <w:r/>
+            <w:r>
+              <w:rPr>
+                <w:b w:val="0"/>
+                <w:sz w:val="16"/>
+              </w:rPr>
+              <w:t>MR</w:t>
+            </w:r>
+          </w:p>
+        </w:tc>
+        <w:tc>
+          <w:tcPr>
+            <w:tcW w:type="dxa" w:w="7087"/>
+            <w:vAlign w:val="center"/>
+          </w:tcPr>
+          <w:p>
+            <w:pPr>
+              <w:spacing w:after="0"/>
+            </w:pPr>
+            <w:r/>
+            <w:r>
+              <w:rPr>
+                <w:b w:val="0"/>
+                <w:sz w:val="16"/>
+              </w:rPr>
+              <w:t>Mendelian randomization</w:t>
+            </w:r>
+          </w:p>
+        </w:tc>
+      </w:tr>
+      <w:tr>
+        <w:tc>
+          <w:tcPr>
+            <w:tcW w:type="dxa" w:w="2551"/>
+            <w:vAlign w:val="center"/>
+            <w:shd w:fill="F4F6F8"/>
+          </w:tcPr>
+          <w:p>
+            <w:pPr>
+              <w:spacing w:after="0"/>
+            </w:pPr>
+            <w:r/>
+            <w:r>
+              <w:rPr>
+                <w:b w:val="0"/>
+                <w:sz w:val="16"/>
+              </w:rPr>
+              <w:t>GWAS</w:t>
+            </w:r>
+          </w:p>
+        </w:tc>
+        <w:tc>
+          <w:tcPr>
+            <w:tcW w:type="dxa" w:w="7087"/>
+            <w:vAlign w:val="center"/>
+            <w:shd w:fill="F4F6F8"/>
+          </w:tcPr>
+          <w:p>
+            <w:pPr>
+              <w:spacing w:after="0"/>
+            </w:pPr>
+            <w:r/>
+            <w:r>
+              <w:rPr>
+                <w:b w:val="0"/>
+                <w:sz w:val="16"/>
+              </w:rPr>
+              <w:t>Genome-wide association study</w:t>
+            </w:r>
+          </w:p>
+        </w:tc>
+      </w:tr>
+      <w:tr>
+        <w:tc>
+          <w:tcPr>
+            <w:tcW w:type="dxa" w:w="2551"/>
+            <w:vAlign w:val="center"/>
+          </w:tcPr>
+          <w:p>
+            <w:pPr>
+              <w:spacing w:after="0"/>
+            </w:pPr>
+            <w:r/>
+            <w:r>
+              <w:rPr>
+                <w:b w:val="0"/>
+                <w:sz w:val="16"/>
+              </w:rPr>
+              <w:t>eQTL</w:t>
+            </w:r>
+          </w:p>
+        </w:tc>
+        <w:tc>
+          <w:tcPr>
+            <w:tcW w:type="dxa" w:w="7087"/>
+            <w:vAlign w:val="center"/>
+          </w:tcPr>
+          <w:p>
+            <w:pPr>
+              <w:spacing w:after="0"/>
+            </w:pPr>
+            <w:r/>
+            <w:r>
+              <w:rPr>
+                <w:b w:val="0"/>
+                <w:sz w:val="16"/>
+              </w:rPr>
+              <w:t>Expression quantitative trait locus</w:t>
+            </w:r>
+          </w:p>
+        </w:tc>
+      </w:tr>
+      <w:tr>
+        <w:tc>
+          <w:tcPr>
+            <w:tcW w:type="dxa" w:w="2551"/>
+            <w:vAlign w:val="center"/>
+            <w:shd w:fill="F4F6F8"/>
+          </w:tcPr>
+          <w:p>
+            <w:pPr>
+              <w:spacing w:after="0"/>
+            </w:pPr>
+            <w:r/>
+            <w:r>
+              <w:rPr>
+                <w:b w:val="0"/>
+                <w:sz w:val="16"/>
+              </w:rPr>
+              <w:t>G×E / GxE</w:t>
+            </w:r>
+          </w:p>
+        </w:tc>
+        <w:tc>
+          <w:tcPr>
+            <w:tcW w:type="dxa" w:w="7087"/>
+            <w:vAlign w:val="center"/>
+            <w:shd w:fill="F4F6F8"/>
+          </w:tcPr>
+          <w:p>
+            <w:pPr>
+              <w:spacing w:after="0"/>
+            </w:pPr>
+            <w:r/>
+            <w:r>
+              <w:rPr>
+                <w:b w:val="0"/>
+                <w:sz w:val="16"/>
+              </w:rPr>
+              <w:t>Genotype-by-environment interaction or environment-effect heterogeneity</w:t>
+            </w:r>
+          </w:p>
+        </w:tc>
+      </w:tr>
+      <w:tr>
+        <w:tc>
+          <w:tcPr>
+            <w:tcW w:type="dxa" w:w="2551"/>
+            <w:vAlign w:val="center"/>
+          </w:tcPr>
+          <w:p>
+            <w:pPr>
+              <w:spacing w:after="0"/>
+            </w:pPr>
+            <w:r/>
+            <w:r>
+              <w:rPr>
+                <w:b w:val="0"/>
+                <w:sz w:val="16"/>
+              </w:rPr>
+              <w:t>LD</w:t>
+            </w:r>
+          </w:p>
+        </w:tc>
+        <w:tc>
+          <w:tcPr>
+            <w:tcW w:type="dxa" w:w="7087"/>
+            <w:vAlign w:val="center"/>
+          </w:tcPr>
+          <w:p>
+            <w:pPr>
+              <w:spacing w:after="0"/>
+            </w:pPr>
+            <w:r/>
+            <w:r>
+              <w:rPr>
+                <w:b w:val="0"/>
+                <w:sz w:val="16"/>
+              </w:rPr>
+              <w:t>Linkage disequilibrium</w:t>
+            </w:r>
+          </w:p>
+        </w:tc>
+      </w:tr>
+      <w:tr>
+        <w:tc>
+          <w:tcPr>
+            <w:tcW w:type="dxa" w:w="2551"/>
+            <w:vAlign w:val="center"/>
+            <w:shd w:fill="F4F6F8"/>
+          </w:tcPr>
+          <w:p>
+            <w:pPr>
+              <w:spacing w:after="0"/>
+            </w:pPr>
+            <w:r/>
+            <w:r>
+              <w:rPr>
+                <w:b w:val="0"/>
+                <w:sz w:val="16"/>
+              </w:rPr>
+              <w:t>GLS</w:t>
+            </w:r>
+          </w:p>
+        </w:tc>
+        <w:tc>
+          <w:tcPr>
+            <w:tcW w:type="dxa" w:w="7087"/>
+            <w:vAlign w:val="center"/>
+            <w:shd w:fill="F4F6F8"/>
+          </w:tcPr>
+          <w:p>
+            <w:pPr>
+              <w:spacing w:after="0"/>
+            </w:pPr>
+            <w:r/>
+            <w:r>
+              <w:rPr>
+                <w:b w:val="0"/>
+                <w:sz w:val="16"/>
+              </w:rPr>
+              <w:t>Generalized least squares</w:t>
+            </w:r>
+          </w:p>
+        </w:tc>
+      </w:tr>
+      <w:tr>
+        <w:tc>
+          <w:tcPr>
+            <w:tcW w:type="dxa" w:w="2551"/>
+            <w:vAlign w:val="center"/>
+          </w:tcPr>
+          <w:p>
+            <w:pPr>
+              <w:spacing w:after="0"/>
+            </w:pPr>
+            <w:r/>
+            <w:r>
+              <w:rPr>
+                <w:b w:val="0"/>
+                <w:sz w:val="16"/>
+              </w:rPr>
+              <w:t>IVW</w:t>
+            </w:r>
+          </w:p>
+        </w:tc>
+        <w:tc>
+          <w:tcPr>
+            <w:tcW w:type="dxa" w:w="7087"/>
+            <w:vAlign w:val="center"/>
+          </w:tcPr>
+          <w:p>
+            <w:pPr>
+              <w:spacing w:after="0"/>
+            </w:pPr>
+            <w:r/>
+            <w:r>
+              <w:rPr>
+                <w:b w:val="0"/>
+                <w:sz w:val="16"/>
+              </w:rPr>
+              <w:t>Inverse-variance weighted</w:t>
+            </w:r>
+          </w:p>
+        </w:tc>
+      </w:tr>
+      <w:tr>
+        <w:tc>
+          <w:tcPr>
+            <w:tcW w:type="dxa" w:w="2551"/>
+            <w:vAlign w:val="center"/>
+            <w:shd w:fill="F4F6F8"/>
+          </w:tcPr>
+          <w:p>
+            <w:pPr>
+              <w:spacing w:after="0"/>
+            </w:pPr>
+            <w:r/>
+            <w:r>
+              <w:rPr>
+                <w:b w:val="0"/>
+                <w:sz w:val="16"/>
+              </w:rPr>
+              <w:t>MAF</w:t>
+            </w:r>
+          </w:p>
+        </w:tc>
+        <w:tc>
+          <w:tcPr>
+            <w:tcW w:type="dxa" w:w="7087"/>
+            <w:vAlign w:val="center"/>
+            <w:shd w:fill="F4F6F8"/>
+          </w:tcPr>
+          <w:p>
+            <w:pPr>
+              <w:spacing w:after="0"/>
+            </w:pPr>
+            <w:r/>
+            <w:r>
+              <w:rPr>
+                <w:b w:val="0"/>
+                <w:sz w:val="16"/>
+              </w:rPr>
+              <w:t>Minor allele frequency</w:t>
+            </w:r>
+          </w:p>
+        </w:tc>
+      </w:tr>
+      <w:tr>
+        <w:tc>
+          <w:tcPr>
+            <w:tcW w:type="dxa" w:w="2551"/>
+            <w:vAlign w:val="center"/>
+          </w:tcPr>
+          <w:p>
+            <w:pPr>
+              <w:spacing w:after="0"/>
+            </w:pPr>
+            <w:r/>
+            <w:r>
+              <w:rPr>
+                <w:b w:val="0"/>
+                <w:sz w:val="16"/>
+              </w:rPr>
+              <w:t>SNP</w:t>
+            </w:r>
+          </w:p>
+        </w:tc>
+        <w:tc>
+          <w:tcPr>
+            <w:tcW w:type="dxa" w:w="7087"/>
+            <w:vAlign w:val="center"/>
+          </w:tcPr>
+          <w:p>
+            <w:pPr>
+              <w:spacing w:after="0"/>
+            </w:pPr>
+            <w:r/>
+            <w:r>
+              <w:rPr>
+                <w:b w:val="0"/>
+                <w:sz w:val="16"/>
+              </w:rPr>
+              <w:t>Single-nucleotide polymorphism</w:t>
+            </w:r>
+          </w:p>
+        </w:tc>
+      </w:tr>
+      <w:tr>
+        <w:tc>
+          <w:tcPr>
+            <w:tcW w:type="dxa" w:w="2551"/>
+            <w:vAlign w:val="center"/>
+            <w:shd w:fill="F4F6F8"/>
+          </w:tcPr>
+          <w:p>
+            <w:pPr>
+              <w:spacing w:after="0"/>
+            </w:pPr>
+            <w:r/>
+            <w:r>
+              <w:rPr>
+                <w:b w:val="0"/>
+                <w:sz w:val="16"/>
+              </w:rPr>
+              <w:t>Q</w:t>
+            </w:r>
+          </w:p>
+        </w:tc>
+        <w:tc>
+          <w:tcPr>
+            <w:tcW w:type="dxa" w:w="7087"/>
+            <w:vAlign w:val="center"/>
+            <w:shd w:fill="F4F6F8"/>
+          </w:tcPr>
+          <w:p>
+            <w:pPr>
+              <w:spacing w:after="0"/>
+            </w:pPr>
+            <w:r/>
+            <w:r>
+              <w:rPr>
+                <w:b w:val="0"/>
+                <w:sz w:val="16"/>
+              </w:rPr>
+              <w:t>Cochran-type heterogeneity statistic</w:t>
+            </w:r>
+          </w:p>
+        </w:tc>
+      </w:tr>
+    </w:tbl>
+    <w:p>
+      <w:pPr>
+        <w:spacing w:after="0"/>
+      </w:pPr>
     </w:p>
     <w:p>
       <w:pPr>
@@ -4494,7 +6014,7 @@
                 <w:b w:val="0"/>
                 <w:sz w:val="17"/>
               </w:rPr>
-              <w:t>Ethics approval</w:t>
+              <w:t>Ethics approval and consent to participate</w:t>
             </w:r>
           </w:p>
         </w:tc>
@@ -4514,6 +6034,88 @@
                 <w:sz w:val="17"/>
               </w:rPr>
               <w:t>Not applicable: public plant accessions and public aggregate/processed data were used.</w:t>
+            </w:r>
+          </w:p>
+        </w:tc>
+      </w:tr>
+      <w:tr>
+        <w:tc>
+          <w:tcPr>
+            <w:tcW w:type="dxa" w:w="2551"/>
+            <w:vAlign w:val="center"/>
+            <w:shd w:fill="F4F6F8"/>
+          </w:tcPr>
+          <w:p>
+            <w:pPr>
+              <w:spacing w:after="0"/>
+            </w:pPr>
+            <w:r/>
+            <w:r>
+              <w:rPr>
+                <w:b w:val="0"/>
+                <w:sz w:val="17"/>
+              </w:rPr>
+              <w:t>Consent for publication</w:t>
+            </w:r>
+          </w:p>
+        </w:tc>
+        <w:tc>
+          <w:tcPr>
+            <w:tcW w:type="dxa" w:w="7087"/>
+            <w:vAlign w:val="center"/>
+            <w:shd w:fill="F4F6F8"/>
+          </w:tcPr>
+          <w:p>
+            <w:pPr>
+              <w:spacing w:after="0"/>
+            </w:pPr>
+            <w:r/>
+            <w:r>
+              <w:rPr>
+                <w:b w:val="0"/>
+                <w:sz w:val="17"/>
+              </w:rPr>
+              <w:t>Not applicable.</w:t>
+            </w:r>
+          </w:p>
+        </w:tc>
+      </w:tr>
+      <w:tr>
+        <w:tc>
+          <w:tcPr>
+            <w:tcW w:type="dxa" w:w="2551"/>
+            <w:vAlign w:val="center"/>
+          </w:tcPr>
+          <w:p>
+            <w:pPr>
+              <w:spacing w:after="0"/>
+            </w:pPr>
+            <w:r/>
+            <w:r>
+              <w:rPr>
+                <w:b w:val="0"/>
+                <w:sz w:val="17"/>
+              </w:rPr>
+              <w:t>Availability of data and materials</w:t>
+            </w:r>
+          </w:p>
+        </w:tc>
+        <w:tc>
+          <w:tcPr>
+            <w:tcW w:type="dxa" w:w="7087"/>
+            <w:vAlign w:val="center"/>
+          </w:tcPr>
+          <w:p>
+            <w:pPr>
+              <w:spacing w:after="0"/>
+            </w:pPr>
+            <w:r/>
+            <w:r>
+              <w:rPr>
+                <w:b w:val="0"/>
+                <w:sz w:val="17"/>
+              </w:rPr>
+              <w:t>Public source data and derived audit materials are described above; public repository URL/DOI to be added.</w:t>
             </w:r>
           </w:p>
         </w:tc>
@@ -4658,7 +6260,7 @@
                 <w:b w:val="0"/>
                 <w:sz w:val="17"/>
               </w:rPr>
-              <w:t>Corresponding author</w:t>
+              <w:t>Acknowledgements</w:t>
             </w:r>
           </w:p>
         </w:tc>
@@ -4677,7 +6279,7 @@
                 <w:b w:val="0"/>
                 <w:sz w:val="17"/>
               </w:rPr>
-              <w:t>To be completed by authors.</w:t>
+              <w:t>To be completed by authors or marked Not applicable.</w:t>
             </w:r>
           </w:p>
         </w:tc>
@@ -4699,7 +6301,7 @@
                 <w:b w:val="0"/>
                 <w:sz w:val="17"/>
               </w:rPr>
-              <w:t>Data/code availability</w:t>
+              <w:t>Authors’ information</w:t>
             </w:r>
           </w:p>
         </w:tc>
@@ -4719,7 +6321,7 @@
                 <w:b w:val="0"/>
                 <w:sz w:val="17"/>
               </w:rPr>
-              <w:t>Source archive included; public repository and DOI to be added before submission.</w:t>
+              <w:t>Author names, affiliations and corresponding author to be supplied.</w:t>
             </w:r>
           </w:p>
         </w:tc>
@@ -5160,318 +6762,15 @@
     </w:p>
     <w:p>
       <w:pPr>
-        <w:pStyle w:val="Heading1"/>
+        <w:spacing w:after="60"/>
+        <w:ind w:left="255" w:hanging="255"/>
       </w:pPr>
       <w:r>
-        <w:t>Submission metadata to complete</w:t>
+        <w:rPr>
+          <w:sz w:val="17"/>
+        </w:rPr>
+        <w:t>36. Candela, H. et al. MAPtools: command-line tools for mapping-by-sequencing and QTL-Seq analysis and visualization. Plant Methods 20, 107 (2024). https://doi.org/10.1186/s13007-024-01222-2</w:t>
       </w:r>
-    </w:p>
-    <w:tbl>
-      <w:tblPr>
-        <w:tblStyle w:val="TableGrid"/>
-        <w:tblW w:type="auto" w:w="0"/>
-        <w:jc w:val="center"/>
-        <w:tblLook w:firstColumn="1" w:firstRow="1" w:lastColumn="0" w:lastRow="0" w:noHBand="0" w:noVBand="1" w:val="04A0"/>
-      </w:tblPr>
-      <w:tblGrid>
-        <w:gridCol w:w="4986"/>
-        <w:gridCol w:w="4986"/>
-      </w:tblGrid>
-      <w:tr>
-        <w:tc>
-          <w:tcPr>
-            <w:tcW w:type="dxa" w:w="2835"/>
-            <w:vAlign w:val="center"/>
-            <w:shd w:fill="17365D"/>
-          </w:tcPr>
-          <w:p>
-            <w:pPr>
-              <w:spacing w:after="0"/>
-            </w:pPr>
-            <w:r/>
-            <w:r>
-              <w:rPr>
-                <w:b/>
-                <w:color w:val="FFFFFF"/>
-                <w:sz w:val="17"/>
-              </w:rPr>
-              <w:t>Field</w:t>
-            </w:r>
-          </w:p>
-        </w:tc>
-        <w:tc>
-          <w:tcPr>
-            <w:tcW w:type="dxa" w:w="6803"/>
-            <w:vAlign w:val="center"/>
-            <w:shd w:fill="17365D"/>
-          </w:tcPr>
-          <w:p>
-            <w:pPr>
-              <w:spacing w:after="0"/>
-            </w:pPr>
-            <w:r/>
-            <w:r>
-              <w:rPr>
-                <w:b/>
-                <w:color w:val="FFFFFF"/>
-                <w:sz w:val="17"/>
-              </w:rPr>
-              <w:t>Status</w:t>
-            </w:r>
-          </w:p>
-        </w:tc>
-      </w:tr>
-      <w:tr>
-        <w:tc>
-          <w:tcPr>
-            <w:tcW w:type="dxa" w:w="2835"/>
-            <w:vAlign w:val="center"/>
-          </w:tcPr>
-          <w:p>
-            <w:pPr>
-              <w:spacing w:after="0"/>
-            </w:pPr>
-            <w:r/>
-            <w:r>
-              <w:rPr>
-                <w:b w:val="0"/>
-                <w:sz w:val="17"/>
-              </w:rPr>
-              <w:t>Authors and affiliations</w:t>
-            </w:r>
-          </w:p>
-        </w:tc>
-        <w:tc>
-          <w:tcPr>
-            <w:tcW w:type="dxa" w:w="6803"/>
-            <w:vAlign w:val="center"/>
-          </w:tcPr>
-          <w:p>
-            <w:pPr>
-              <w:spacing w:after="0"/>
-            </w:pPr>
-            <w:r/>
-            <w:r>
-              <w:rPr>
-                <w:b w:val="0"/>
-                <w:sz w:val="17"/>
-              </w:rPr>
-              <w:t>To be supplied by authors</w:t>
-            </w:r>
-          </w:p>
-        </w:tc>
-      </w:tr>
-      <w:tr>
-        <w:tc>
-          <w:tcPr>
-            <w:tcW w:type="dxa" w:w="2835"/>
-            <w:vAlign w:val="center"/>
-            <w:shd w:fill="F4F6F8"/>
-          </w:tcPr>
-          <w:p>
-            <w:pPr>
-              <w:spacing w:after="0"/>
-            </w:pPr>
-            <w:r/>
-            <w:r>
-              <w:rPr>
-                <w:b w:val="0"/>
-                <w:sz w:val="17"/>
-              </w:rPr>
-              <w:t>Corresponding author</w:t>
-            </w:r>
-          </w:p>
-        </w:tc>
-        <w:tc>
-          <w:tcPr>
-            <w:tcW w:type="dxa" w:w="6803"/>
-            <w:vAlign w:val="center"/>
-            <w:shd w:fill="F4F6F8"/>
-          </w:tcPr>
-          <w:p>
-            <w:pPr>
-              <w:spacing w:after="0"/>
-            </w:pPr>
-            <w:r/>
-            <w:r>
-              <w:rPr>
-                <w:b w:val="0"/>
-                <w:sz w:val="17"/>
-              </w:rPr>
-              <w:t>To be supplied by authors</w:t>
-            </w:r>
-          </w:p>
-        </w:tc>
-      </w:tr>
-      <w:tr>
-        <w:tc>
-          <w:tcPr>
-            <w:tcW w:type="dxa" w:w="2835"/>
-            <w:vAlign w:val="center"/>
-          </w:tcPr>
-          <w:p>
-            <w:pPr>
-              <w:spacing w:after="0"/>
-            </w:pPr>
-            <w:r/>
-            <w:r>
-              <w:rPr>
-                <w:b w:val="0"/>
-                <w:sz w:val="17"/>
-              </w:rPr>
-              <w:t>Funding</w:t>
-            </w:r>
-          </w:p>
-        </w:tc>
-        <w:tc>
-          <w:tcPr>
-            <w:tcW w:type="dxa" w:w="6803"/>
-            <w:vAlign w:val="center"/>
-          </w:tcPr>
-          <w:p>
-            <w:pPr>
-              <w:spacing w:after="0"/>
-            </w:pPr>
-            <w:r/>
-            <w:r>
-              <w:rPr>
-                <w:b w:val="0"/>
-                <w:sz w:val="17"/>
-              </w:rPr>
-              <w:t>To be supplied by authors</w:t>
-            </w:r>
-          </w:p>
-        </w:tc>
-      </w:tr>
-      <w:tr>
-        <w:tc>
-          <w:tcPr>
-            <w:tcW w:type="dxa" w:w="2835"/>
-            <w:vAlign w:val="center"/>
-            <w:shd w:fill="F4F6F8"/>
-          </w:tcPr>
-          <w:p>
-            <w:pPr>
-              <w:spacing w:after="0"/>
-            </w:pPr>
-            <w:r/>
-            <w:r>
-              <w:rPr>
-                <w:b w:val="0"/>
-                <w:sz w:val="17"/>
-              </w:rPr>
-              <w:t>Competing interests</w:t>
-            </w:r>
-          </w:p>
-        </w:tc>
-        <w:tc>
-          <w:tcPr>
-            <w:tcW w:type="dxa" w:w="6803"/>
-            <w:vAlign w:val="center"/>
-            <w:shd w:fill="F4F6F8"/>
-          </w:tcPr>
-          <w:p>
-            <w:pPr>
-              <w:spacing w:after="0"/>
-            </w:pPr>
-            <w:r/>
-            <w:r>
-              <w:rPr>
-                <w:b w:val="0"/>
-                <w:sz w:val="17"/>
-              </w:rPr>
-              <w:t>To be supplied by authors</w:t>
-            </w:r>
-          </w:p>
-        </w:tc>
-      </w:tr>
-      <w:tr>
-        <w:tc>
-          <w:tcPr>
-            <w:tcW w:type="dxa" w:w="2835"/>
-            <w:vAlign w:val="center"/>
-          </w:tcPr>
-          <w:p>
-            <w:pPr>
-              <w:spacing w:after="0"/>
-            </w:pPr>
-            <w:r/>
-            <w:r>
-              <w:rPr>
-                <w:b w:val="0"/>
-                <w:sz w:val="17"/>
-              </w:rPr>
-              <w:t>Public repository URL/DOI</w:t>
-            </w:r>
-          </w:p>
-        </w:tc>
-        <w:tc>
-          <w:tcPr>
-            <w:tcW w:type="dxa" w:w="6803"/>
-            <w:vAlign w:val="center"/>
-          </w:tcPr>
-          <w:p>
-            <w:pPr>
-              <w:spacing w:after="0"/>
-            </w:pPr>
-            <w:r/>
-            <w:r>
-              <w:rPr>
-                <w:b w:val="0"/>
-                <w:sz w:val="17"/>
-              </w:rPr>
-              <w:t>To be supplied before external submission</w:t>
-            </w:r>
-          </w:p>
-        </w:tc>
-      </w:tr>
-      <w:tr>
-        <w:tc>
-          <w:tcPr>
-            <w:tcW w:type="dxa" w:w="2835"/>
-            <w:vAlign w:val="center"/>
-            <w:shd w:fill="F4F6F8"/>
-          </w:tcPr>
-          <w:p>
-            <w:pPr>
-              <w:spacing w:after="0"/>
-            </w:pPr>
-            <w:r/>
-            <w:r>
-              <w:rPr>
-                <w:b w:val="0"/>
-                <w:sz w:val="17"/>
-              </w:rPr>
-              <w:t>Target journal formatting</w:t>
-            </w:r>
-          </w:p>
-        </w:tc>
-        <w:tc>
-          <w:tcPr>
-            <w:tcW w:type="dxa" w:w="6803"/>
-            <w:vAlign w:val="center"/>
-            <w:shd w:fill="F4F6F8"/>
-          </w:tcPr>
-          <w:p>
-            <w:pPr>
-              <w:spacing w:after="0"/>
-            </w:pPr>
-            <w:r/>
-            <w:r>
-              <w:rPr>
-                <w:b w:val="0"/>
-                <w:sz w:val="17"/>
-              </w:rPr>
-              <w:t>Plant Methods recommended; format after presubmission response</w:t>
-            </w:r>
-          </w:p>
-        </w:tc>
-      </w:tr>
-    </w:tbl>
-    <w:p>
-      <w:pPr>
-        <w:spacing w:after="0"/>
-      </w:pPr>
     </w:p>
     <w:sectPr>
       <w:headerReference w:type="default" r:id="rId9"/>

</xml_diff>

<commit_message>
chore: publish PlantMR repository metadata in manuscript
</commit_message>
<xml_diff>
--- a/docs/PlantMR_submission_manuscript.docx
+++ b/docs/PlantMR_submission_manuscript.docx
@@ -5074,7 +5074,7 @@
         <w:spacing w:line="269" w:lineRule="auto" w:after="100"/>
       </w:pPr>
       <w:r>
-        <w:t>PlantMR is a reproducible plant-focused implementation for auditable summary-statistics MR and a narrowly defined environment-effect-heterogeneity analysis. Its strongest evidence is software-level: explicit provenance, complete-grid selection, covariance-aware GLS, rank-aware heterogeneity reporting, calibrated simulations and a real-data contract that preserves limitations. The evidence does not support calling AT1G11560 a causal gene or calling PlantMR the first plant environment-interaction MR method. A Plant Methods software submission is defensible after adding a public repository/DOI, clean-environment verification and completed author declarations; a biological discovery claim would require a substantially stronger validation program.</w:t>
+        <w:t>PlantMR is a reproducible plant-focused implementation for auditable summary-statistics MR and a narrowly defined environment-effect-heterogeneity analysis. Its strongest evidence is software-level: explicit provenance, complete-grid selection, covariance-aware GLS, rank-aware heterogeneity reporting, calibrated simulations and a real-data contract that preserves limitations. The evidence does not support calling AT1G11560 a causal gene or calling PlantMR the first plant environment-interaction MR method. A Plant Methods software submission is defensible after adding an archival DOI, clean-environment verification and completed author declarations; a biological discovery claim would require a substantially stronger validation program.</w:t>
       </w:r>
     </w:p>
     <w:p>
@@ -5090,7 +5090,7 @@
         <w:spacing w:line="269" w:lineRule="auto" w:after="100"/>
       </w:pPr>
       <w:r>
-        <w:t>PlantMR is released under the MIT License. The software snapshot is v1.1.0 and the complete manuscript/benchmark/Word-document package is frozen at tag v1.1.0-paper. The source archive `release/PlantMR_v1.1.0-paper_source.zip` is suitable for submission as supplementary software. Before publication, the archive should be mirrored to a public repository and assigned a DOI.</w:t>
+        <w:t>PlantMR is released under the MIT License. The software snapshot is v1.1.0 and the complete manuscript/benchmark/Word-document package is frozen at tag v1.1.0-paper. The public repository is https://github.com/Zhangzhishuai-HIT/PlantMR, and the source archive `release/PlantMR_v1.1.0-paper_source.zip` is included for submission as supplementary software. A Zenodo or equivalent archival DOI remains to be assigned.</w:t>
       </w:r>
     </w:p>
     <w:p>
@@ -5241,7 +5241,7 @@
                 <w:b w:val="0"/>
                 <w:sz w:val="16"/>
               </w:rPr>
-              <w:t>Public GitHub/GitLab URL to be supplied before submission; local frozen source archive is included.</w:t>
+              <w:t>https://github.com/Zhangzhishuai-HIT/PlantMR</w:t>
             </w:r>
           </w:p>
         </w:tc>
@@ -6115,7 +6115,7 @@
                 <w:b w:val="0"/>
                 <w:sz w:val="17"/>
               </w:rPr>
-              <w:t>Public source data and derived audit materials are described above; public repository URL/DOI to be added.</w:t>
+              <w:t>Public source data and derived audit materials are described above; code is available at https://github.com/Zhangzhishuai-HIT/PlantMR; archival DOI pending.</w:t>
             </w:r>
           </w:p>
         </w:tc>

</xml_diff>

<commit_message>
paper: add fair MR-GxE comparison and render final manuscript
</commit_message>
<xml_diff>
--- a/docs/PlantMR_submission_manuscript.docx
+++ b/docs/PlantMR_submission_manuscript.docx
@@ -2591,6 +2591,1365 @@
         <w:pStyle w:val="Heading2"/>
       </w:pPr>
       <w:r>
+        <w:t>Shared-input external-method comparison</w:t>
+      </w:r>
+    </w:p>
+    <w:p>
+      <w:pPr>
+        <w:spacing w:line="269" w:lineRule="auto" w:after="100"/>
+      </w:pPr>
+      <w:r>
+        <w:t>We implemented a narrow summary-data MR-GxE comparator following the three-step construction of Spiller et al.[14] The comparator forms one fixed weighted allele score from exposure associations only within each environment, obtains score–exposure and score–outcome associations, and regresses the latter on the former with an intercept. The same 20 SNPs, four environment strata, environment-correlation matrix, standard errors and 500 replicates per scenario were passed to both methods. The comparison is method-specific rather than a single performance leaderboard: PlantMR estimates an environment-effect slope, whereas summary MR-GxE estimates an invariant causal effect and a constant-pleiotropy intercept.</w:t>
+      </w:r>
+    </w:p>
+    <w:p>
+      <w:pPr>
+        <w:spacing w:line="269" w:lineRule="auto" w:after="40"/>
+      </w:pPr>
+      <w:r>
+        <w:t>Table 4. Shared-input PlantMR versus summary-data MR-GxE benchmark. Bias and coverage are reported only where the method’s estimand is defined by the simulated data-generating model; out-of-target outputs are retained as diagnostics.</w:t>
+      </w:r>
+    </w:p>
+    <w:tbl>
+      <w:tblPr>
+        <w:tblStyle w:val="TableGrid"/>
+        <w:tblW w:type="auto" w:w="0"/>
+        <w:jc w:val="center"/>
+        <w:tblLook w:firstColumn="1" w:firstRow="1" w:lastColumn="0" w:lastRow="0" w:noHBand="0" w:noVBand="1" w:val="04A0"/>
+      </w:tblPr>
+      <w:tblGrid>
+        <w:gridCol w:w="1425"/>
+        <w:gridCol w:w="1425"/>
+        <w:gridCol w:w="1425"/>
+        <w:gridCol w:w="1425"/>
+        <w:gridCol w:w="1425"/>
+        <w:gridCol w:w="1425"/>
+        <w:gridCol w:w="1425"/>
+      </w:tblGrid>
+      <w:tr>
+        <w:tc>
+          <w:tcPr>
+            <w:tcW w:type="dxa" w:w="1928"/>
+            <w:vAlign w:val="center"/>
+            <w:shd w:fill="17365D"/>
+          </w:tcPr>
+          <w:p>
+            <w:pPr>
+              <w:spacing w:after="0"/>
+            </w:pPr>
+            <w:r/>
+            <w:r>
+              <w:rPr>
+                <w:b/>
+                <w:color w:val="FFFFFF"/>
+                <w:sz w:val="14"/>
+              </w:rPr>
+              <w:t>Scenario</w:t>
+            </w:r>
+          </w:p>
+        </w:tc>
+        <w:tc>
+          <w:tcPr>
+            <w:tcW w:type="dxa" w:w="2268"/>
+            <w:vAlign w:val="center"/>
+            <w:shd w:fill="17365D"/>
+          </w:tcPr>
+          <w:p>
+            <w:pPr>
+              <w:spacing w:after="0"/>
+            </w:pPr>
+            <w:r/>
+            <w:r>
+              <w:rPr>
+                <w:b/>
+                <w:color w:val="FFFFFF"/>
+                <w:sz w:val="14"/>
+              </w:rPr>
+              <w:t>Method / target</w:t>
+            </w:r>
+          </w:p>
+        </w:tc>
+        <w:tc>
+          <w:tcPr>
+            <w:tcW w:type="dxa" w:w="1361"/>
+            <w:vAlign w:val="center"/>
+            <w:shd w:fill="17365D"/>
+          </w:tcPr>
+          <w:p>
+            <w:pPr>
+              <w:spacing w:after="0"/>
+            </w:pPr>
+            <w:r/>
+            <w:r>
+              <w:rPr>
+                <w:b/>
+                <w:color w:val="FFFFFF"/>
+                <w:sz w:val="14"/>
+              </w:rPr>
+              <w:t>Mean estimate</w:t>
+            </w:r>
+          </w:p>
+        </w:tc>
+        <w:tc>
+          <w:tcPr>
+            <w:tcW w:type="dxa" w:w="1020"/>
+            <w:vAlign w:val="center"/>
+            <w:shd w:fill="17365D"/>
+          </w:tcPr>
+          <w:p>
+            <w:pPr>
+              <w:spacing w:after="0"/>
+            </w:pPr>
+            <w:r/>
+            <w:r>
+              <w:rPr>
+                <w:b/>
+                <w:color w:val="FFFFFF"/>
+                <w:sz w:val="14"/>
+              </w:rPr>
+              <w:t>Bias</w:t>
+            </w:r>
+          </w:p>
+        </w:tc>
+        <w:tc>
+          <w:tcPr>
+            <w:tcW w:type="dxa" w:w="1191"/>
+            <w:vAlign w:val="center"/>
+            <w:shd w:fill="17365D"/>
+          </w:tcPr>
+          <w:p>
+            <w:pPr>
+              <w:spacing w:after="0"/>
+            </w:pPr>
+            <w:r/>
+            <w:r>
+              <w:rPr>
+                <w:b/>
+                <w:color w:val="FFFFFF"/>
+                <w:sz w:val="14"/>
+              </w:rPr>
+              <w:t>Coverage</w:t>
+            </w:r>
+          </w:p>
+        </w:tc>
+        <w:tc>
+          <w:tcPr>
+            <w:tcW w:type="dxa" w:w="1134"/>
+            <w:vAlign w:val="center"/>
+            <w:shd w:fill="17365D"/>
+          </w:tcPr>
+          <w:p>
+            <w:pPr>
+              <w:spacing w:after="0"/>
+            </w:pPr>
+            <w:r/>
+            <w:r>
+              <w:rPr>
+                <w:b/>
+                <w:color w:val="FFFFFF"/>
+                <w:sz w:val="14"/>
+              </w:rPr>
+              <w:t>Rejection</w:t>
+            </w:r>
+          </w:p>
+        </w:tc>
+        <w:tc>
+          <w:tcPr>
+            <w:tcW w:type="dxa" w:w="2835"/>
+            <w:vAlign w:val="center"/>
+            <w:shd w:fill="17365D"/>
+          </w:tcPr>
+          <w:p>
+            <w:pPr>
+              <w:spacing w:after="0"/>
+            </w:pPr>
+            <w:r/>
+            <w:r>
+              <w:rPr>
+                <w:b/>
+                <w:color w:val="FFFFFF"/>
+                <w:sz w:val="14"/>
+              </w:rPr>
+              <w:t>Interpretation</w:t>
+            </w:r>
+          </w:p>
+        </w:tc>
+      </w:tr>
+      <w:tr>
+        <w:tc>
+          <w:tcPr>
+            <w:tcW w:type="dxa" w:w="1928"/>
+            <w:vAlign w:val="center"/>
+          </w:tcPr>
+          <w:p>
+            <w:pPr>
+              <w:spacing w:after="0"/>
+            </w:pPr>
+            <w:r/>
+            <w:r>
+              <w:rPr>
+                <w:b w:val="0"/>
+                <w:sz w:val="14"/>
+              </w:rPr>
+              <w:t>Null causal + pleiotropy</w:t>
+            </w:r>
+          </w:p>
+        </w:tc>
+        <w:tc>
+          <w:tcPr>
+            <w:tcW w:type="dxa" w:w="2268"/>
+            <w:vAlign w:val="center"/>
+          </w:tcPr>
+          <w:p>
+            <w:pPr>
+              <w:spacing w:after="0"/>
+            </w:pPr>
+            <w:r/>
+            <w:r>
+              <w:rPr>
+                <w:b w:val="0"/>
+                <w:sz w:val="14"/>
+              </w:rPr>
+              <w:t>Summary MR-GxE / causal effect</w:t>
+            </w:r>
+          </w:p>
+        </w:tc>
+        <w:tc>
+          <w:tcPr>
+            <w:tcW w:type="dxa" w:w="1361"/>
+            <w:vAlign w:val="center"/>
+          </w:tcPr>
+          <w:p>
+            <w:pPr>
+              <w:spacing w:after="0"/>
+            </w:pPr>
+            <w:r/>
+            <w:r>
+              <w:rPr>
+                <w:b w:val="0"/>
+                <w:sz w:val="14"/>
+              </w:rPr>
+              <w:t>−0.0021</w:t>
+            </w:r>
+          </w:p>
+        </w:tc>
+        <w:tc>
+          <w:tcPr>
+            <w:tcW w:type="dxa" w:w="1020"/>
+            <w:vAlign w:val="center"/>
+          </w:tcPr>
+          <w:p>
+            <w:pPr>
+              <w:spacing w:after="0"/>
+            </w:pPr>
+            <w:r/>
+            <w:r>
+              <w:rPr>
+                <w:b w:val="0"/>
+                <w:sz w:val="14"/>
+              </w:rPr>
+              <w:t>−0.0021</w:t>
+            </w:r>
+          </w:p>
+        </w:tc>
+        <w:tc>
+          <w:tcPr>
+            <w:tcW w:type="dxa" w:w="1191"/>
+            <w:vAlign w:val="center"/>
+          </w:tcPr>
+          <w:p>
+            <w:pPr>
+              <w:spacing w:after="0"/>
+            </w:pPr>
+            <w:r/>
+            <w:r>
+              <w:rPr>
+                <w:b w:val="0"/>
+                <w:sz w:val="14"/>
+              </w:rPr>
+              <w:t>0.934</w:t>
+            </w:r>
+          </w:p>
+        </w:tc>
+        <w:tc>
+          <w:tcPr>
+            <w:tcW w:type="dxa" w:w="1134"/>
+            <w:vAlign w:val="center"/>
+          </w:tcPr>
+          <w:p>
+            <w:pPr>
+              <w:spacing w:after="0"/>
+            </w:pPr>
+            <w:r/>
+            <w:r>
+              <w:rPr>
+                <w:b w:val="0"/>
+                <w:sz w:val="14"/>
+              </w:rPr>
+              <w:t>0.066</w:t>
+            </w:r>
+          </w:p>
+        </w:tc>
+        <w:tc>
+          <w:tcPr>
+            <w:tcW w:type="dxa" w:w="2835"/>
+            <w:vAlign w:val="center"/>
+          </w:tcPr>
+          <w:p>
+            <w:pPr>
+              <w:spacing w:after="0"/>
+            </w:pPr>
+            <w:r/>
+            <w:r>
+              <w:rPr>
+                <w:b w:val="0"/>
+                <w:sz w:val="14"/>
+              </w:rPr>
+              <w:t>Target-defined causal calibration</w:t>
+            </w:r>
+          </w:p>
+        </w:tc>
+      </w:tr>
+      <w:tr>
+        <w:tc>
+          <w:tcPr>
+            <w:tcW w:type="dxa" w:w="1928"/>
+            <w:vAlign w:val="center"/>
+            <w:shd w:fill="F4F6F8"/>
+          </w:tcPr>
+          <w:p>
+            <w:pPr>
+              <w:spacing w:after="0"/>
+            </w:pPr>
+            <w:r/>
+            <w:r>
+              <w:rPr>
+                <w:b w:val="0"/>
+                <w:sz w:val="14"/>
+              </w:rPr>
+              <w:t>Null causal + pleiotropy</w:t>
+            </w:r>
+          </w:p>
+        </w:tc>
+        <w:tc>
+          <w:tcPr>
+            <w:tcW w:type="dxa" w:w="2268"/>
+            <w:vAlign w:val="center"/>
+            <w:shd w:fill="F4F6F8"/>
+          </w:tcPr>
+          <w:p>
+            <w:pPr>
+              <w:spacing w:after="0"/>
+            </w:pPr>
+            <w:r/>
+            <w:r>
+              <w:rPr>
+                <w:b w:val="0"/>
+                <w:sz w:val="14"/>
+              </w:rPr>
+              <w:t>PlantMR / environment slope</w:t>
+            </w:r>
+          </w:p>
+        </w:tc>
+        <w:tc>
+          <w:tcPr>
+            <w:tcW w:type="dxa" w:w="1361"/>
+            <w:vAlign w:val="center"/>
+            <w:shd w:fill="F4F6F8"/>
+          </w:tcPr>
+          <w:p>
+            <w:pPr>
+              <w:spacing w:after="0"/>
+            </w:pPr>
+            <w:r/>
+            <w:r>
+              <w:rPr>
+                <w:b w:val="0"/>
+                <w:sz w:val="14"/>
+              </w:rPr>
+              <w:t>−0.0692</w:t>
+            </w:r>
+          </w:p>
+        </w:tc>
+        <w:tc>
+          <w:tcPr>
+            <w:tcW w:type="dxa" w:w="1020"/>
+            <w:vAlign w:val="center"/>
+            <w:shd w:fill="F4F6F8"/>
+          </w:tcPr>
+          <w:p>
+            <w:pPr>
+              <w:spacing w:after="0"/>
+            </w:pPr>
+            <w:r/>
+            <w:r>
+              <w:rPr>
+                <w:b w:val="0"/>
+                <w:sz w:val="14"/>
+              </w:rPr>
+              <w:t>—</w:t>
+            </w:r>
+          </w:p>
+        </w:tc>
+        <w:tc>
+          <w:tcPr>
+            <w:tcW w:type="dxa" w:w="1191"/>
+            <w:vAlign w:val="center"/>
+            <w:shd w:fill="F4F6F8"/>
+          </w:tcPr>
+          <w:p>
+            <w:pPr>
+              <w:spacing w:after="0"/>
+            </w:pPr>
+            <w:r/>
+            <w:r>
+              <w:rPr>
+                <w:b w:val="0"/>
+                <w:sz w:val="14"/>
+              </w:rPr>
+              <w:t>—</w:t>
+            </w:r>
+          </w:p>
+        </w:tc>
+        <w:tc>
+          <w:tcPr>
+            <w:tcW w:type="dxa" w:w="1134"/>
+            <w:vAlign w:val="center"/>
+            <w:shd w:fill="F4F6F8"/>
+          </w:tcPr>
+          <w:p>
+            <w:pPr>
+              <w:spacing w:after="0"/>
+            </w:pPr>
+            <w:r/>
+            <w:r>
+              <w:rPr>
+                <w:b w:val="0"/>
+                <w:sz w:val="14"/>
+              </w:rPr>
+              <w:t>—</w:t>
+            </w:r>
+          </w:p>
+        </w:tc>
+        <w:tc>
+          <w:tcPr>
+            <w:tcW w:type="dxa" w:w="2835"/>
+            <w:vAlign w:val="center"/>
+            <w:shd w:fill="F4F6F8"/>
+          </w:tcPr>
+          <w:p>
+            <w:pPr>
+              <w:spacing w:after="0"/>
+            </w:pPr>
+            <w:r/>
+            <w:r>
+              <w:rPr>
+                <w:b w:val="0"/>
+                <w:sz w:val="14"/>
+              </w:rPr>
+              <w:t>Diagnostic only: pleiotropy makes slope non-causal</w:t>
+            </w:r>
+          </w:p>
+        </w:tc>
+      </w:tr>
+      <w:tr>
+        <w:tc>
+          <w:tcPr>
+            <w:tcW w:type="dxa" w:w="1928"/>
+            <w:vAlign w:val="center"/>
+          </w:tcPr>
+          <w:p>
+            <w:pPr>
+              <w:spacing w:after="0"/>
+            </w:pPr>
+            <w:r/>
+            <w:r>
+              <w:rPr>
+                <w:b w:val="0"/>
+                <w:sz w:val="14"/>
+              </w:rPr>
+              <w:t>Constant effect, no pleiotropy</w:t>
+            </w:r>
+          </w:p>
+        </w:tc>
+        <w:tc>
+          <w:tcPr>
+            <w:tcW w:type="dxa" w:w="2268"/>
+            <w:vAlign w:val="center"/>
+          </w:tcPr>
+          <w:p>
+            <w:pPr>
+              <w:spacing w:after="0"/>
+            </w:pPr>
+            <w:r/>
+            <w:r>
+              <w:rPr>
+                <w:b w:val="0"/>
+                <w:sz w:val="14"/>
+              </w:rPr>
+              <w:t>PlantMR / environment slope</w:t>
+            </w:r>
+          </w:p>
+        </w:tc>
+        <w:tc>
+          <w:tcPr>
+            <w:tcW w:type="dxa" w:w="1361"/>
+            <w:vAlign w:val="center"/>
+          </w:tcPr>
+          <w:p>
+            <w:pPr>
+              <w:spacing w:after="0"/>
+            </w:pPr>
+            <w:r/>
+            <w:r>
+              <w:rPr>
+                <w:b w:val="0"/>
+                <w:sz w:val="14"/>
+              </w:rPr>
+              <w:t>0.0036</w:t>
+            </w:r>
+          </w:p>
+        </w:tc>
+        <w:tc>
+          <w:tcPr>
+            <w:tcW w:type="dxa" w:w="1020"/>
+            <w:vAlign w:val="center"/>
+          </w:tcPr>
+          <w:p>
+            <w:pPr>
+              <w:spacing w:after="0"/>
+            </w:pPr>
+            <w:r/>
+            <w:r>
+              <w:rPr>
+                <w:b w:val="0"/>
+                <w:sz w:val="14"/>
+              </w:rPr>
+              <w:t>0.0036</w:t>
+            </w:r>
+          </w:p>
+        </w:tc>
+        <w:tc>
+          <w:tcPr>
+            <w:tcW w:type="dxa" w:w="1191"/>
+            <w:vAlign w:val="center"/>
+          </w:tcPr>
+          <w:p>
+            <w:pPr>
+              <w:spacing w:after="0"/>
+            </w:pPr>
+            <w:r/>
+            <w:r>
+              <w:rPr>
+                <w:b w:val="0"/>
+                <w:sz w:val="14"/>
+              </w:rPr>
+              <w:t>0.938</w:t>
+            </w:r>
+          </w:p>
+        </w:tc>
+        <w:tc>
+          <w:tcPr>
+            <w:tcW w:type="dxa" w:w="1134"/>
+            <w:vAlign w:val="center"/>
+          </w:tcPr>
+          <w:p>
+            <w:pPr>
+              <w:spacing w:after="0"/>
+            </w:pPr>
+            <w:r/>
+            <w:r>
+              <w:rPr>
+                <w:b w:val="0"/>
+                <w:sz w:val="14"/>
+              </w:rPr>
+              <w:t>0.062</w:t>
+            </w:r>
+          </w:p>
+        </w:tc>
+        <w:tc>
+          <w:tcPr>
+            <w:tcW w:type="dxa" w:w="2835"/>
+            <w:vAlign w:val="center"/>
+          </w:tcPr>
+          <w:p>
+            <w:pPr>
+              <w:spacing w:after="0"/>
+            </w:pPr>
+            <w:r/>
+            <w:r>
+              <w:rPr>
+                <w:b w:val="0"/>
+                <w:sz w:val="14"/>
+              </w:rPr>
+              <w:t>Target-defined heterogeneity calibration</w:t>
+            </w:r>
+          </w:p>
+        </w:tc>
+      </w:tr>
+      <w:tr>
+        <w:tc>
+          <w:tcPr>
+            <w:tcW w:type="dxa" w:w="1928"/>
+            <w:vAlign w:val="center"/>
+            <w:shd w:fill="F4F6F8"/>
+          </w:tcPr>
+          <w:p>
+            <w:pPr>
+              <w:spacing w:after="0"/>
+            </w:pPr>
+            <w:r/>
+            <w:r>
+              <w:rPr>
+                <w:b w:val="0"/>
+                <w:sz w:val="14"/>
+              </w:rPr>
+              <w:t>Constant effect, no pleiotropy</w:t>
+            </w:r>
+          </w:p>
+        </w:tc>
+        <w:tc>
+          <w:tcPr>
+            <w:tcW w:type="dxa" w:w="2268"/>
+            <w:vAlign w:val="center"/>
+            <w:shd w:fill="F4F6F8"/>
+          </w:tcPr>
+          <w:p>
+            <w:pPr>
+              <w:spacing w:after="0"/>
+            </w:pPr>
+            <w:r/>
+            <w:r>
+              <w:rPr>
+                <w:b w:val="0"/>
+                <w:sz w:val="14"/>
+              </w:rPr>
+              <w:t>Summary MR-GxE / causal effect</w:t>
+            </w:r>
+          </w:p>
+        </w:tc>
+        <w:tc>
+          <w:tcPr>
+            <w:tcW w:type="dxa" w:w="1361"/>
+            <w:vAlign w:val="center"/>
+            <w:shd w:fill="F4F6F8"/>
+          </w:tcPr>
+          <w:p>
+            <w:pPr>
+              <w:spacing w:after="0"/>
+            </w:pPr>
+            <w:r/>
+            <w:r>
+              <w:rPr>
+                <w:b w:val="0"/>
+                <w:sz w:val="14"/>
+              </w:rPr>
+              <w:t>0.5003</w:t>
+            </w:r>
+          </w:p>
+        </w:tc>
+        <w:tc>
+          <w:tcPr>
+            <w:tcW w:type="dxa" w:w="1020"/>
+            <w:vAlign w:val="center"/>
+            <w:shd w:fill="F4F6F8"/>
+          </w:tcPr>
+          <w:p>
+            <w:pPr>
+              <w:spacing w:after="0"/>
+            </w:pPr>
+            <w:r/>
+            <w:r>
+              <w:rPr>
+                <w:b w:val="0"/>
+                <w:sz w:val="14"/>
+              </w:rPr>
+              <w:t>0.0003</w:t>
+            </w:r>
+          </w:p>
+        </w:tc>
+        <w:tc>
+          <w:tcPr>
+            <w:tcW w:type="dxa" w:w="1191"/>
+            <w:vAlign w:val="center"/>
+            <w:shd w:fill="F4F6F8"/>
+          </w:tcPr>
+          <w:p>
+            <w:pPr>
+              <w:spacing w:after="0"/>
+            </w:pPr>
+            <w:r/>
+            <w:r>
+              <w:rPr>
+                <w:b w:val="0"/>
+                <w:sz w:val="14"/>
+              </w:rPr>
+              <w:t>0.958</w:t>
+            </w:r>
+          </w:p>
+        </w:tc>
+        <w:tc>
+          <w:tcPr>
+            <w:tcW w:type="dxa" w:w="1134"/>
+            <w:vAlign w:val="center"/>
+            <w:shd w:fill="F4F6F8"/>
+          </w:tcPr>
+          <w:p>
+            <w:pPr>
+              <w:spacing w:after="0"/>
+            </w:pPr>
+            <w:r/>
+            <w:r>
+              <w:rPr>
+                <w:b w:val="0"/>
+                <w:sz w:val="14"/>
+              </w:rPr>
+              <w:t>1.000</w:t>
+            </w:r>
+          </w:p>
+        </w:tc>
+        <w:tc>
+          <w:tcPr>
+            <w:tcW w:type="dxa" w:w="2835"/>
+            <w:vAlign w:val="center"/>
+            <w:shd w:fill="F4F6F8"/>
+          </w:tcPr>
+          <w:p>
+            <w:pPr>
+              <w:spacing w:after="0"/>
+            </w:pPr>
+            <w:r/>
+            <w:r>
+              <w:rPr>
+                <w:b w:val="0"/>
+                <w:sz w:val="14"/>
+              </w:rPr>
+              <w:t>Target-defined causal calibration</w:t>
+            </w:r>
+          </w:p>
+        </w:tc>
+      </w:tr>
+      <w:tr>
+        <w:tc>
+          <w:tcPr>
+            <w:tcW w:type="dxa" w:w="1928"/>
+            <w:vAlign w:val="center"/>
+          </w:tcPr>
+          <w:p>
+            <w:pPr>
+              <w:spacing w:after="0"/>
+            </w:pPr>
+            <w:r/>
+            <w:r>
+              <w:rPr>
+                <w:b w:val="0"/>
+                <w:sz w:val="14"/>
+              </w:rPr>
+              <w:t>Constant effect + pleiotropy</w:t>
+            </w:r>
+          </w:p>
+        </w:tc>
+        <w:tc>
+          <w:tcPr>
+            <w:tcW w:type="dxa" w:w="2268"/>
+            <w:vAlign w:val="center"/>
+          </w:tcPr>
+          <w:p>
+            <w:pPr>
+              <w:spacing w:after="0"/>
+            </w:pPr>
+            <w:r/>
+            <w:r>
+              <w:rPr>
+                <w:b w:val="0"/>
+                <w:sz w:val="14"/>
+              </w:rPr>
+              <w:t>Summary MR-GxE / causal effect</w:t>
+            </w:r>
+          </w:p>
+        </w:tc>
+        <w:tc>
+          <w:tcPr>
+            <w:tcW w:type="dxa" w:w="1361"/>
+            <w:vAlign w:val="center"/>
+          </w:tcPr>
+          <w:p>
+            <w:pPr>
+              <w:spacing w:after="0"/>
+            </w:pPr>
+            <w:r/>
+            <w:r>
+              <w:rPr>
+                <w:b w:val="0"/>
+                <w:sz w:val="14"/>
+              </w:rPr>
+              <w:t>0.4983</w:t>
+            </w:r>
+          </w:p>
+        </w:tc>
+        <w:tc>
+          <w:tcPr>
+            <w:tcW w:type="dxa" w:w="1020"/>
+            <w:vAlign w:val="center"/>
+          </w:tcPr>
+          <w:p>
+            <w:pPr>
+              <w:spacing w:after="0"/>
+            </w:pPr>
+            <w:r/>
+            <w:r>
+              <w:rPr>
+                <w:b w:val="0"/>
+                <w:sz w:val="14"/>
+              </w:rPr>
+              <w:t>−0.0017</w:t>
+            </w:r>
+          </w:p>
+        </w:tc>
+        <w:tc>
+          <w:tcPr>
+            <w:tcW w:type="dxa" w:w="1191"/>
+            <w:vAlign w:val="center"/>
+          </w:tcPr>
+          <w:p>
+            <w:pPr>
+              <w:spacing w:after="0"/>
+            </w:pPr>
+            <w:r/>
+            <w:r>
+              <w:rPr>
+                <w:b w:val="0"/>
+                <w:sz w:val="14"/>
+              </w:rPr>
+              <w:t>0.938</w:t>
+            </w:r>
+          </w:p>
+        </w:tc>
+        <w:tc>
+          <w:tcPr>
+            <w:tcW w:type="dxa" w:w="1134"/>
+            <w:vAlign w:val="center"/>
+          </w:tcPr>
+          <w:p>
+            <w:pPr>
+              <w:spacing w:after="0"/>
+            </w:pPr>
+            <w:r/>
+            <w:r>
+              <w:rPr>
+                <w:b w:val="0"/>
+                <w:sz w:val="14"/>
+              </w:rPr>
+              <w:t>1.000</w:t>
+            </w:r>
+          </w:p>
+        </w:tc>
+        <w:tc>
+          <w:tcPr>
+            <w:tcW w:type="dxa" w:w="2835"/>
+            <w:vAlign w:val="center"/>
+          </w:tcPr>
+          <w:p>
+            <w:pPr>
+              <w:spacing w:after="0"/>
+            </w:pPr>
+            <w:r/>
+            <w:r>
+              <w:rPr>
+                <w:b w:val="0"/>
+                <w:sz w:val="14"/>
+              </w:rPr>
+              <w:t>Correct causal target under constant pleiotropy</w:t>
+            </w:r>
+          </w:p>
+        </w:tc>
+      </w:tr>
+      <w:tr>
+        <w:tc>
+          <w:tcPr>
+            <w:tcW w:type="dxa" w:w="1928"/>
+            <w:vAlign w:val="center"/>
+            <w:shd w:fill="F4F6F8"/>
+          </w:tcPr>
+          <w:p>
+            <w:pPr>
+              <w:spacing w:after="0"/>
+            </w:pPr>
+            <w:r/>
+            <w:r>
+              <w:rPr>
+                <w:b w:val="0"/>
+                <w:sz w:val="14"/>
+              </w:rPr>
+              <w:t>Constant effect + pleiotropy</w:t>
+            </w:r>
+          </w:p>
+        </w:tc>
+        <w:tc>
+          <w:tcPr>
+            <w:tcW w:type="dxa" w:w="2268"/>
+            <w:vAlign w:val="center"/>
+            <w:shd w:fill="F4F6F8"/>
+          </w:tcPr>
+          <w:p>
+            <w:pPr>
+              <w:spacing w:after="0"/>
+            </w:pPr>
+            <w:r/>
+            <w:r>
+              <w:rPr>
+                <w:b w:val="0"/>
+                <w:sz w:val="14"/>
+              </w:rPr>
+              <w:t>PlantMR / environment slope</w:t>
+            </w:r>
+          </w:p>
+        </w:tc>
+        <w:tc>
+          <w:tcPr>
+            <w:tcW w:type="dxa" w:w="1361"/>
+            <w:vAlign w:val="center"/>
+            <w:shd w:fill="F4F6F8"/>
+          </w:tcPr>
+          <w:p>
+            <w:pPr>
+              <w:spacing w:after="0"/>
+            </w:pPr>
+            <w:r/>
+            <w:r>
+              <w:rPr>
+                <w:b w:val="0"/>
+                <w:sz w:val="14"/>
+              </w:rPr>
+              <w:t>−0.0653</w:t>
+            </w:r>
+          </w:p>
+        </w:tc>
+        <w:tc>
+          <w:tcPr>
+            <w:tcW w:type="dxa" w:w="1020"/>
+            <w:vAlign w:val="center"/>
+            <w:shd w:fill="F4F6F8"/>
+          </w:tcPr>
+          <w:p>
+            <w:pPr>
+              <w:spacing w:after="0"/>
+            </w:pPr>
+            <w:r/>
+            <w:r>
+              <w:rPr>
+                <w:b w:val="0"/>
+                <w:sz w:val="14"/>
+              </w:rPr>
+              <w:t>—</w:t>
+            </w:r>
+          </w:p>
+        </w:tc>
+        <w:tc>
+          <w:tcPr>
+            <w:tcW w:type="dxa" w:w="1191"/>
+            <w:vAlign w:val="center"/>
+            <w:shd w:fill="F4F6F8"/>
+          </w:tcPr>
+          <w:p>
+            <w:pPr>
+              <w:spacing w:after="0"/>
+            </w:pPr>
+            <w:r/>
+            <w:r>
+              <w:rPr>
+                <w:b w:val="0"/>
+                <w:sz w:val="14"/>
+              </w:rPr>
+              <w:t>—</w:t>
+            </w:r>
+          </w:p>
+        </w:tc>
+        <w:tc>
+          <w:tcPr>
+            <w:tcW w:type="dxa" w:w="1134"/>
+            <w:vAlign w:val="center"/>
+            <w:shd w:fill="F4F6F8"/>
+          </w:tcPr>
+          <w:p>
+            <w:pPr>
+              <w:spacing w:after="0"/>
+            </w:pPr>
+            <w:r/>
+            <w:r>
+              <w:rPr>
+                <w:b w:val="0"/>
+                <w:sz w:val="14"/>
+              </w:rPr>
+              <w:t>—</w:t>
+            </w:r>
+          </w:p>
+        </w:tc>
+        <w:tc>
+          <w:tcPr>
+            <w:tcW w:type="dxa" w:w="2835"/>
+            <w:vAlign w:val="center"/>
+            <w:shd w:fill="F4F6F8"/>
+          </w:tcPr>
+          <w:p>
+            <w:pPr>
+              <w:spacing w:after="0"/>
+            </w:pPr>
+            <w:r/>
+            <w:r>
+              <w:rPr>
+                <w:b w:val="0"/>
+                <w:sz w:val="14"/>
+              </w:rPr>
+              <w:t>Diagnostic only: not a causal slope</w:t>
+            </w:r>
+          </w:p>
+        </w:tc>
+      </w:tr>
+      <w:tr>
+        <w:tc>
+          <w:tcPr>
+            <w:tcW w:type="dxa" w:w="1928"/>
+            <w:vAlign w:val="center"/>
+          </w:tcPr>
+          <w:p>
+            <w:pPr>
+              <w:spacing w:after="0"/>
+            </w:pPr>
+            <w:r/>
+            <w:r>
+              <w:rPr>
+                <w:b w:val="0"/>
+                <w:sz w:val="14"/>
+              </w:rPr>
+              <w:t>Environment-effect heterogeneity</w:t>
+            </w:r>
+          </w:p>
+        </w:tc>
+        <w:tc>
+          <w:tcPr>
+            <w:tcW w:type="dxa" w:w="2268"/>
+            <w:vAlign w:val="center"/>
+          </w:tcPr>
+          <w:p>
+            <w:pPr>
+              <w:spacing w:after="0"/>
+            </w:pPr>
+            <w:r/>
+            <w:r>
+              <w:rPr>
+                <w:b w:val="0"/>
+                <w:sz w:val="14"/>
+              </w:rPr>
+              <w:t>PlantMR / environment slope</w:t>
+            </w:r>
+          </w:p>
+        </w:tc>
+        <w:tc>
+          <w:tcPr>
+            <w:tcW w:type="dxa" w:w="1361"/>
+            <w:vAlign w:val="center"/>
+          </w:tcPr>
+          <w:p>
+            <w:pPr>
+              <w:spacing w:after="0"/>
+            </w:pPr>
+            <w:r/>
+            <w:r>
+              <w:rPr>
+                <w:b w:val="0"/>
+                <w:sz w:val="14"/>
+              </w:rPr>
+              <w:t>0.2515</w:t>
+            </w:r>
+          </w:p>
+        </w:tc>
+        <w:tc>
+          <w:tcPr>
+            <w:tcW w:type="dxa" w:w="1020"/>
+            <w:vAlign w:val="center"/>
+          </w:tcPr>
+          <w:p>
+            <w:pPr>
+              <w:spacing w:after="0"/>
+            </w:pPr>
+            <w:r/>
+            <w:r>
+              <w:rPr>
+                <w:b w:val="0"/>
+                <w:sz w:val="14"/>
+              </w:rPr>
+              <w:t>0.0015</w:t>
+            </w:r>
+          </w:p>
+        </w:tc>
+        <w:tc>
+          <w:tcPr>
+            <w:tcW w:type="dxa" w:w="1191"/>
+            <w:vAlign w:val="center"/>
+          </w:tcPr>
+          <w:p>
+            <w:pPr>
+              <w:spacing w:after="0"/>
+            </w:pPr>
+            <w:r/>
+            <w:r>
+              <w:rPr>
+                <w:b w:val="0"/>
+                <w:sz w:val="14"/>
+              </w:rPr>
+              <w:t>0.942</w:t>
+            </w:r>
+          </w:p>
+        </w:tc>
+        <w:tc>
+          <w:tcPr>
+            <w:tcW w:type="dxa" w:w="1134"/>
+            <w:vAlign w:val="center"/>
+          </w:tcPr>
+          <w:p>
+            <w:pPr>
+              <w:spacing w:after="0"/>
+            </w:pPr>
+            <w:r/>
+            <w:r>
+              <w:rPr>
+                <w:b w:val="0"/>
+                <w:sz w:val="14"/>
+              </w:rPr>
+              <w:t>1.000</w:t>
+            </w:r>
+          </w:p>
+        </w:tc>
+        <w:tc>
+          <w:tcPr>
+            <w:tcW w:type="dxa" w:w="2835"/>
+            <w:vAlign w:val="center"/>
+          </w:tcPr>
+          <w:p>
+            <w:pPr>
+              <w:spacing w:after="0"/>
+            </w:pPr>
+            <w:r/>
+            <w:r>
+              <w:rPr>
+                <w:b w:val="0"/>
+                <w:sz w:val="14"/>
+              </w:rPr>
+              <w:t>Correct environment-slope target</w:t>
+            </w:r>
+          </w:p>
+        </w:tc>
+      </w:tr>
+      <w:tr>
+        <w:tc>
+          <w:tcPr>
+            <w:tcW w:type="dxa" w:w="1928"/>
+            <w:vAlign w:val="center"/>
+            <w:shd w:fill="F4F6F8"/>
+          </w:tcPr>
+          <w:p>
+            <w:pPr>
+              <w:spacing w:after="0"/>
+            </w:pPr>
+            <w:r/>
+            <w:r>
+              <w:rPr>
+                <w:b w:val="0"/>
+                <w:sz w:val="14"/>
+              </w:rPr>
+              <w:t>Environment-effect heterogeneity</w:t>
+            </w:r>
+          </w:p>
+        </w:tc>
+        <w:tc>
+          <w:tcPr>
+            <w:tcW w:type="dxa" w:w="2268"/>
+            <w:vAlign w:val="center"/>
+            <w:shd w:fill="F4F6F8"/>
+          </w:tcPr>
+          <w:p>
+            <w:pPr>
+              <w:spacing w:after="0"/>
+            </w:pPr>
+            <w:r/>
+            <w:r>
+              <w:rPr>
+                <w:b w:val="0"/>
+                <w:sz w:val="14"/>
+              </w:rPr>
+              <w:t>Summary MR-GxE / causal effect</w:t>
+            </w:r>
+          </w:p>
+        </w:tc>
+        <w:tc>
+          <w:tcPr>
+            <w:tcW w:type="dxa" w:w="1361"/>
+            <w:vAlign w:val="center"/>
+            <w:shd w:fill="F4F6F8"/>
+          </w:tcPr>
+          <w:p>
+            <w:pPr>
+              <w:spacing w:after="0"/>
+            </w:pPr>
+            <w:r/>
+            <w:r>
+              <w:rPr>
+                <w:b w:val="0"/>
+                <w:sz w:val="14"/>
+              </w:rPr>
+              <w:t>1.2143</w:t>
+            </w:r>
+          </w:p>
+        </w:tc>
+        <w:tc>
+          <w:tcPr>
+            <w:tcW w:type="dxa" w:w="1020"/>
+            <w:vAlign w:val="center"/>
+            <w:shd w:fill="F4F6F8"/>
+          </w:tcPr>
+          <w:p>
+            <w:pPr>
+              <w:spacing w:after="0"/>
+            </w:pPr>
+            <w:r/>
+            <w:r>
+              <w:rPr>
+                <w:b w:val="0"/>
+                <w:sz w:val="14"/>
+              </w:rPr>
+              <w:t>—</w:t>
+            </w:r>
+          </w:p>
+        </w:tc>
+        <w:tc>
+          <w:tcPr>
+            <w:tcW w:type="dxa" w:w="1191"/>
+            <w:vAlign w:val="center"/>
+            <w:shd w:fill="F4F6F8"/>
+          </w:tcPr>
+          <w:p>
+            <w:pPr>
+              <w:spacing w:after="0"/>
+            </w:pPr>
+            <w:r/>
+            <w:r>
+              <w:rPr>
+                <w:b w:val="0"/>
+                <w:sz w:val="14"/>
+              </w:rPr>
+              <w:t>—</w:t>
+            </w:r>
+          </w:p>
+        </w:tc>
+        <w:tc>
+          <w:tcPr>
+            <w:tcW w:type="dxa" w:w="1134"/>
+            <w:vAlign w:val="center"/>
+            <w:shd w:fill="F4F6F8"/>
+          </w:tcPr>
+          <w:p>
+            <w:pPr>
+              <w:spacing w:after="0"/>
+            </w:pPr>
+            <w:r/>
+            <w:r>
+              <w:rPr>
+                <w:b w:val="0"/>
+                <w:sz w:val="14"/>
+              </w:rPr>
+              <w:t>—</w:t>
+            </w:r>
+          </w:p>
+        </w:tc>
+        <w:tc>
+          <w:tcPr>
+            <w:tcW w:type="dxa" w:w="2835"/>
+            <w:vAlign w:val="center"/>
+            <w:shd w:fill="F4F6F8"/>
+          </w:tcPr>
+          <w:p>
+            <w:pPr>
+              <w:spacing w:after="0"/>
+            </w:pPr>
+            <w:r/>
+            <w:r>
+              <w:rPr>
+                <w:b w:val="0"/>
+                <w:sz w:val="14"/>
+              </w:rPr>
+              <w:t>Diagnostic only: invariant-effect target not defined</w:t>
+            </w:r>
+          </w:p>
+        </w:tc>
+      </w:tr>
+    </w:tbl>
+    <w:p>
+      <w:pPr>
+        <w:spacing w:after="0"/>
+      </w:pPr>
+    </w:p>
+    <w:p>
+      <w:pPr>
+        <w:spacing w:line="269" w:lineRule="auto" w:after="100"/>
+      </w:pPr>
+      <w:r>
+        <w:t>The comparison supports complementarity rather than a winner. Under constant causal effect with directional pleiotropy, summary MR-GxE recovered the causal effect (mean 0.4983; coverage 0.938), while the PlantMR environment slope was a diagnostic signal caused by the violated exclusion restriction. Under true environment-effect heterogeneity without pleiotropy, PlantMR recovered the slope (mean 0.2515; coverage 0.942), while the summary MR-GxE output does not have the same causal estimand. The external comparator is therefore evidence about scope and assumptions, not a claim that one method dominates the other.</w:t>
+      </w:r>
+    </w:p>
+    <w:p>
+      <w:r>
+        <w:drawing>
+          <wp:inline xmlns:a="http://schemas.openxmlformats.org/drawingml/2006/main" xmlns:pic="http://schemas.openxmlformats.org/drawingml/2006/picture">
+            <wp:extent cx="5989320" cy="2504625"/>
+            <wp:docPr id="4" name="Picture 4"/>
+            <wp:cNvGraphicFramePr>
+              <a:graphicFrameLocks noChangeAspect="1"/>
+            </wp:cNvGraphicFramePr>
+            <a:graphic>
+              <a:graphicData uri="http://schemas.openxmlformats.org/drawingml/2006/picture">
+                <pic:pic>
+                  <pic:nvPicPr>
+                    <pic:cNvPr id="0" name="mr_gxe_head_to_head.png"/>
+                    <pic:cNvPicPr/>
+                  </pic:nvPicPr>
+                  <pic:blipFill>
+                    <a:blip r:embed="rId14"/>
+                    <a:stretch>
+                      <a:fillRect/>
+                    </a:stretch>
+                  </pic:blipFill>
+                  <pic:spPr>
+                    <a:xfrm>
+                      <a:off x="0" y="0"/>
+                      <a:ext cx="5989320" cy="2504625"/>
+                    </a:xfrm>
+                    <a:prstGeom prst="rect"/>
+                  </pic:spPr>
+                </pic:pic>
+              </a:graphicData>
+            </a:graphic>
+          </wp:inline>
+        </w:drawing>
+      </w:r>
+    </w:p>
+    <w:p>
+      <w:pPr>
+        <w:jc w:val="center"/>
+      </w:pPr>
+      <w:r>
+        <w:rPr>
+          <w:i/>
+          <w:sz w:val="18"/>
+        </w:rPr>
+        <w:t>Figure 5. Shared-input comparison. Panel A scores only method/scenario pairs with a defined target. Panel B retains out-of-target estimates as diagnostics and explicitly excludes them from bias and coverage scoring.</w:t>
+      </w:r>
+    </w:p>
+    <w:p>
+      <w:pPr>
+        <w:pStyle w:val="Heading2"/>
+      </w:pPr>
+      <w:r>
         <w:t>Arabidopsis data-contract case</w:t>
       </w:r>
     </w:p>
@@ -2607,7 +3966,7 @@
         <w:spacing w:line="269" w:lineRule="auto" w:after="40"/>
       </w:pPr>
       <w:r>
-        <w:t>Table 4. Arabidopsis data-contract inputs and local processing.</w:t>
+        <w:t>Table 5. Arabidopsis data-contract inputs and local processing.</w:t>
       </w:r>
     </w:p>
     <w:tbl>
@@ -3007,7 +4366,7 @@
         <w:spacing w:line="269" w:lineRule="auto" w:after="40"/>
       </w:pPr>
       <w:r>
-        <w:t>Table 5. Instrument audit for the Arabidopsis case. Exclusion counts are overlapping diagnostics and must not be added as if they were mutually exclusive.</w:t>
+        <w:t>Table 6. Instrument audit for the Arabidopsis case. Exclusion counts are overlapping diagnostics and must not be added as if they were mutually exclusive.</w:t>
       </w:r>
     </w:p>
     <w:tbl>
@@ -3461,7 +4820,7 @@
         <w:spacing w:line="269" w:lineRule="auto" w:after="40"/>
       </w:pPr>
       <w:r>
-        <w:t>Table 6. Environment-stratified comparator estimates. Estimates are local OLS summary-statistics demonstrations and are not independent validation of the causal model.</w:t>
+        <w:t>Table 7. Environment-stratified comparator estimates. Estimates are local OLS summary-statistics demonstrations and are not independent validation of the causal model.</w:t>
       </w:r>
     </w:p>
     <w:tbl>
@@ -4388,7 +5747,7 @@
         <w:drawing>
           <wp:inline xmlns:a="http://schemas.openxmlformats.org/drawingml/2006/main" xmlns:pic="http://schemas.openxmlformats.org/drawingml/2006/picture">
             <wp:extent cx="5989320" cy="1996440"/>
-            <wp:docPr id="4" name="Picture 4"/>
+            <wp:docPr id="5" name="Picture 5"/>
             <wp:cNvGraphicFramePr>
               <a:graphicFrameLocks noChangeAspect="1"/>
             </wp:cNvGraphicFramePr>
@@ -4400,7 +5759,7 @@
                     <pic:cNvPicPr/>
                   </pic:nvPicPr>
                   <pic:blipFill>
-                    <a:blip r:embed="rId14"/>
+                    <a:blip r:embed="rId15"/>
                     <a:stretch>
                       <a:fillRect/>
                     </a:stretch>
@@ -4452,7 +5811,7 @@
         <w:spacing w:line="269" w:lineRule="auto" w:after="40"/>
       </w:pPr>
       <w:r>
-        <w:t>Table 7. Local runtime benchmark for the frozen PlantMR implementation.</w:t>
+        <w:t>Table 8. Local runtime benchmark for the frozen PlantMR implementation.</w:t>
       </w:r>
     </w:p>
     <w:tbl>
@@ -5025,7 +6384,7 @@
         <w:spacing w:after="40"/>
       </w:pPr>
       <w:r>
-        <w:t>Formal head-to-head implementations of MR-GxE, MR-GENIUS and MR-EILLS are not included in v1.1.0. Literature comparisons are conceptual and not benchmark claims.</w:t>
+        <w:t>A full individual-level implementation of MR-GxE, or a head-to-head implementation of MR-GENIUS and MR-EILLS, is not included in v1.1.0. The present external comparator is a narrow summary-data MR-GxE benchmark with method-specific targets.</w:t>
       </w:r>
     </w:p>
     <w:p>
@@ -5034,7 +6393,7 @@
         <w:spacing w:after="40"/>
       </w:pPr>
       <w:r>
-        <w:t>The source package is reproducible locally but a public repository, DOI, clean-environment rerun and independent validation are still required for a final software publication record.</w:t>
+        <w:t>The source package is reproducible locally but an archival DOI, clean-environment rerun and independent validation are still required for a final software publication record.</w:t>
       </w:r>
     </w:p>
     <w:p>
@@ -5106,7 +6465,7 @@
         <w:spacing w:line="269" w:lineRule="auto" w:after="40"/>
       </w:pPr>
       <w:r>
-        <w:t>Table 8. Plant Methods software availability and requirements.</w:t>
+        <w:t>Table 9. Plant Methods software availability and requirements.</w:t>
       </w:r>
     </w:p>
     <w:tbl>
@@ -6796,7 +8155,8 @@
         <w:sz w:val="16"/>
       </w:rPr>
       <w:t xml:space="preserve">Page </w:t>
-      <w:fldChar w:fldCharType="begin"/>
+      <w:fldChar w:fldCharType="begin" w:dirty="true"/>
+      <w:instrText xml:space="preserve"> PAGE </w:instrText>
       <w:fldChar w:fldCharType="separate"/>
       <w:t>1</w:t>
       <w:fldChar w:fldCharType="end"/>

</xml_diff>

<commit_message>
paper: rewrite discussion in published-methods style
</commit_message>
<xml_diff>
--- a/docs/PlantMR_submission_manuscript.docx
+++ b/docs/PlantMR_submission_manuscript.docx
@@ -6178,7 +6178,7 @@
         <w:spacing w:line="269" w:lineRule="auto" w:after="100"/>
       </w:pPr>
       <w:r>
-        <w:t>This study makes three separable contributions. First, PlantMR turns plant context into an explicit computational contract rather than an unstructured note. Species, assembly, tissue, stage, environmental score, ploidy, allele coding, LD source and overlap assumptions travel with the summary statistics. This matters because the same SNP-level beta and standard error can represent different estimands when the expression tissue, developmental stage or treatment changes. A method that ignores those fields may still return a numerical estimate, but it cannot establish that two estimates are comparable.</w:t>
+        <w:t>PlantMR addresses a recurring problem in plant summary-statistics MR: genotype, tissue, developmental stage, environment, LD and sample overlap are often stored separately. The workflow links these fields to the estimates and carries them into the report. This is important because the same SNP-level beta and standard error can describe different estimands when the exposure tissue, developmental stage or treatment changes. The contribution is therefore a reproducible data and analysis workflow, not a new claim about plant causality.</w:t>
       </w:r>
     </w:p>
     <w:p>
@@ -6186,7 +6186,7 @@
         <w:spacing w:line="269" w:lineRule="auto" w:after="100"/>
       </w:pPr>
       <w:r>
-        <w:t>Second, the environment-slope component provides a transparent estimand for a specific question: does the genetically proxied exposure–outcome effect change along a prespecified environmental scale? The slope is not a universal gene-by-environment causal parameter, and it is not a pleiotropy-correction intercept. Its value is that the design matrix, instrument grid and covariance assumptions are visible. The complete-grid rule is particularly important: if one environment has one set of instruments and another environment has a different set, a difference in ratio estimates can be produced by instrument composition rather than biological effect modification.</w:t>
+        <w:t>The environment-slope analysis answers a narrower question: does the genetically proxied exposure–outcome association change along a prespecified environmental scale? The slope is not a universal gene-by-environment causal parameter and is not a pleiotropy-correction intercept. Its use depends on a common SNP-by-environment instrument grid, an interpretable environmental contrast and a covariance model that matches the data structure.</w:t>
       </w:r>
     </w:p>
     <w:p>
@@ -6194,7 +6194,7 @@
         <w:spacing w:line="269" w:lineRule="auto" w:after="100"/>
       </w:pPr>
       <w:r>
-        <w:t>Third, the calibration results identify covariance specification as an inferential, not cosmetic, choice. Under the stated simulation truth, both correct and diagonal covariance models produced similar point estimates. The independence approximation nevertheless reduced standard errors and caused anti-conservative rejection in the LD stress null scenario (0.126 rather than 0.044), with coverage falling to 0.874. This pattern is precisely the type of failure that can be missed when a method is evaluated only by bias or point-estimate correlation. The results support a reporting rule: when SNP or environment dependence is known or plausible, the covariance source must be declared and a diagonal analysis should be presented as sensitivity, not as the default truth.</w:t>
+        <w:t>The simulations show why these details affect inference. Correct and diagonal covariance models gave similar point estimates in the tested settings, but the independence approximation reduced standard errors under LD stress. Null rejection increased from 0.044 to 0.126, and coverage fell from 0.956 to 0.874. The result supports reporting covariance provenance and treating a diagonal analysis as a sensitivity analysis when dependence is plausible.</w:t>
       </w:r>
     </w:p>
     <w:p>
@@ -6202,7 +6202,7 @@
         <w:pStyle w:val="Heading2"/>
       </w:pPr>
       <w:r>
-        <w:t>Relationship to previous MR and plant methods</w:t>
+        <w:t>Comparison with related methods</w:t>
       </w:r>
     </w:p>
     <w:p>
@@ -6210,7 +6210,7 @@
         <w:spacing w:line="269" w:lineRule="auto" w:after="100"/>
       </w:pPr>
       <w:r>
-        <w:t>PlantMR should be interpreted alongside, not as a replacement for, established MR methods. IVW, MR-Egger, robust or median estimators, pleiotropy diagnostics, colocalization and fine-mapping address different threats and answer different questions.[3–12,28] The current implementation includes a limited set of standard estimators to provide a common audit trail, but it does not claim that one estimator solves invalid instruments. In particular, the large Q statistic and non-zero Egger intercepts in the Arabidopsis case show that the dataset contains unresolved heterogeneity and possible pleiotropy.</w:t>
+        <w:t>PlantMR is intended to be used alongside established MR methods. IVW, MR-Egger, robust and median estimators, pleiotropy diagnostics, colocalization and fine-mapping address different sources of uncertainty.[3–12,28] The standard estimators included here provide a common audit trail; they do not make invalid instruments valid. The large Q statistic and non-zero Egger intercepts in the Arabidopsis case are therefore part of the result, not problems that can be removed by choosing another estimator.</w:t>
       </w:r>
     </w:p>
     <w:p>
@@ -6218,7 +6218,7 @@
         <w:spacing w:line="269" w:lineRule="auto" w:after="100"/>
       </w:pPr>
       <w:r>
-        <w:t>The distinction from MR-GxE is substantive. MR-GxE was developed to use gene-by-covariate interactions in the instrument–exposure association to detect or correct bias under assumptions about pleiotropy.[14] Interaction-based MR and MR-GENIUS use a different identification logic and have their own requirements for interaction strength and heterogeneity.[15] MR-EILLS targets an invariant causal effect across heterogeneous GWAS summaries and is not equivalent to fitting an environment score to two ratio estimates.[16] PlantMR instead supplies a plant-focused data contract and estimates effect heterogeneity along an observed environmental scale. It should not be marketed as a novel general interaction-MR theory or as an implementation of those methods.</w:t>
+        <w:t>The shared-input comparison also separates PlantMR from interaction-based MR. Summary-data MR-GxE uses gene-by-covariate interactions in the instrument–exposure associations and targets an invariant causal effect with a pleiotropy term.[14] MR-GENIUS uses a different identification strategy and requires its own conditions on interaction strength and heterogeneity.[15] MR-EILLS targets an invariant causal effect across heterogeneous GWAS summaries.[16] PlantMR instead estimates change along an observed environmental scale. The four quantities should not be treated as interchangeable.</w:t>
       </w:r>
     </w:p>
     <w:p>
@@ -6226,7 +6226,7 @@
         <w:spacing w:line="269" w:lineRule="auto" w:after="100"/>
       </w:pPr>
       <w:r>
-        <w:t>The distinction from plant-oriented software is deliberate. MRBIGR integrates population-scale multi-omics analysis in maize and is a relevant comparator for software breadth.[17] PlantMR is narrower in biological scope but more explicit about plant summary-statistics metadata, signed LD, environmental covariance, complete SNP-by-environment grids and rank-aware Q degrees of freedom. Recent Plant Methods software articles such as MAPtools combine a workflow figure, implementation details, command-level outputs, published-data tests and an explicit availability block.[36] PlantMR follows that reader path: the workflow comes before the statistical details, the tool contract is separated from biological claims, and the real case is presented as a reproducibility demonstration. The remaining difference is important: MAPtools includes direct testing across published mapping datasets, whereas PlantMR currently provides a literature-scope matrix and controlled calibration rather than a formal head-to-head comparison against external MR implementations. This is a submission limitation, not evidence that PlantMR outperforms those tools.</w:t>
+        <w:t>PlantMR occupies a narrower position than broad plant multi-omics toolboxes. MRBIGR integrates genotype, transcriptome, metabolome, GWAS and MR analyses in maize and demonstrates the workflow with maize and rice data.[17] metaGE addresses multi-environment GWAS meta-analysis and compares fixed-effect, random-effect and alternative meta-analysis procedures across plant datasets.[25] MAPtools emphasizes command-line workflow, published-data case studies and reproducible outputs.[36] PlantMR adopts the same practical sequence, from an explicit input workflow to controlled benchmarks and a plant case, while concentrating on covariance-aware summary-statistics MR.</w:t>
       </w:r>
     </w:p>
     <w:p>
@@ -6234,7 +6234,7 @@
         <w:pStyle w:val="Heading2"/>
       </w:pPr>
       <w:r>
-        <w:t>Why LD, environmental dependence and rank matter</w:t>
+        <w:t>Simulation and covariance behavior</w:t>
       </w:r>
     </w:p>
     <w:p>
@@ -6242,7 +6242,7 @@
         <w:spacing w:line="269" w:lineRule="auto" w:after="100"/>
       </w:pPr>
       <w:r>
-        <w:t>Plant panels often contain related accessions, local haplotypes and uneven LD. The covariance of ratio estimates therefore cannot be assumed to be diagonal merely because the input file has one row per SNP. The same issue occurs across environments when the same accessions are phenotyped repeatedly, when trials share controls or when environmental conditions are derived from related measurements. Treating these observations as independent typically affects the standard errors and heterogeneity statistic more directly than the point estimate.</w:t>
+        <w:t>Plant panels often contain related accessions, local haplotypes and uneven LD. The covariance of ratio estimates therefore cannot be assumed to be diagonal because the input has one row per SNP. Dependence can also arise across environments when accessions are phenotyped repeatedly, trials share controls or environmental measurements are related. In these settings, the covariance model affects standard errors and heterogeneity more directly than the point estimate.</w:t>
       </w:r>
     </w:p>
     <w:p>
@@ -6250,7 +6250,7 @@
         <w:spacing w:line="269" w:lineRule="auto" w:after="100"/>
       </w:pPr>
       <w:r>
-        <w:t>The rank-aware Q calculation is a practical safeguard for singular or nearly singular covariance matrices. With 48 retained SNPs and two environments, the case had 96 ratio observations but a covariance rank of 62. Using 94 or 95 degrees of freedom would overstate the independent information. PlantMR therefore reports rank(V)−rank(X), which was 60 in the primary case. This is not a guarantee that the covariance matrix is correctly specified; it is a guarantee that the reported degrees of freedom are at least aligned with the supplied matrix rank. A future implementation should add condition-number diagnostics, positive-semidefinite repair logs and sensitivity to alternative LD panels.</w:t>
+        <w:t>The rank-aware Q calculation provides a direct response to singular or nearly singular covariance matrices. The primary case contained 96 ratio observations, but the supplied covariance had rank 62. The reported residual degrees of freedom were therefore rank(V)−rank(X)=60 rather than 94 or 95. This calculation does not verify the biological correctness of the covariance matrix; it prevents the report from treating linearly dependent observations as independent.</w:t>
       </w:r>
     </w:p>
     <w:p>
@@ -6258,7 +6258,7 @@
         <w:spacing w:line="269" w:lineRule="auto" w:after="100"/>
       </w:pPr>
       <w:r>
-        <w:t>The stress benchmark also illustrates a useful distinction between calibration and power. Under a true slope of 0.25, both covariance choices had power 1.00, so a power-only comparison would have judged them equivalent. Under the null, the diagonal model failed calibration. For software papers, this argues for reporting null rejection, confidence coverage, bias, RMSE and standard-error behavior together, rather than reporting only the ability to detect a large simulated effect.</w:t>
+        <w:t>The stress benchmark also separates calibration from power. Both covariance choices had power 1.00 for the tested slope of 0.25, although the diagonal model failed the null calibration. A benchmark based on power alone would miss this difference. Null rejection, coverage, bias, RMSE and standard-error behavior should therefore be reported together for covariance-aware methods.</w:t>
       </w:r>
     </w:p>
     <w:p>
@@ -6266,7 +6266,7 @@
         <w:pStyle w:val="Heading2"/>
       </w:pPr>
       <w:r>
-        <w:t>Interpretation of the Arabidopsis case</w:t>
+        <w:t>Application to Arabidopsis data</w:t>
       </w:r>
     </w:p>
     <w:p>
@@ -6274,7 +6274,7 @@
         <w:spacing w:line="269" w:lineRule="auto" w:after="100"/>
       </w:pPr>
       <w:r>
-        <w:t>The Arabidopsis case is intentionally a stress test of the data contract. The raw local region contained a complete two-environment grid, three ambiguous palindromic variants were removed per environment, and 48 SNPs passed the final complete-grid instrument filters. The environment-stratified fixed IVW estimates were positive at both temperatures but differed in magnitude, while heterogeneity Q statistics were significant. The covariance-aware slope estimate was negative but imprecise and not statistically distinguishable from zero. The phenotype-correlation proxy changed the point estimate and standard error, but it is not a measured covariance of the exposure and outcome GWAS estimates.</w:t>
+        <w:t>The Arabidopsis analysis was used as a public-data case study of the workflow. The local region provided a complete two-environment grid; ambiguous palindromic variants were removed, and 48 SNPs passed the final instrument filters. The environment-stratified fixed IVW estimates were positive at both temperatures but differed in magnitude. The covariance-aware environment slope was −0.03705 (SE 0.15617, P=0.81249), whereas residual heterogeneity was high (Q=192.89, 60 rank-adjusted degrees of freedom, P=7.33×10−16).</w:t>
       </w:r>
     </w:p>
     <w:p>
@@ -6282,7 +6282,7 @@
         <w:spacing w:line="269" w:lineRule="auto" w:after="100"/>
       </w:pPr>
       <w:r>
-        <w:t>These findings do not support a claim that AT1G11560 is a validated causal regulator of flowering time. The expression and outcome accessions overlap, the exact exposure–outcome sampling covariance is unavailable, the local association model is ordinary least squares rather than a mixed model and the exposure was a baseline expression proxy copied across the two outcome environments rather than an environment-specific eQTL. The strong residual heterogeneity and Egger intercept diagnostics further limit a simple causal interpretation. The appropriate conclusion is that the software can expose these problems and produce reproducible sensitivity results; the biological conclusion remains provisional.</w:t>
+        <w:t>The case does not establish AT1G11560 as a causal regulator of flowering time. Expression and outcome accessions overlap, the exposure–outcome sampling covariance is unavailable, and the local association model uses ordinary least squares rather than the published mixed model. The baseline expression proxy was also carried across the two outcome environments instead of being estimated as an environment-specific eQTL. The appropriate interpretation is that PlantMR exposes these dependencies and produces reproducible sensitivity results; the biological conclusion remains provisional.</w:t>
       </w:r>
     </w:p>
     <w:p>
@@ -6290,7 +6290,7 @@
         <w:spacing w:line="269" w:lineRule="auto" w:after="100"/>
       </w:pPr>
       <w:r>
-        <w:t>This conservative interpretation is a strength for a methods paper. A less cautious manuscript could quote the highly significant environment-specific IVW P values and call AT1G11560 causal, but that would ignore LD, pleiotropy, sample overlap, population structure and the difference between a local re-analysis and independent validation. PlantMR is designed to make that overstatement harder by placing warnings and provenance in the report itself.</w:t>
+        <w:t>The phenotype-correlation sensitivity illustrates the same point. The FT10–FT16 correlation changed the fitted intercept and slope, but it is not a measured covariance of the exposure and outcome GWAS estimates. It is therefore useful as a sensitivity calculation, not as a formal correction for sample overlap. Reporting the proxy and its status prevents a convenient correlation from being mistaken for an identified covariance.</w:t>
       </w:r>
     </w:p>
     <w:p>
@@ -6298,7 +6298,7 @@
         <w:pStyle w:val="Heading2"/>
       </w:pPr>
       <w:r>
-        <w:t>Implications for plant and crop research</w:t>
+        <w:t>Use in plant and crop studies</w:t>
       </w:r>
     </w:p>
     <w:p>
@@ -6306,7 +6306,7 @@
         <w:spacing w:line="269" w:lineRule="auto" w:after="100"/>
       </w:pPr>
       <w:r>
-        <w:t>For natural-accession studies, the data contract should record the accession panel, geographic structure strategy, kinship or mixed-model method, reference assembly and the allele representation used to construct the LD matrix. For breeding panels and multi-environment trials, the environmental score should be defined before analysis and should represent a biologically interpretable contrast rather than a post hoc label. Temperature, drought severity, photoperiod and nutrient level may be continuous, but their measurement error and correlation across trials should be documented.</w:t>
+        <w:t>For natural-accession studies, the report should identify the accession panel, geographic structure strategy, kinship or mixed-model method, reference assembly and allele representation used to construct the LD matrix. For breeding panels and multi-environment trials, the environmental score should be defined before analysis and represent a biological contrast rather than a post hoc label. Measurement error and correlation among temperature, drought, photoperiod or nutrient variables should be documented.</w:t>
       </w:r>
     </w:p>
     <w:p>
@@ -6314,7 +6314,7 @@
         <w:spacing w:line="269" w:lineRule="auto" w:after="100"/>
       </w:pPr>
       <w:r>
-        <w:t>For expression-mediated analyses, an eQTL association must be tied to tissue, developmental stage, treatment and expression normalization. A baseline eQTL should not be silently used to represent a stress-specific molecular exposure. When the biological question is mediation, colocalization, fine-mapping or HEIDI-type evidence is needed in addition to MR.[11,12,28] When the question is gene-by-environment interaction, the exposure association itself may need environment-specific modeling; the present environment-slope model should not be presented as a substitute.</w:t>
+        <w:t>Expression-mediated analyses also require the exposure context to remain attached to the association. Tissue, developmental stage, treatment and normalization should be reported with each eQTL. A baseline eQTL should not be used silently as a stress-specific exposure. Mediation claims require colocalization, fine-mapping or HEIDI-type evidence in addition to MR.[11,12,28] Environment-specific biological questions may require environment-specific exposure models.</w:t>
       </w:r>
     </w:p>
     <w:p>
@@ -6322,7 +6322,7 @@
         <w:spacing w:line="269" w:lineRule="auto" w:after="100"/>
       </w:pPr>
       <w:r>
-        <w:t>For polyploid crops, dosage, homoeolog assignment and subgenome-specific LD are unresolved extensions rather than hidden defaults. Similarly, presence/absence variants and structural variants require explicit encoding and allele-frequency definitions. Keeping these features outside v1.1 is preferable to silently treating them as diploid SNPs. The boundary is documented so that users can distinguish a software limitation from a biological negative result.</w:t>
+        <w:t>Polyploid dosage, homoeolog assignment, subgenome-specific LD, presence–absence variants and structural variants require explicit data models. They are not silently recoded as diploid SNPs in the current implementation. This keeps a software limitation separate from a biological negative result and identifies the inputs that must be defined before those analyses can be interpreted.</w:t>
       </w:r>
     </w:p>
     <w:p>
@@ -6330,78 +6330,7 @@
         <w:pStyle w:val="Heading2"/>
       </w:pPr>
       <w:r>
-        <w:t>Limitations and threats to validity</w:t>
-      </w:r>
-    </w:p>
-    <w:p>
-      <w:pPr>
-        <w:pStyle w:val="ListNumber"/>
-        <w:spacing w:after="40"/>
-      </w:pPr>
-      <w:r>
-        <w:t>The real case is not independent causal validation. It uses public processed data, overlapping accessions and a local OLS model. It demonstrates execution and diagnostics only.</w:t>
-      </w:r>
-    </w:p>
-    <w:p>
-      <w:pPr>
-        <w:pStyle w:val="ListNumber"/>
-        <w:spacing w:after="40"/>
-      </w:pPr>
-      <w:r>
-        <w:t>The exact covariance of exposure and outcome summary statistics is not available. The environment-correlation sensitivity uses a phenotype correlation proxy and therefore cannot be treated as a formal sample-overlap correction.</w:t>
-      </w:r>
-    </w:p>
-    <w:p>
-      <w:pPr>
-        <w:pStyle w:val="ListNumber"/>
-        <w:spacing w:after="40"/>
-      </w:pPr>
-      <w:r>
-        <w:t>Only two outcome environments are used in the case. A two-point slope is a contrast along a prespecified scale; it cannot establish linearity, a threshold, or a general response curve.</w:t>
-      </w:r>
-    </w:p>
-    <w:p>
-      <w:pPr>
-        <w:pStyle w:val="ListNumber"/>
-        <w:spacing w:after="40"/>
-      </w:pPr>
-      <w:r>
-        <w:t>The directional-pleiotropy simulation uses one structured scenario. It does not cover balanced pleiotropy, correlated pleiotropy, weak instruments, nonlinear effects, measurement error in the environmental score, winner’s curse or population-stratified LD mismatch.</w:t>
-      </w:r>
-    </w:p>
-    <w:p>
-      <w:pPr>
-        <w:pStyle w:val="ListNumber"/>
-        <w:spacing w:after="40"/>
-      </w:pPr>
-      <w:r>
-        <w:t>The current implementation accepts supplied signed correlation matrices but does not estimate a causal LD panel, repair every possible non-positive-semidefinite input or model polyploid dosage and structural variation.</w:t>
-      </w:r>
-    </w:p>
-    <w:p>
-      <w:pPr>
-        <w:pStyle w:val="ListNumber"/>
-        <w:spacing w:after="40"/>
-      </w:pPr>
-      <w:r>
-        <w:t>A full individual-level implementation of MR-GxE, or a head-to-head implementation of MR-GENIUS and MR-EILLS, is not included in v1.1.0. The present external comparator is a narrow summary-data MR-GxE benchmark with method-specific targets.</w:t>
-      </w:r>
-    </w:p>
-    <w:p>
-      <w:pPr>
-        <w:pStyle w:val="ListNumber"/>
-        <w:spacing w:after="40"/>
-      </w:pPr>
-      <w:r>
-        <w:t>The source package is reproducible locally but an archival DOI, clean-environment rerun and independent validation are still required for a final software publication record.</w:t>
-      </w:r>
-    </w:p>
-    <w:p>
-      <w:pPr>
-        <w:pStyle w:val="Heading2"/>
-      </w:pPr>
-      <w:r>
-        <w:t>Recommended validation ladder and future work</w:t>
+        <w:t>Limitations</w:t>
       </w:r>
     </w:p>
     <w:p>
@@ -6409,7 +6338,7 @@
         <w:spacing w:line="269" w:lineRule="auto" w:after="100"/>
       </w:pPr>
       <w:r>
-        <w:t>A credible next-stage biological application should proceed in layers. First, rerun the same exposure and outcome in non-overlapping accessions and estimate the exposure–outcome covariance under the actual GWAS design. Second, reproduce association statistics with a kinship-aware mixed model and use the matching LD panel. Third, compare PlantMR with formal colocalization/HEIDI and with a prespecified set of external interaction-MR methods under identical instruments, environments and outcome scales. Fourth, validate the direction and magnitude in an independent population or environment. Fifth, test a small number of genes with functional perturbation or expression validation before making pathway-level claims.</w:t>
+        <w:t>The Arabidopsis case is not independent causal validation. It uses public processed data, overlapping accessions and a local OLS model. Only two outcome environments are available, so the slope is a contrast along a prespecified scale rather than evidence for linearity, a threshold or a general response curve.</w:t>
       </w:r>
     </w:p>
     <w:p>
@@ -6417,7 +6346,20 @@
         <w:spacing w:line="269" w:lineRule="auto" w:after="100"/>
       </w:pPr>
       <w:r>
-        <w:t>Software development should add condition-number and positive-semidefinite diagnostics, sample-overlap covariance interfaces, weak-instrument sensitivity, nonlinear environmental bases, multi-environment mixed-model importers, and explicit polyploid/SV schemas. Every extension should be accompanied by null calibration, misspecification stress tests and a negative-control scenario. The current v1.1.0 boundary is therefore a stable foundation for a broader platform, not a claim that the plant MR problem is solved.</w:t>
+        <w:t>The directional-pleiotropy simulation covers one structured scenario. It does not cover balanced or correlated pleiotropy, weak instruments, nonlinear effects, environmental measurement error, winner’s curse or population-stratified LD mismatch. The current software accepts supplied signed correlation matrices, but it does not estimate a causal LD panel, repair every non-positive-semidefinite input or model polyploid dosage and structural variation.</w:t>
+      </w:r>
+    </w:p>
+    <w:p>
+      <w:pPr>
+        <w:spacing w:line="269" w:lineRule="auto" w:after="100"/>
+      </w:pPr>
+      <w:r>
+        <w:t>The external comparison is deliberately limited to a summary-data MR-GxE implementation. A full individual-level MR-GxE analysis and independent implementations of MR-GENIUS or MR-EILLS are outside the current study. These methods should be compared only after their input contracts and target estimands have been aligned. Studies that extend PlantMR to independent populations, additional environments, mixed-model summary statistics and functional evidence will be needed before biological claims can be generalized beyond this demonstration.</w:t>
+      </w:r>
+    </w:p>
+    <w:p>
+      <w:r>
+        <w:br w:type="page"/>
       </w:r>
     </w:p>
     <w:p>
@@ -6433,7 +6375,7 @@
         <w:spacing w:line="269" w:lineRule="auto" w:after="100"/>
       </w:pPr>
       <w:r>
-        <w:t>PlantMR is a reproducible plant-focused implementation for auditable summary-statistics MR and a narrowly defined environment-effect-heterogeneity analysis. Its strongest evidence is software-level: explicit provenance, complete-grid selection, covariance-aware GLS, rank-aware heterogeneity reporting, calibrated simulations and a real-data contract that preserves limitations. The evidence does not support calling AT1G11560 a causal gene or calling PlantMR the first plant environment-interaction MR method. A Plant Methods software submission is defensible after adding an archival DOI, clean-environment verification and completed author declarations; a biological discovery claim would require a substantially stronger validation program.</w:t>
+        <w:t>PlantMR provides a reproducible workflow for plant summary-statistics MR and a defined environment-effect-heterogeneity analysis. Evidence includes explicit metadata, complete-grid instrument selection, covariance-aware GLS, rank-aware heterogeneity reporting, calibrated simulations, a shared-input MR-GxE comparison and a public Arabidopsis case. These results support using PlantMR to make assumptions visible; they do not establish AT1G11560 as a causal gene or replace colocalization, mixed-model GWAS, interaction-MR methods or functional validation.</w:t>
       </w:r>
     </w:p>
     <w:p>

</xml_diff>

<commit_message>
paper: redesign figures around plant MR evidence
</commit_message>
<xml_diff>
--- a/docs/PlantMR_submission_manuscript.docx
+++ b/docs/PlantMR_submission_manuscript.docx
@@ -215,7 +215,7 @@
       <w:r>
         <w:drawing>
           <wp:inline xmlns:a="http://schemas.openxmlformats.org/drawingml/2006/main" xmlns:pic="http://schemas.openxmlformats.org/drawingml/2006/picture">
-            <wp:extent cx="5989320" cy="1881246"/>
+            <wp:extent cx="5989320" cy="2935840"/>
             <wp:docPr id="1" name="Picture 1"/>
             <wp:cNvGraphicFramePr>
               <a:graphicFrameLocks noChangeAspect="1"/>
@@ -236,7 +236,7 @@
                   <pic:spPr>
                     <a:xfrm>
                       <a:off x="0" y="0"/>
-                      <a:ext cx="5989320" cy="1881246"/>
+                      <a:ext cx="5989320" cy="2935840"/>
                     </a:xfrm>
                     <a:prstGeom prst="rect"/>
                   </pic:spPr>
@@ -256,7 +256,7 @@
           <w:i/>
           <w:sz w:val="18"/>
         </w:rPr>
-        <w:t>Figure 1. PlantMR reproducible workflow. Plant metadata and summary statistics are retained alongside allele harmonization, complete-grid quality control, covariance specification and machine-readable audit outputs.</w:t>
+        <w:t>Figure 1. PlantMR workflow schematic. Plant context and repeated environments lead to a common SNP-by-environment grid, covariance-aware estimation and separate statistical and reproducibility outputs.</w:t>
       </w:r>
     </w:p>
     <w:p>
@@ -2494,7 +2494,7 @@
       <w:r>
         <w:drawing>
           <wp:inline xmlns:a="http://schemas.openxmlformats.org/drawingml/2006/main" xmlns:pic="http://schemas.openxmlformats.org/drawingml/2006/picture">
-            <wp:extent cx="5806440" cy="2619979"/>
+            <wp:extent cx="5806440" cy="4362219"/>
             <wp:docPr id="2" name="Picture 2"/>
             <wp:cNvGraphicFramePr>
               <a:graphicFrameLocks noChangeAspect="1"/>
@@ -2515,7 +2515,7 @@
                   <pic:spPr>
                     <a:xfrm>
                       <a:off x="0" y="0"/>
-                      <a:ext cx="5806440" cy="2619979"/>
+                      <a:ext cx="5806440" cy="4362219"/>
                     </a:xfrm>
                     <a:prstGeom prst="rect"/>
                   </pic:spPr>
@@ -2535,14 +2535,14 @@
           <w:i/>
           <w:sz w:val="18"/>
         </w:rPr>
-        <w:t>Figure 2. Primary simulation benchmark. The panels summarize slope estimation, rejection behavior and 95% confidence-interval coverage across null, causal environment-slope and directional-pleiotropy scenarios.</w:t>
+        <w:t>Figure 2. Simulation calibration. (a) Mean slope estimates with 95% confidence intervals for the simulation mean; dashed segments mark the generating value. (b) Rejection proportion and (c) 95% coverage across scenarios. (d) Directional pleiotropy shifts the intercept while the environment slope remains near its target.</w:t>
       </w:r>
     </w:p>
     <w:p>
       <w:r>
         <w:drawing>
           <wp:inline xmlns:a="http://schemas.openxmlformats.org/drawingml/2006/main" xmlns:pic="http://schemas.openxmlformats.org/drawingml/2006/picture">
-            <wp:extent cx="5715000" cy="4343400"/>
+            <wp:extent cx="5715000" cy="4597936"/>
             <wp:docPr id="3" name="Picture 3"/>
             <wp:cNvGraphicFramePr>
               <a:graphicFrameLocks noChangeAspect="1"/>
@@ -2563,7 +2563,7 @@
                   <pic:spPr>
                     <a:xfrm>
                       <a:off x="0" y="0"/>
-                      <a:ext cx="5715000" cy="4343400"/>
+                      <a:ext cx="5715000" cy="4597936"/>
                     </a:xfrm>
                     <a:prstGeom prst="rect"/>
                   </pic:spPr>
@@ -2583,7 +2583,7 @@
           <w:i/>
           <w:sz w:val="18"/>
         </w:rPr>
-        <w:t>Figure 3. LD stress benchmark. Treating correlated SNP and environment errors as independent preserved approximate point estimates but produced smaller standard errors, inflated null rejection from 0.044 to 0.126 and reduced coverage from 0.956 to 0.874.</w:t>
+        <w:t>Figure 3. LD stress benchmark. (a) Empirical null P-value calibration, (b) slope sampling distributions, (c) coverage and (d) relative standard-error distortion under the supplied LD and environment dependence. The independence approximation inflated null rejection from 0.044 to 0.126 and reduced coverage from 0.956 to 0.874.</w:t>
       </w:r>
     </w:p>
     <w:p>
@@ -3901,7 +3901,7 @@
       <w:r>
         <w:drawing>
           <wp:inline xmlns:a="http://schemas.openxmlformats.org/drawingml/2006/main" xmlns:pic="http://schemas.openxmlformats.org/drawingml/2006/picture">
-            <wp:extent cx="5989320" cy="2504625"/>
+            <wp:extent cx="5989320" cy="3064124"/>
             <wp:docPr id="4" name="Picture 4"/>
             <wp:cNvGraphicFramePr>
               <a:graphicFrameLocks noChangeAspect="1"/>
@@ -3922,7 +3922,7 @@
                   <pic:spPr>
                     <a:xfrm>
                       <a:off x="0" y="0"/>
-                      <a:ext cx="5989320" cy="2504625"/>
+                      <a:ext cx="5989320" cy="3064124"/>
                     </a:xfrm>
                     <a:prstGeom prst="rect"/>
                   </pic:spPr>
@@ -3942,7 +3942,7 @@
           <w:i/>
           <w:sz w:val="18"/>
         </w:rPr>
-        <w:t>Figure 5. Shared-input comparison. Panel A scores only method/scenario pairs with a defined target. Panel B retains out-of-target estimates as diagnostics and explicitly excludes them from bias and coverage scoring.</w:t>
+        <w:t>Figure 5. Shared-input comparison. (a) Target-defined estimates with the generating value marked by a diamond. (b) Coverage is shown only for method/scenario pairs with a defined estimand; gray cells are not scored because the target differs.</w:t>
       </w:r>
     </w:p>
     <w:p>
@@ -5746,7 +5746,7 @@
       <w:r>
         <w:drawing>
           <wp:inline xmlns:a="http://schemas.openxmlformats.org/drawingml/2006/main" xmlns:pic="http://schemas.openxmlformats.org/drawingml/2006/picture">
-            <wp:extent cx="5989320" cy="1996440"/>
+            <wp:extent cx="5989320" cy="4261765"/>
             <wp:docPr id="5" name="Picture 5"/>
             <wp:cNvGraphicFramePr>
               <a:graphicFrameLocks noChangeAspect="1"/>
@@ -5767,7 +5767,7 @@
                   <pic:spPr>
                     <a:xfrm>
                       <a:off x="0" y="0"/>
-                      <a:ext cx="5989320" cy="1996440"/>
+                      <a:ext cx="5989320" cy="4261765"/>
                     </a:xfrm>
                     <a:prstGeom prst="rect"/>
                   </pic:spPr>
@@ -5787,7 +5787,7 @@
           <w:i/>
           <w:sz w:val="18"/>
         </w:rPr>
-        <w:t>Figure 4. Arabidopsis data-contract case. (A) Environment-stratified comparator estimates; (B) primary and phenotype-correlation-proxy environment slopes; (C) the raw-to-final instrument audit. Error bars are 95% confidence intervals where applicable.</w:t>
+        <w:t>Figure 4. Arabidopsis plant-MR case. (a) Aligned regional exposure and outcome association tracks for the AT1G11560 case. (b) LD among the 48 retained instruments. (c) Environment-stratified MR estimates and (d) the primary and phenotype-correlation-proxy environment slopes. Error bars are 95% confidence intervals.</w:t>
       </w:r>
     </w:p>
     <w:p>
@@ -6226,7 +6226,7 @@
         <w:spacing w:line="269" w:lineRule="auto" w:after="100"/>
       </w:pPr>
       <w:r>
-        <w:t>PlantMR occupies a narrower position than broad plant multi-omics toolboxes. MRBIGR integrates genotype, transcriptome, metabolome, GWAS and MR analyses in maize and demonstrates the workflow with maize and rice data.[17] metaGE addresses multi-environment GWAS meta-analysis and compares fixed-effect, random-effect and alternative meta-analysis procedures across plant datasets.[25] MAPtools emphasizes command-line workflow, published-data case studies and reproducible outputs.[36] PlantMR adopts the same practical sequence, from an explicit input workflow to controlled benchmarks and a plant case, while concentrating on covariance-aware summary-statistics MR.</w:t>
+        <w:t>PlantMR also differs from biological plant MR applications in its evidentiary aim. Liu et al. combined drought-responsive maize expression, eQTLs, MR prioritization and experimental follow-up to nominate regulators of drought tolerance.[18] Feng et al. used regional Arabidopsis GWAS and eQTL summary statistics, SMR/HEIDI and independent expression data to prioritize AT1G11560.[19] In Populus, Liang et al. connected variants in a miRNA and its target gene to wood traits through association, epistasis, expression and MR analyses.[37] These studies provide the closer plant-MR precedent for the present figure sequence: environmental or tissue context, regional genetic evidence, molecular association, MR estimate and biological boundary. MRBIGR integrates genotype, transcriptome, metabolome, GWAS and MR analyses in maize and demonstrates the workflow with maize and rice data.[17] metaGE addresses multi-environment GWAS meta-analysis and compares fixed-effect, random-effect and alternative meta-analysis procedures across plant datasets.[25] MAPtools emphasizes command-line workflow, published-data case studies and reproducible outputs.[36] PlantMR adopts the evidence order of the plant studies while concentrating on covariance-aware summary-statistics MR rather than claiming a new biological discovery.</w:t>
       </w:r>
     </w:p>
     <w:p>
@@ -8073,6 +8073,18 @@
         <w:t>36. Candela, H. et al. MAPtools: command-line tools for mapping-by-sequencing and QTL-Seq analysis and visualization. Plant Methods 20, 107 (2024). https://doi.org/10.1186/s13007-024-01222-2</w:t>
       </w:r>
     </w:p>
+    <w:p>
+      <w:pPr>
+        <w:spacing w:after="60"/>
+        <w:ind w:left="255" w:hanging="255"/>
+      </w:pPr>
+      <w:r>
+        <w:rPr>
+          <w:sz w:val="17"/>
+        </w:rPr>
+        <w:t>37. Liang, X. et al. Association study and Mendelian randomization analysis reveal effects of the genetic interaction between PtoMIR403b and PtoGT31B-1 on wood formation in Populus tomentosa. Front. Plant Sci. 12, 704941 (2021). https://doi.org/10.3389/fpls.2021.704941</w:t>
+      </w:r>
+    </w:p>
     <w:sectPr>
       <w:headerReference w:type="default" r:id="rId9"/>
       <w:footerReference w:type="default" r:id="rId10"/>

</xml_diff>